<commit_message>
added acts docx, UI changes
</commit_message>
<xml_diff>
--- a/app/templates/docx/contract_foms_template.docx
+++ b/app/templates/docx/contract_foms_template.docx
@@ -1,11 +1,11 @@
 
 <file path=word/document.xml><?xml version="1.0" encoding="utf-8"?>
-<w:document xmlns:ve="http://schemas.openxmlformats.org/markup-compatibility/2006" xmlns:o="urn:schemas-microsoft-com:office:office" xmlns:r="http://schemas.openxmlformats.org/officeDocument/2006/relationships" xmlns:m="http://schemas.openxmlformats.org/officeDocument/2006/math" xmlns:v="urn:schemas-microsoft-com:vml" xmlns:wp="http://schemas.openxmlformats.org/drawingml/2006/wordprocessingDrawing" xmlns:w10="urn:schemas-microsoft-com:office:word" xmlns:w="http://schemas.openxmlformats.org/wordprocessingml/2006/main" xmlns:wne="http://schemas.microsoft.com/office/word/2006/wordml">
+<w:document xmlns:wpc="http://schemas.microsoft.com/office/word/2010/wordprocessingCanvas" xmlns:mc="http://schemas.openxmlformats.org/markup-compatibility/2006" xmlns:o="urn:schemas-microsoft-com:office:office" xmlns:r="http://schemas.openxmlformats.org/officeDocument/2006/relationships" xmlns:m="http://schemas.openxmlformats.org/officeDocument/2006/math" xmlns:v="urn:schemas-microsoft-com:vml" xmlns:wp14="http://schemas.microsoft.com/office/word/2010/wordprocessingDrawing" xmlns:wp="http://schemas.openxmlformats.org/drawingml/2006/wordprocessingDrawing" xmlns:w10="urn:schemas-microsoft-com:office:word" xmlns:w="http://schemas.openxmlformats.org/wordprocessingml/2006/main" xmlns:w14="http://schemas.microsoft.com/office/word/2010/wordml" xmlns:wpg="http://schemas.microsoft.com/office/word/2010/wordprocessingGroup" xmlns:wpi="http://schemas.microsoft.com/office/word/2010/wordprocessingInk" xmlns:wne="http://schemas.microsoft.com/office/word/2006/wordml" xmlns:wps="http://schemas.microsoft.com/office/word/2010/wordprocessingShape" mc:Ignorable="w14 wp14">
   <w:body>
     <w:p>
       <w:pPr>
         <w:spacing w:line="16" w:lineRule="atLeast"/>
-        <w:ind w:left="4111"/>
+        <w:jc w:val="center"/>
         <w:rPr>
           <w:b/>
         </w:rPr>
@@ -15,24 +15,6 @@
           <w:b/>
         </w:rPr>
         <w:t>Договор</w:t>
-      </w:r>
-      <w:r>
-        <w:rPr>
-          <w:b/>
-        </w:rPr>
-        <w:tab/>
-      </w:r>
-      <w:r>
-        <w:rPr>
-          <w:b/>
-        </w:rPr>
-        <w:tab/>
-      </w:r>
-      <w:r>
-        <w:rPr>
-          <w:b/>
-        </w:rPr>
-        <w:tab/>
       </w:r>
     </w:p>
     <w:p>
@@ -77,7 +59,56 @@
         </w:rPr>
       </w:pPr>
       <w:r>
-        <w:t>госпитализированному по системе № {{ contract_number }}</w:t>
+        <w:rPr>
+          <w:b/>
+        </w:rPr>
+        <w:t>госпи</w:t>
+      </w:r>
+      <w:r>
+        <w:rPr>
+          <w:b/>
+        </w:rPr>
+        <w:t xml:space="preserve">тализированному по системе </w:t>
+      </w:r>
+      <w:r>
+        <w:rPr>
+          <w:b/>
+        </w:rPr>
+        <w:t xml:space="preserve">ОМС </w:t>
+      </w:r>
+      <w:r>
+        <w:rPr>
+          <w:b/>
+        </w:rPr>
+        <w:t>№</w:t>
+      </w:r>
+      <w:sdt>
+        <w:sdtPr>
+          <w:rPr>
+            <w:b/>
+          </w:rPr>
+          <w:alias w:val="_номер_договора"/>
+          <w:tag w:val="_номер_договора"/>
+          <w:id w:val="-1084759860"/>
+          <w:placeholder>
+            <w:docPart w:val="DefaultPlaceholder_1082065158"/>
+          </w:placeholder>
+        </w:sdtPr>
+        <w:sdtEndPr/>
+        <w:sdtContent>
+          <w:r>
+            <w:rPr>
+              <w:b/>
+            </w:rPr>
+            <w:t xml:space="preserve">{{ contract_number }}</w:t>
+          </w:r>
+        </w:sdtContent>
+      </w:sdt>
+      <w:r>
+        <w:rPr>
+          <w:b/>
+        </w:rPr>
+        <w:t xml:space="preserve"> </w:t>
       </w:r>
     </w:p>
     <w:p>
@@ -94,20 +125,166 @@
     </w:p>
     <w:p>
       <w:pPr>
-        <w:pBdr>
-          <w:bottom w:val="single" w:sz="4" w:space="1" w:color="auto"/>
-        </w:pBdr>
         <w:tabs>
           <w:tab w:val="left" w:pos="4405"/>
         </w:tabs>
         <w:spacing w:line="16" w:lineRule="atLeast"/>
-        <w:jc w:val="both"/>
-        <w:rPr>
-          <w:b/>
-        </w:rPr>
-      </w:pPr>
-      <w:r>
-        <w:t>г. Махачкала           «{{ contract_day }}» {{ contract_month }} {{ contract_year }}  год</w:t>
+        <w:jc w:val="center"/>
+        <w:rPr>
+          <w:b/>
+        </w:rPr>
+      </w:pPr>
+      <w:r>
+        <w:t>г. Махачкала</w:t>
+      </w:r>
+      <w:r>
+        <w:tab/>
+      </w:r>
+      <w:r>
+        <w:tab/>
+      </w:r>
+      <w:r>
+        <w:tab/>
+      </w:r>
+      <w:r>
+        <w:tab/>
+      </w:r>
+      <w:r>
+        <w:rPr>
+          <w:rFonts w:ascii="Verdana" w:hAnsi="Verdana"/>
+          <w:sz w:val="18"/>
+          <w:szCs w:val="18"/>
+        </w:rPr>
+        <w:t>"</w:t>
+      </w:r>
+      <w:sdt>
+        <w:sdtPr>
+          <w:rPr>
+            <w:rFonts w:ascii="Verdana" w:hAnsi="Verdana"/>
+            <w:sz w:val="18"/>
+            <w:szCs w:val="18"/>
+          </w:rPr>
+          <w:alias w:val="ЧИСЛО"/>
+          <w:tag w:val="ЧИСЛО"/>
+          <w:id w:val="-471216053"/>
+          <w:placeholder>
+            <w:docPart w:val="DB56ACF0EC81407E8A464E13CCEA3791"/>
+          </w:placeholder>
+        </w:sdtPr>
+        <w:sdtEndPr>
+          <w:rPr>
+            <w:u w:val="single"/>
+          </w:rPr>
+        </w:sdtEndPr>
+        <w:sdtContent>
+          <w:r>
+            <w:rPr>
+              <w:rFonts w:ascii="Verdana" w:hAnsi="Verdana"/>
+              <w:sz w:val="18"/>
+              <w:szCs w:val="18"/>
+              <w:u w:val="single"/>
+            </w:rPr>
+            <w:t xml:space="preserve">{{ contract_day }}</w:t>
+          </w:r>
+        </w:sdtContent>
+      </w:sdt>
+      <w:r>
+        <w:rPr>
+          <w:rFonts w:ascii="Verdana" w:hAnsi="Verdana"/>
+          <w:sz w:val="18"/>
+          <w:szCs w:val="18"/>
+        </w:rPr>
+        <w:t>"</w:t>
+      </w:r>
+      <w:r>
+        <w:rPr>
+          <w:rFonts w:ascii="Verdana" w:hAnsi="Verdana"/>
+          <w:sz w:val="18"/>
+          <w:szCs w:val="18"/>
+        </w:rPr>
+        <w:t xml:space="preserve"> </w:t>
+      </w:r>
+      <w:sdt>
+        <w:sdtPr>
+          <w:rPr>
+            <w:rFonts w:ascii="Verdana" w:hAnsi="Verdana"/>
+            <w:sz w:val="18"/>
+            <w:szCs w:val="18"/>
+          </w:rPr>
+          <w:alias w:val="МЕСЯЦ"/>
+          <w:tag w:val="МЕСЯЦ"/>
+          <w:id w:val="7806381"/>
+          <w:placeholder>
+            <w:docPart w:val="DB56ACF0EC81407E8A464E13CCEA3791"/>
+          </w:placeholder>
+        </w:sdtPr>
+        <w:sdtEndPr/>
+        <w:sdtContent>
+          <w:r>
+            <w:rPr>
+              <w:rFonts w:ascii="Verdana" w:hAnsi="Verdana"/>
+              <w:sz w:val="18"/>
+              <w:szCs w:val="18"/>
+              <w:u w:val="single"/>
+            </w:rPr>
+            <w:t xml:space="preserve">{{ contract_month }}</w:t>
+          </w:r>
+        </w:sdtContent>
+      </w:sdt>
+      <w:r>
+        <w:rPr>
+          <w:rFonts w:ascii="Verdana" w:hAnsi="Verdana"/>
+          <w:sz w:val="18"/>
+          <w:szCs w:val="18"/>
+        </w:rPr>
+        <w:t xml:space="preserve"> </w:t>
+      </w:r>
+      <w:sdt>
+        <w:sdtPr>
+          <w:rPr>
+            <w:rFonts w:ascii="Verdana" w:hAnsi="Verdana"/>
+            <w:sz w:val="18"/>
+            <w:szCs w:val="18"/>
+          </w:rPr>
+          <w:alias w:val="ГОД"/>
+          <w:tag w:val="ГОД"/>
+          <w:id w:val="361253597"/>
+          <w:placeholder>
+            <w:docPart w:val="DB56ACF0EC81407E8A464E13CCEA3791"/>
+          </w:placeholder>
+        </w:sdtPr>
+        <w:sdtEndPr/>
+        <w:sdtContent>
+          <w:proofErr w:type="spellStart"/>
+          <w:r>
+            <w:rPr>
+              <w:rFonts w:ascii="Verdana" w:hAnsi="Verdana"/>
+              <w:sz w:val="18"/>
+              <w:szCs w:val="18"/>
+              <w:u w:val="single"/>
+            </w:rPr>
+            <w:t xml:space="preserve">{{ contract_year }}</w:t>
+          </w:r>
+        </w:sdtContent>
+      </w:sdt>
+      <w:proofErr w:type="gramStart"/>
+      <w:r>
+        <w:rPr>
+          <w:rFonts w:ascii="Verdana" w:hAnsi="Verdana"/>
+          <w:sz w:val="18"/>
+          <w:szCs w:val="18"/>
+        </w:rPr>
+        <w:t>г</w:t>
+      </w:r>
+      <w:proofErr w:type="spellEnd"/>
+      <w:proofErr w:type="gramEnd"/>
+      <w:r>
+        <w:rPr>
+          <w:rFonts w:ascii="Verdana" w:hAnsi="Verdana"/>
+          <w:sz w:val="18"/>
+          <w:szCs w:val="18"/>
+        </w:rPr>
+        <w:t>.</w:t>
       </w:r>
     </w:p>
     <w:p>
@@ -117,15 +294,6 @@
         </w:tabs>
         <w:spacing w:line="16" w:lineRule="atLeast"/>
         <w:jc w:val="both"/>
-      </w:pPr>
-    </w:p>
-    <w:p>
-      <w:pPr>
-        <w:tabs>
-          <w:tab w:val="left" w:pos="4405"/>
-        </w:tabs>
-        <w:spacing w:line="16" w:lineRule="atLeast"/>
-        <w:jc w:val="both"/>
         <w:rPr>
           <w:b/>
         </w:rPr>
@@ -138,8 +306,381 @@
       </w:pPr>
       <w:r>
         <w:tab/>
-        <w:t>ООО «Родильный дом №4», осуществляющее свою деятельность  в соответствии с лицензией № ЛО-05-01-000666 от 12 июля 2013г., выданной Министерством здравоохранения Республики Дагестан (Основной государственный регистрационный номер 1070562002950 от 15.10.2007, присвоенный ИФНС по Ленинскому району г. Махачкалы, Индивидуальный номер налогоплательщика 0562068977), в лице Главного врача Арбуханова Магомеда Абдулаевича, действующего на основании Устава,  именуемое в дальнейшем «Исполнитель»,с одной стороны,и гражданка {{ patient_name }}, дата рождения (месяц/число/год)  {{ contract_month }}/{{ contract_day }}/{{ contract_year }}, проживающая по адресу {{ patient_reg_address }}, номер страхового медицинского {{ insurance_number }} именуемая в дальнейшем «Потребитель», с другой стороны, совместно именуемые «Стороны», заключили настоящий договор о нижеследующем:</w:t>
-      </w:r>
+      </w:r>
+      <w:proofErr w:type="gramStart"/>
+      <w:r>
+        <w:t xml:space="preserve">ООО </w:t>
+      </w:r>
+      <w:r>
+        <w:t>«Родильный дом №</w:t>
+      </w:r>
+      <w:r>
+        <w:t>4»</w:t>
+      </w:r>
+      <w:r>
+        <w:t>, о</w:t>
+      </w:r>
+      <w:r>
+        <w:t>существляющ</w:t>
+      </w:r>
+      <w:r>
+        <w:t>ее</w:t>
+      </w:r>
+      <w:r>
+        <w:t xml:space="preserve"> свою деятельность </w:t>
+      </w:r>
+      <w:r>
+        <w:t xml:space="preserve"> в соотве</w:t>
+      </w:r>
+      <w:r>
+        <w:t xml:space="preserve">тствии с лицензией </w:t>
+      </w:r>
+      <w:r>
+        <w:t xml:space="preserve"> </w:t>
+      </w:r>
+      <w:r>
+        <w:t xml:space="preserve">№ </w:t>
+      </w:r>
+      <w:r>
+        <w:t>ЛО-05-01-000666</w:t>
+      </w:r>
+      <w:r>
+        <w:t xml:space="preserve"> от </w:t>
+      </w:r>
+      <w:r>
+        <w:t>12 июля 2013г.</w:t>
+      </w:r>
+      <w:r>
+        <w:t xml:space="preserve">, выданной </w:t>
+      </w:r>
+      <w:r>
+        <w:t>Министерством здравоохранения Республики Дагестан</w:t>
+      </w:r>
+      <w:r>
+        <w:t xml:space="preserve"> (</w:t>
+      </w:r>
+      <w:r>
+        <w:t>Основной государственный регистрационный номер</w:t>
+      </w:r>
+      <w:r>
+        <w:t xml:space="preserve"> 1070562002950 от 15.10.2007, присвоенный ИФНС по Ленинскому району г. Махачкалы, </w:t>
+      </w:r>
+      <w:r>
+        <w:t>Индивидуальный номер налогоплательщика</w:t>
+      </w:r>
+      <w:r>
+        <w:t xml:space="preserve"> 0562068977</w:t>
+      </w:r>
+      <w:r>
+        <w:t>)</w:t>
+      </w:r>
+      <w:r>
+        <w:t>,</w:t>
+      </w:r>
+      <w:r>
+        <w:t xml:space="preserve"> в лице Главного врача </w:t>
+      </w:r>
+      <w:proofErr w:type="spellStart"/>
+      <w:r>
+        <w:t>Арбуханова</w:t>
+      </w:r>
+      <w:proofErr w:type="spellEnd"/>
+      <w:r>
+        <w:t xml:space="preserve"> Магомеда </w:t>
+      </w:r>
+      <w:proofErr w:type="spellStart"/>
+      <w:r>
+        <w:t>Абдулаевича</w:t>
+      </w:r>
+      <w:proofErr w:type="spellEnd"/>
+      <w:r>
+        <w:t xml:space="preserve">, действующего на основании Устава, </w:t>
+      </w:r>
+      <w:r>
+        <w:t xml:space="preserve"> именуемое в дальнейшем «Исполнитель»,</w:t>
+      </w:r>
+      <w:r>
+        <w:t xml:space="preserve"> </w:t>
+      </w:r>
+      <w:r>
+        <w:t>с одной стороны,</w:t>
+      </w:r>
+      <w:r>
+        <w:t xml:space="preserve"> </w:t>
+      </w:r>
+      <w:r>
+        <w:t xml:space="preserve">и </w:t>
+      </w:r>
+      <w:r>
+        <w:t>г</w:t>
+      </w:r>
+      <w:r>
+        <w:t>раждан</w:t>
+      </w:r>
+      <w:r>
+        <w:t>ка</w:t>
+      </w:r>
+      <w:r>
+        <w:t xml:space="preserve"> </w:t>
+      </w:r>
+      <w:r>
+        <w:t xml:space="preserve"> </w:t>
+      </w:r>
+      <w:sdt>
+        <w:sdtPr>
+          <w:alias w:val="_фио_потребителя"/>
+          <w:tag w:val="_фио_потребителя"/>
+          <w:id w:val="-2050296408"/>
+          <w:placeholder>
+            <w:docPart w:val="DefaultPlaceholder_1082065158"/>
+          </w:placeholder>
+        </w:sdtPr>
+        <w:sdtEndPr/>
+        <w:sdtContent>
+          <w:r>
+            <w:t xml:space="preserve">{{ patient_name }}</w:t>
+          </w:r>
+          <w:proofErr w:type="gramEnd"/>
+        </w:sdtContent>
+      </w:sdt>
+      <w:r>
+        <w:t>,</w:t>
+      </w:r>
+      <w:r>
+        <w:t xml:space="preserve"> </w:t>
+      </w:r>
+      <w:proofErr w:type="gramStart"/>
+      <w:r>
+        <w:t xml:space="preserve">дата </w:t>
+      </w:r>
+      <w:r>
+        <w:t>рождения (</w:t>
+      </w:r>
+      <w:r>
+        <w:t>число</w:t>
+      </w:r>
+      <w:r>
+        <w:t>/</w:t>
+      </w:r>
+      <w:r>
+        <w:t>месяц/год)</w:t>
+      </w:r>
+      <w:r>
+        <w:t xml:space="preserve"> </w:t>
+      </w:r>
+      <w:r>
+        <w:rPr>
+          <w:rFonts w:ascii="Verdana" w:hAnsi="Verdana"/>
+          <w:sz w:val="16"/>
+          <w:szCs w:val="16"/>
+        </w:rPr>
+        <w:t>«</w:t>
+      </w:r>
+      <w:proofErr w:type="spellStart"/>
+      <w:sdt>
+        <w:sdtPr>
+          <w:rPr>
+            <w:rFonts w:ascii="Verdana" w:hAnsi="Verdana"/>
+            <w:sz w:val="16"/>
+            <w:szCs w:val="16"/>
+          </w:rPr>
+          <w:alias w:val="дд"/>
+          <w:tag w:val="дд"/>
+          <w:id w:val="-915553491"/>
+          <w:placeholder>
+            <w:docPart w:val="6FA6628EDDC240529E5D105D481887A2"/>
+          </w:placeholder>
+        </w:sdtPr>
+        <w:sdtEndPr/>
+        <w:sdtContent>
+          <w:r>
+            <w:rPr>
+              <w:rFonts w:ascii="Verdana" w:hAnsi="Verdana"/>
+              <w:sz w:val="16"/>
+              <w:szCs w:val="16"/>
+              <w:u w:val="single"/>
+            </w:rPr>
+            <w:t xml:space="preserve">{{ patient_birth_day }}</w:t>
+          </w:r>
+        </w:sdtContent>
+      </w:sdt>
+      <w:r>
+        <w:rPr>
+          <w:rFonts w:ascii="Verdana" w:hAnsi="Verdana"/>
+          <w:sz w:val="16"/>
+          <w:szCs w:val="16"/>
+        </w:rPr>
+        <w:t>»</w:t>
+      </w:r>
+      <w:sdt>
+        <w:sdtPr>
+          <w:rPr>
+            <w:rFonts w:ascii="Verdana" w:hAnsi="Verdana"/>
+            <w:sz w:val="16"/>
+            <w:szCs w:val="16"/>
+            <w:u w:val="single"/>
+          </w:rPr>
+          <w:alias w:val="мм"/>
+          <w:tag w:val="мм"/>
+          <w:id w:val="1888603648"/>
+          <w:placeholder>
+            <w:docPart w:val="6FA6628EDDC240529E5D105D481887A2"/>
+          </w:placeholder>
+        </w:sdtPr>
+        <w:sdtEndPr>
+          <w:rPr>
+            <w:u w:val="none"/>
+          </w:rPr>
+        </w:sdtEndPr>
+        <w:sdtContent>
+          <w:r>
+            <w:rPr>
+              <w:rFonts w:ascii="Verdana" w:hAnsi="Verdana"/>
+              <w:sz w:val="16"/>
+              <w:szCs w:val="16"/>
+              <w:u w:val="single"/>
+            </w:rPr>
+            <w:t xml:space="preserve">{{ patient_birth_month }}</w:t>
+          </w:r>
+          <w:proofErr w:type="spellEnd"/>
+        </w:sdtContent>
+      </w:sdt>
+      <w:r>
+        <w:rPr>
+          <w:rFonts w:ascii="Verdana" w:hAnsi="Verdana"/>
+          <w:sz w:val="16"/>
+          <w:szCs w:val="16"/>
+        </w:rPr>
+        <w:t xml:space="preserve"> </w:t>
+      </w:r>
+      <w:sdt>
+        <w:sdtPr>
+          <w:rPr>
+            <w:rFonts w:ascii="Verdana" w:hAnsi="Verdana"/>
+            <w:sz w:val="16"/>
+            <w:szCs w:val="16"/>
+            <w:u w:val="single"/>
+          </w:rPr>
+          <w:alias w:val="гггг"/>
+          <w:tag w:val="гггг"/>
+          <w:id w:val="1332793714"/>
+          <w:placeholder>
+            <w:docPart w:val="6FA6628EDDC240529E5D105D481887A2"/>
+          </w:placeholder>
+        </w:sdtPr>
+        <w:sdtEndPr/>
+        <w:sdtContent>
+          <w:proofErr w:type="spellStart"/>
+          <w:r>
+            <w:rPr>
+              <w:rFonts w:ascii="Verdana" w:hAnsi="Verdana"/>
+              <w:sz w:val="16"/>
+              <w:szCs w:val="16"/>
+              <w:u w:val="single"/>
+            </w:rPr>
+            <w:t xml:space="preserve">{{ patient_birth_year }}</w:t>
+          </w:r>
+          <w:proofErr w:type="spellEnd"/>
+        </w:sdtContent>
+      </w:sdt>
+      <w:r>
+        <w:rPr>
+          <w:rFonts w:ascii="Verdana" w:hAnsi="Verdana"/>
+          <w:sz w:val="16"/>
+          <w:szCs w:val="16"/>
+        </w:rPr>
+        <w:t xml:space="preserve"> г.</w:t>
+      </w:r>
+      <w:r>
+        <w:t>, проживающая п</w:t>
+      </w:r>
+      <w:r>
+        <w:t>о адресу</w:t>
+      </w:r>
+      <w:r>
+        <w:t xml:space="preserve"> </w:t>
+      </w:r>
+      <w:sdt>
+        <w:sdtPr>
+          <w:alias w:val="адрес пациента"/>
+          <w:tag w:val="адрес пациента"/>
+          <w:id w:val="2049026803"/>
+          <w:placeholder>
+            <w:docPart w:val="DefaultPlaceholder_1082065158"/>
+          </w:placeholder>
+        </w:sdtPr>
+        <w:sdtEndPr/>
+        <w:sdtContent>
+          <w:r>
+            <w:t xml:space="preserve">{{ patient_reg_address }}</w:t>
+          </w:r>
+        </w:sdtContent>
+      </w:sdt>
+      <w:r>
+        <w:t>,</w:t>
+      </w:r>
+      <w:r>
+        <w:t xml:space="preserve"> номер</w:t>
+      </w:r>
+      <w:r>
+        <w:t xml:space="preserve"> страхово</w:t>
+      </w:r>
+      <w:r>
+        <w:t xml:space="preserve">го медицинского </w:t>
+      </w:r>
+      <w:sdt>
+        <w:sdtPr>
+          <w:alias w:val="номер_фомс"/>
+          <w:tag w:val="номер_фомс"/>
+          <w:id w:val="-2071269360"/>
+          <w:placeholder>
+            <w:docPart w:val="DefaultPlaceholder_1082065158"/>
+          </w:placeholder>
+        </w:sdtPr>
+        <w:sdtEndPr/>
+        <w:sdtContent>
+          <w:r>
+            <w:t xml:space="preserve">{{ insurance_number }}</w:t>
+          </w:r>
+          <w:r>
+            <w:t xml:space="preserve"/>
+          </w:r>
+          <w:r>
+            <w:t/>
+          </w:r>
+        </w:sdtContent>
+      </w:sdt>
+      <w:r>
+        <w:t>,</w:t>
+      </w:r>
+      <w:r>
+        <w:t xml:space="preserve"> </w:t>
+      </w:r>
+      <w:r>
+        <w:t>именуем</w:t>
+      </w:r>
+      <w:r>
+        <w:t>ая</w:t>
+      </w:r>
+      <w:r>
+        <w:t xml:space="preserve"> в дальнейшем «Потребитель», с </w:t>
+      </w:r>
+      <w:r>
+        <w:t xml:space="preserve">другой </w:t>
+      </w:r>
+      <w:r>
+        <w:t>стороны,</w:t>
+      </w:r>
+      <w:r>
+        <w:t xml:space="preserve"> совместно именуемые «Стороны»,</w:t>
+      </w:r>
+      <w:r>
+        <w:t xml:space="preserve"> заключили на</w:t>
+      </w:r>
+      <w:r>
+        <w:t>стоящий договор о нижеследующем:</w:t>
+      </w:r>
+      <w:proofErr w:type="gramEnd"/>
     </w:p>
     <w:p>
       <w:pPr>
@@ -259,7 +800,17 @@
         <w:t>ному</w:t>
       </w:r>
       <w:r>
+        <w:rPr>
+          <w:rFonts w:eastAsiaTheme="minorHAnsi"/>
+          <w:lang w:eastAsia="en-US"/>
+        </w:rPr>
+        <w:t xml:space="preserve"> </w:t>
+      </w:r>
+      <w:r>
         <w:t>по системе обязательного медицинского страхования (ОМС),</w:t>
+      </w:r>
+      <w:r>
+        <w:t xml:space="preserve"> </w:t>
       </w:r>
       <w:r>
         <w:rPr>
@@ -350,7 +901,7 @@
         </w:rPr>
         <w:t xml:space="preserve">, является пациентом, на которого распространяется действие Федерального </w:t>
       </w:r>
-      <w:hyperlink r:id="rId8" w:history="1">
+      <w:hyperlink r:id="rId9" w:history="1">
         <w:r>
           <w:rPr>
             <w:rFonts w:eastAsiaTheme="minorHAnsi"/>
@@ -422,6 +973,14 @@
           <w:bCs/>
           <w:lang w:eastAsia="en-US"/>
         </w:rPr>
+        <w:t xml:space="preserve"> </w:t>
+      </w:r>
+      <w:r>
+        <w:rPr>
+          <w:rFonts w:eastAsiaTheme="minorHAnsi"/>
+          <w:bCs/>
+          <w:lang w:eastAsia="en-US"/>
+        </w:rPr>
         <w:t>потребителям (пациентам).</w:t>
       </w:r>
     </w:p>
@@ -491,7 +1050,19 @@
         <w:rPr>
           <w:color w:val="000000" w:themeColor="text1"/>
         </w:rPr>
-        <w:t xml:space="preserve">ребителюпо его желанию дополнительные </w:t>
+        <w:t>ребителю</w:t>
+      </w:r>
+      <w:r>
+        <w:rPr>
+          <w:color w:val="000000" w:themeColor="text1"/>
+        </w:rPr>
+        <w:t xml:space="preserve"> </w:t>
+      </w:r>
+      <w:r>
+        <w:rPr>
+          <w:color w:val="000000" w:themeColor="text1"/>
+        </w:rPr>
+        <w:t xml:space="preserve">по его желанию дополнительные </w:t>
       </w:r>
       <w:r>
         <w:rPr>
@@ -550,7 +1121,19 @@
         <w:rPr>
           <w:color w:val="000000" w:themeColor="text1"/>
         </w:rPr>
-        <w:t>- индивидуальные посты медицинского персонала в целях постоянного наблюдения за Потребителем</w:t>
+        <w:t xml:space="preserve">- </w:t>
+      </w:r>
+      <w:r>
+        <w:rPr>
+          <w:color w:val="000000" w:themeColor="text1"/>
+        </w:rPr>
+        <w:t xml:space="preserve"> </w:t>
+      </w:r>
+      <w:r>
+        <w:rPr>
+          <w:color w:val="000000" w:themeColor="text1"/>
+        </w:rPr>
+        <w:t>индивидуальные посты медицинского персонала в целях постоянного наблюдения за Потребителем</w:t>
       </w:r>
       <w:r>
         <w:rPr>
@@ -573,7 +1156,20 @@
         <w:rPr>
           <w:color w:val="000000" w:themeColor="text1"/>
         </w:rPr>
-        <w:t xml:space="preserve">-совместное пребывание </w:t>
+        <w:t>-</w:t>
+      </w:r>
+      <w:r>
+        <w:rPr>
+          <w:b/>
+          <w:color w:val="000000" w:themeColor="text1"/>
+        </w:rPr>
+        <w:t xml:space="preserve">   </w:t>
+      </w:r>
+      <w:r>
+        <w:rPr>
+          <w:color w:val="000000" w:themeColor="text1"/>
+        </w:rPr>
+        <w:t xml:space="preserve">совместное пребывание </w:t>
       </w:r>
       <w:r>
         <w:rPr>
@@ -619,6 +1215,12 @@
         <w:rPr>
           <w:color w:val="000000" w:themeColor="text1"/>
         </w:rPr>
+        <w:t xml:space="preserve"> </w:t>
+      </w:r>
+      <w:r>
+        <w:rPr>
+          <w:color w:val="000000" w:themeColor="text1"/>
+        </w:rPr>
         <w:t>использовани</w:t>
       </w:r>
       <w:r>
@@ -684,6 +1286,14 @@
       <w:r>
         <w:rPr>
           <w:color w:val="000000" w:themeColor="text1"/>
+          <w:sz w:val="27"/>
+          <w:szCs w:val="27"/>
+        </w:rPr>
+        <w:t xml:space="preserve"> </w:t>
+      </w:r>
+      <w:r>
+        <w:rPr>
+          <w:color w:val="000000" w:themeColor="text1"/>
         </w:rPr>
         <w:t>то есть не предусмотренных стандартами медицинской помощи;</w:t>
       </w:r>
@@ -705,6 +1315,15 @@
       </w:r>
       <w:r>
         <w:rPr>
+          <w:b/>
+          <w:color w:val="000000" w:themeColor="text1"/>
+          <w:sz w:val="27"/>
+          <w:szCs w:val="27"/>
+        </w:rPr>
+        <w:t xml:space="preserve"> </w:t>
+      </w:r>
+      <w:r>
+        <w:rPr>
           <w:color w:val="000000" w:themeColor="text1"/>
         </w:rPr>
         <w:t>обеспечение</w:t>
@@ -837,6 +1456,12 @@
         <w:rPr>
           <w:color w:val="000000" w:themeColor="text1"/>
         </w:rPr>
+        <w:t xml:space="preserve"> </w:t>
+      </w:r>
+      <w:r>
+        <w:rPr>
+          <w:color w:val="000000" w:themeColor="text1"/>
+        </w:rPr>
         <w:t xml:space="preserve">или </w:t>
       </w:r>
       <w:r>
@@ -922,7 +1547,21 @@
         <w:rPr>
           <w:color w:val="000000" w:themeColor="text1"/>
         </w:rPr>
-        <w:t xml:space="preserve">    1.2. Исполнитель оказывает услуги по месту своего нахождения по адресу: г. Махачкала, ул. М. Ярагского, </w:t>
+        <w:t xml:space="preserve">    1.2. Исполнитель оказывает услуги по месту своего нахождения по адресу: г. Махачкала, ул. М. </w:t>
+      </w:r>
+      <w:proofErr w:type="spellStart"/>
+      <w:r>
+        <w:rPr>
+          <w:color w:val="000000" w:themeColor="text1"/>
+        </w:rPr>
+        <w:t>Ярагского</w:t>
+      </w:r>
+      <w:proofErr w:type="spellEnd"/>
+      <w:r>
+        <w:rPr>
+          <w:color w:val="000000" w:themeColor="text1"/>
+        </w:rPr>
+        <w:t xml:space="preserve">, </w:t>
       </w:r>
       <w:r>
         <w:rPr>
@@ -956,6 +1595,12 @@
         <w:rPr>
           <w:color w:val="000000" w:themeColor="text1"/>
         </w:rPr>
+        <w:t xml:space="preserve"> </w:t>
+      </w:r>
+      <w:r>
+        <w:rPr>
+          <w:color w:val="000000" w:themeColor="text1"/>
+        </w:rPr>
         <w:t>1.</w:t>
       </w:r>
       <w:r>
@@ -990,41 +1635,41 @@
         <w:rPr>
           <w:color w:val="000000" w:themeColor="text1"/>
         </w:rPr>
+        <w:t>1.</w:t>
+      </w:r>
+      <w:r>
+        <w:rPr>
+          <w:color w:val="000000" w:themeColor="text1"/>
+        </w:rPr>
+        <w:t>4</w:t>
+      </w:r>
+      <w:r>
+        <w:rPr>
+          <w:color w:val="000000" w:themeColor="text1"/>
+        </w:rPr>
+        <w:t xml:space="preserve">. Потребитель подтверждает, что на момент подписания настоящего Договора </w:t>
+      </w:r>
+      <w:r>
+        <w:rPr>
+          <w:color w:val="000000" w:themeColor="text1"/>
+        </w:rPr>
+        <w:t>Исполнитель:</w:t>
+      </w:r>
+    </w:p>
+    <w:p>
+      <w:pPr>
+        <w:spacing w:line="16" w:lineRule="atLeast"/>
+        <w:ind w:firstLine="567"/>
+        <w:jc w:val="both"/>
+        <w:rPr>
+          <w:color w:val="000000" w:themeColor="text1"/>
+        </w:rPr>
+      </w:pPr>
+      <w:r>
+        <w:rPr>
+          <w:color w:val="000000" w:themeColor="text1"/>
+        </w:rPr>
         <w:lastRenderedPageBreak/>
-        <w:t>1.</w:t>
-      </w:r>
-      <w:r>
-        <w:rPr>
-          <w:color w:val="000000" w:themeColor="text1"/>
-        </w:rPr>
-        <w:t>4</w:t>
-      </w:r>
-      <w:r>
-        <w:rPr>
-          <w:color w:val="000000" w:themeColor="text1"/>
-        </w:rPr>
-        <w:t xml:space="preserve">. Потребитель подтверждает, что на момент подписания настоящего Договора </w:t>
-      </w:r>
-      <w:r>
-        <w:rPr>
-          <w:color w:val="000000" w:themeColor="text1"/>
-        </w:rPr>
-        <w:t>Исполнитель:</w:t>
-      </w:r>
-    </w:p>
-    <w:p>
-      <w:pPr>
-        <w:spacing w:line="16" w:lineRule="atLeast"/>
-        <w:ind w:firstLine="567"/>
-        <w:jc w:val="both"/>
-        <w:rPr>
-          <w:color w:val="000000" w:themeColor="text1"/>
-        </w:rPr>
-      </w:pPr>
-      <w:r>
-        <w:rPr>
-          <w:color w:val="000000" w:themeColor="text1"/>
-        </w:rPr>
         <w:t xml:space="preserve">- ознакомил Потребителя с Правилами предоставления медицинскими организациями </w:t>
       </w:r>
       <w:r>
@@ -1039,6 +1684,12 @@
         <w:rPr>
           <w:color w:val="000000" w:themeColor="text1"/>
         </w:rPr>
+        <w:t xml:space="preserve"> </w:t>
+      </w:r>
+      <w:r>
+        <w:rPr>
+          <w:color w:val="000000" w:themeColor="text1"/>
+        </w:rPr>
         <w:t>(утв. Постановлением Правительства от 04.10.2012 № 1006);</w:t>
       </w:r>
     </w:p>
@@ -1131,6 +1782,12 @@
           <w:color w:val="000000" w:themeColor="text1"/>
         </w:rPr>
       </w:pPr>
+      <w:r>
+        <w:rPr>
+          <w:color w:val="000000" w:themeColor="text1"/>
+        </w:rPr>
+        <w:t xml:space="preserve"> </w:t>
+      </w:r>
     </w:p>
     <w:p>
       <w:pPr>
@@ -1261,7 +1918,15 @@
         <w:t>Потребителем или его законными представителями</w:t>
       </w:r>
       <w:r>
-        <w:t xml:space="preserve"> неполных и/или недостоверных сведений, связанных с здоровьем </w:t>
+        <w:t xml:space="preserve"> неполных и/или недостоверных сведений, связанных </w:t>
+      </w:r>
+      <w:proofErr w:type="gramStart"/>
+      <w:r>
+        <w:t>с</w:t>
+      </w:r>
+      <w:proofErr w:type="gramEnd"/>
+      <w:r>
+        <w:t xml:space="preserve"> здоровьем </w:t>
       </w:r>
       <w:r>
         <w:t>Потребителя</w:t>
@@ -1437,6 +2102,7 @@
         </w:rPr>
         <w:t>данных о конкретном медицинском работнике, предоставляющем соответствующую платную медицинскую услугу (его профессиональном образовании и квалификации)</w:t>
       </w:r>
+      <w:proofErr w:type="gramStart"/>
       <w:r>
         <w:rPr>
           <w:rFonts w:eastAsiaTheme="minorHAnsi"/>
@@ -1444,13 +2110,39 @@
         </w:rPr>
         <w:t>.</w:t>
       </w:r>
+      <w:proofErr w:type="gramEnd"/>
       <w:r>
         <w:rPr>
           <w:rFonts w:eastAsiaTheme="minorHAnsi"/>
           <w:color w:val="FFFFFF" w:themeColor="background1"/>
           <w:lang w:eastAsia="en-US"/>
         </w:rPr>
-        <w:t>роды).</w:t>
+        <w:t xml:space="preserve"> </w:t>
+      </w:r>
+      <w:proofErr w:type="gramStart"/>
+      <w:r>
+        <w:rPr>
+          <w:rFonts w:eastAsiaTheme="minorHAnsi"/>
+          <w:color w:val="FFFFFF" w:themeColor="background1"/>
+          <w:lang w:eastAsia="en-US"/>
+        </w:rPr>
+        <w:t>р</w:t>
+      </w:r>
+      <w:proofErr w:type="gramEnd"/>
+      <w:r>
+        <w:rPr>
+          <w:rFonts w:eastAsiaTheme="minorHAnsi"/>
+          <w:color w:val="FFFFFF" w:themeColor="background1"/>
+          <w:lang w:eastAsia="en-US"/>
+        </w:rPr>
+        <w:t>оды).</w:t>
+      </w:r>
+      <w:r>
+        <w:rPr>
+          <w:rFonts w:eastAsiaTheme="minorHAnsi"/>
+          <w:lang w:eastAsia="en-US"/>
+        </w:rPr>
+        <w:t xml:space="preserve"> </w:t>
       </w:r>
     </w:p>
     <w:p>
@@ -1485,6 +2177,12 @@
         <w:t>2.3.1.</w:t>
       </w:r>
       <w:r>
+        <w:rPr>
+          <w:b/>
+        </w:rPr>
+        <w:t xml:space="preserve"> </w:t>
+      </w:r>
+      <w:r>
         <w:t>Своевременно получать услуги в установленном настоящим Договором и законом порядке.</w:t>
       </w:r>
     </w:p>
@@ -1631,10 +2329,18 @@
         <w:t xml:space="preserve">. </w:t>
       </w:r>
       <w:r>
-        <w:t>Своевременно о</w:t>
+        <w:t xml:space="preserve">Своевременно </w:t>
+      </w:r>
+      <w:proofErr w:type="gramStart"/>
+      <w:r>
+        <w:t>о</w:t>
       </w:r>
       <w:r>
         <w:t>платить стоимость оказываемых</w:t>
+      </w:r>
+      <w:proofErr w:type="gramEnd"/>
+      <w:r>
+        <w:t xml:space="preserve"> </w:t>
       </w:r>
       <w:r>
         <w:t>дополнительных</w:t>
@@ -1720,6 +2426,9 @@
         <w:t>дополнительных</w:t>
       </w:r>
       <w:r>
+        <w:t xml:space="preserve"> </w:t>
+      </w:r>
+      <w:r>
         <w:t xml:space="preserve">платных </w:t>
       </w:r>
       <w:r>
@@ -1784,20 +2493,10 @@
         <w:t>внесения суммы оплаты в кассу Исполнителя</w:t>
       </w:r>
       <w:r>
-        <w:t xml:space="preserve">, или перевода причитающейся </w:t>
-      </w:r>
-      <w:r>
-        <w:t>И</w:t>
-      </w:r>
-      <w:r>
-        <w:t xml:space="preserve">сполнителю суммы на его расчетный счет. </w:t>
-      </w:r>
-      <w:r>
-        <w:rPr>
-          <w:rFonts w:eastAsiaTheme="minorHAnsi"/>
-          <w:lang w:eastAsia="en-US"/>
-        </w:rPr>
-        <w:t>Датой оплаты денежных средств считается день зачисления денежных средств на расчетный счет Исполнителя или день внесения денежных средств в кассу Исполнителя.</w:t>
+        <w:t>.</w:t>
+      </w:r>
+      <w:r>
+        <w:t xml:space="preserve"> </w:t>
       </w:r>
     </w:p>
     <w:p>
@@ -1825,27 +2524,27 @@
         <w:rPr>
           <w:b/>
         </w:rPr>
+        <w:t>Ответственность сторон.</w:t>
+      </w:r>
+    </w:p>
+    <w:p>
+      <w:pPr>
+        <w:pStyle w:val="a3"/>
+        <w:spacing w:line="16" w:lineRule="atLeast"/>
+        <w:ind w:left="862"/>
+        <w:rPr>
+          <w:b/>
+        </w:rPr>
+      </w:pPr>
+    </w:p>
+    <w:p>
+      <w:pPr>
+        <w:spacing w:line="16" w:lineRule="atLeast"/>
+        <w:ind w:firstLine="567"/>
+        <w:jc w:val="both"/>
+      </w:pPr>
+      <w:r>
         <w:lastRenderedPageBreak/>
-        <w:t>Ответственность сторон.</w:t>
-      </w:r>
-    </w:p>
-    <w:p>
-      <w:pPr>
-        <w:pStyle w:val="a3"/>
-        <w:spacing w:line="16" w:lineRule="atLeast"/>
-        <w:ind w:left="862"/>
-        <w:rPr>
-          <w:b/>
-        </w:rPr>
-      </w:pPr>
-    </w:p>
-    <w:p>
-      <w:pPr>
-        <w:spacing w:line="16" w:lineRule="atLeast"/>
-        <w:ind w:firstLine="567"/>
-        <w:jc w:val="both"/>
-      </w:pPr>
-      <w:r>
         <w:t>4</w:t>
       </w:r>
       <w:r>
@@ -1902,7 +2601,15 @@
         <w:t>4</w:t>
       </w:r>
       <w:r>
-        <w:t>.3. Исполнитель освобождается от ответственности за неисполнение или ненадлежащее исполнение настоящего Договора, причиной которого стало нарушение Потребителем условий  настоящего Договора, а также если докажет, что неисполнение или ненадлежащее исполнение произошло вследствие непреодолимой силы, а так же по иным основаниям, предусмотренным законом</w:t>
+        <w:t xml:space="preserve">.3. Исполнитель освобождается от ответственности за неисполнение или ненадлежащее исполнение настоящего Договора, причиной которого стало нарушение Потребителем условий  настоящего Договора, а </w:t>
+      </w:r>
+      <w:proofErr w:type="gramStart"/>
+      <w:r>
+        <w:t>также</w:t>
+      </w:r>
+      <w:proofErr w:type="gramEnd"/>
+      <w:r>
+        <w:t xml:space="preserve"> если докажет, что неисполнение или ненадлежащее исполнение произошло вследствие непреодолимой силы, а так же по иным основаниям, предусмотренным законом</w:t>
       </w:r>
       <w:r>
         <w:t>.</w:t>
@@ -1988,7 +2695,13 @@
         <w:t>5</w:t>
       </w:r>
       <w:r>
-        <w:t xml:space="preserve">. Исполнитель не несет ответственности за деньги, ценности, документы Потребителя, если они не сданы на хранение в установленном порядке. </w:t>
+        <w:t>. Исполнитель не несет ответственности за деньги, ценности, документы Потребителя</w:t>
+      </w:r>
+      <w:r>
+        <w:t>.</w:t>
+      </w:r>
+      <w:r>
+        <w:t xml:space="preserve"> </w:t>
       </w:r>
     </w:p>
     <w:p>
@@ -2055,7 +2768,15 @@
         <w:t>х</w:t>
       </w:r>
       <w:r>
-        <w:t xml:space="preserve"> договором, стороны рассматривают путем переговоров, а в случае не достижения соглашения в процессе переговоров, данный спор подлежит рассмотрению в судебном порядке в соответствии с действующим законодательством Российской Федерации. </w:t>
+        <w:t xml:space="preserve"> договором, стороны рассматривают путем переговоров, а в случае </w:t>
+      </w:r>
+      <w:proofErr w:type="gramStart"/>
+      <w:r>
+        <w:t>не достижения</w:t>
+      </w:r>
+      <w:proofErr w:type="gramEnd"/>
+      <w:r>
+        <w:t xml:space="preserve"> соглашения в процессе переговоров, данный спор подлежит рассмотрению в судебном порядке в соответствии с действующим законодательством Российской Федерации. </w:t>
       </w:r>
     </w:p>
     <w:p>
@@ -2160,9 +2881,6 @@
         <w:spacing w:line="16" w:lineRule="atLeast"/>
         <w:ind w:firstLine="284"/>
         <w:jc w:val="both"/>
-        <w:rPr>
-          <w:b/>
-        </w:rPr>
       </w:pPr>
       <w:r>
         <w:tab/>
@@ -2185,11 +2903,205 @@
     </w:p>
     <w:p>
       <w:pPr>
+        <w:spacing w:after="120"/>
+        <w:contextualSpacing/>
+        <w:jc w:val="center"/>
+        <w:rPr>
+          <w:rFonts w:asciiTheme="majorHAnsi" w:hAnsiTheme="majorHAnsi" w:cstheme="majorHAnsi"/>
+          <w:b/>
+        </w:rPr>
+      </w:pPr>
+      <w:r>
+        <w:rPr>
+          <w:rFonts w:asciiTheme="majorHAnsi" w:hAnsiTheme="majorHAnsi" w:cstheme="majorHAnsi"/>
+          <w:b/>
+        </w:rPr>
+        <w:t>6</w:t>
+      </w:r>
+      <w:r>
+        <w:rPr>
+          <w:rFonts w:asciiTheme="majorHAnsi" w:hAnsiTheme="majorHAnsi" w:cstheme="majorHAnsi"/>
+          <w:b/>
+        </w:rPr>
+        <w:t>.</w:t>
+      </w:r>
+      <w:r>
+        <w:rPr>
+          <w:rFonts w:asciiTheme="majorHAnsi" w:hAnsiTheme="majorHAnsi" w:cstheme="majorHAnsi"/>
+          <w:b/>
+        </w:rPr>
+        <w:tab/>
+      </w:r>
+      <w:r>
+        <w:rPr>
+          <w:rFonts w:asciiTheme="majorHAnsi" w:hAnsiTheme="majorHAnsi" w:cstheme="majorHAnsi"/>
+          <w:b/>
+        </w:rPr>
+        <w:t>Конфиденциальность</w:t>
+      </w:r>
+    </w:p>
+    <w:p>
+      <w:pPr>
+        <w:spacing w:after="120"/>
+        <w:ind w:firstLine="709"/>
+        <w:contextualSpacing/>
+        <w:jc w:val="both"/>
+        <w:rPr>
+          <w:rFonts w:asciiTheme="majorHAnsi" w:hAnsiTheme="majorHAnsi" w:cstheme="majorHAnsi"/>
+        </w:rPr>
+      </w:pPr>
+      <w:r>
+        <w:rPr>
+          <w:rFonts w:asciiTheme="majorHAnsi" w:hAnsiTheme="majorHAnsi" w:cstheme="majorHAnsi"/>
+        </w:rPr>
+        <w:t>6</w:t>
+      </w:r>
+      <w:r>
+        <w:rPr>
+          <w:rFonts w:asciiTheme="majorHAnsi" w:hAnsiTheme="majorHAnsi" w:cstheme="majorHAnsi"/>
+        </w:rPr>
+        <w:t>.1. Исполнитель обязуется хранить в тайне информацию о факте обращения Потребителя за медицинской помощью, состоянии его здоровья, диагнозе его заболевания, видах и методах оказанных Услуг, а также иные сведения, полученные при оказании Услуг.</w:t>
+      </w:r>
+    </w:p>
+    <w:p>
+      <w:pPr>
+        <w:spacing w:after="120"/>
+        <w:ind w:firstLine="709"/>
+        <w:contextualSpacing/>
+        <w:jc w:val="both"/>
+        <w:rPr>
+          <w:rFonts w:asciiTheme="majorHAnsi" w:hAnsiTheme="majorHAnsi" w:cstheme="majorHAnsi"/>
+        </w:rPr>
+      </w:pPr>
+      <w:r>
+        <w:rPr>
+          <w:rFonts w:asciiTheme="majorHAnsi" w:hAnsiTheme="majorHAnsi" w:cstheme="majorHAnsi"/>
+        </w:rPr>
+        <w:t>6</w:t>
+      </w:r>
+      <w:r>
+        <w:rPr>
+          <w:rFonts w:asciiTheme="majorHAnsi" w:hAnsiTheme="majorHAnsi" w:cstheme="majorHAnsi"/>
+        </w:rPr>
+        <w:t>.2. С согласия Потребителя или его законного представителя допускается передача сведений, составляющих врачебную тайну другим лицам, указанным Потребителем или его законным представителем.</w:t>
+      </w:r>
+    </w:p>
+    <w:p>
+      <w:pPr>
+        <w:spacing w:after="120"/>
+        <w:ind w:firstLine="709"/>
+        <w:contextualSpacing/>
+        <w:jc w:val="both"/>
+        <w:rPr>
+          <w:rFonts w:asciiTheme="majorHAnsi" w:hAnsiTheme="majorHAnsi" w:cstheme="majorHAnsi"/>
+        </w:rPr>
+      </w:pPr>
+      <w:r>
+        <w:rPr>
+          <w:rFonts w:asciiTheme="majorHAnsi" w:hAnsiTheme="majorHAnsi" w:cstheme="majorHAnsi"/>
+        </w:rPr>
+        <w:t>6</w:t>
+      </w:r>
+      <w:r>
+        <w:rPr>
+          <w:rFonts w:asciiTheme="majorHAnsi" w:hAnsiTheme="majorHAnsi" w:cstheme="majorHAnsi"/>
+        </w:rPr>
+        <w:t>.3. Предоставление сведений, составляющих врачебную тайну, без согласия Потребителя (Пациента) или его законного представителя допускается в случаях, установленных ст. 13 Федерального закона от 21 ноября 2012 года №323-ФЗ «Об основах охраны здоровья граждан в Российской Федерации».</w:t>
+      </w:r>
+    </w:p>
+    <w:p>
+      <w:pPr>
+        <w:spacing w:after="120"/>
+        <w:ind w:firstLine="709"/>
+        <w:contextualSpacing/>
+        <w:jc w:val="both"/>
+        <w:rPr>
+          <w:rFonts w:asciiTheme="majorHAnsi" w:hAnsiTheme="majorHAnsi" w:cstheme="majorHAnsi"/>
+        </w:rPr>
+      </w:pPr>
+      <w:r>
+        <w:rPr>
+          <w:rFonts w:asciiTheme="majorHAnsi" w:hAnsiTheme="majorHAnsi" w:cstheme="majorHAnsi"/>
+        </w:rPr>
+        <w:t>6</w:t>
+      </w:r>
+      <w:r>
+        <w:rPr>
+          <w:rFonts w:asciiTheme="majorHAnsi" w:hAnsiTheme="majorHAnsi" w:cstheme="majorHAnsi"/>
+        </w:rPr>
+        <w:t xml:space="preserve">.4. </w:t>
+      </w:r>
+      <w:proofErr w:type="gramStart"/>
+      <w:r>
+        <w:rPr>
+          <w:rFonts w:asciiTheme="majorHAnsi" w:hAnsiTheme="majorHAnsi" w:cstheme="majorHAnsi"/>
+        </w:rPr>
+        <w:t>Потребитель даёт согласие Исполнителю на обработку и использование следующих своих персональных данных, содержащихся в настоящем Договоре, с целью организации оказания платной медицинской помощи (Услуг) Потребителю в ООО «Родильный Дом №4»: фамилия, имя, отчество, дата рождения, пол, документ удостоверяющий личность (наименование, номер и серия, кем и когда выдан), почтовый адрес по месту регистрации и месту фактического проживания, контактный телефон, серия и</w:t>
+      </w:r>
+      <w:proofErr w:type="gramEnd"/>
+      <w:r>
+        <w:rPr>
+          <w:rFonts w:asciiTheme="majorHAnsi" w:hAnsiTheme="majorHAnsi" w:cstheme="majorHAnsi"/>
+        </w:rPr>
+        <w:t xml:space="preserve"> </w:t>
+      </w:r>
+      <w:proofErr w:type="gramStart"/>
+      <w:r>
+        <w:rPr>
+          <w:rFonts w:asciiTheme="majorHAnsi" w:hAnsiTheme="majorHAnsi" w:cstheme="majorHAnsi"/>
+        </w:rPr>
+        <w:t xml:space="preserve">номер полиса обязательного медицинского страхования, наименование страховой медицинской организации, страховой номер индивидуального лицевого счёта (СНИЛС), сведения о законном представителе (фамилия имя отчество, дата рождения, пол, документ удостоверяющий личность законного представителя (наименование, номер и серия, кем и когда выдан)), почтовый адрес по месту регистрации и </w:t>
+      </w:r>
+      <w:r>
+        <w:rPr>
+          <w:rFonts w:asciiTheme="majorHAnsi" w:hAnsiTheme="majorHAnsi" w:cstheme="majorHAnsi"/>
+        </w:rPr>
+        <w:lastRenderedPageBreak/>
+        <w:t>месту фактического проживания законного представителя, контактный телефон законного представителя, документ, подтверждающий полномочия законного представителя (наименование, номер</w:t>
+      </w:r>
+      <w:proofErr w:type="gramEnd"/>
+      <w:r>
+        <w:rPr>
+          <w:rFonts w:asciiTheme="majorHAnsi" w:hAnsiTheme="majorHAnsi" w:cstheme="majorHAnsi"/>
+        </w:rPr>
+        <w:t xml:space="preserve"> и серия, кем и когда </w:t>
+      </w:r>
+      <w:proofErr w:type="gramStart"/>
+      <w:r>
+        <w:rPr>
+          <w:rFonts w:asciiTheme="majorHAnsi" w:hAnsiTheme="majorHAnsi" w:cstheme="majorHAnsi"/>
+        </w:rPr>
+        <w:t>выдан</w:t>
+      </w:r>
+      <w:proofErr w:type="gramEnd"/>
+      <w:r>
+        <w:rPr>
+          <w:rFonts w:asciiTheme="majorHAnsi" w:hAnsiTheme="majorHAnsi" w:cstheme="majorHAnsi"/>
+        </w:rPr>
+        <w:t>).</w:t>
+      </w:r>
+    </w:p>
+    <w:p>
+      <w:pPr>
+        <w:spacing w:line="16" w:lineRule="atLeast"/>
+        <w:ind w:firstLine="284"/>
+        <w:jc w:val="both"/>
+        <w:rPr>
+          <w:b/>
+        </w:rPr>
+      </w:pPr>
+    </w:p>
+    <w:p>
+      <w:pPr>
+        <w:pStyle w:val="a3"/>
+        <w:numPr>
+          <w:ilvl w:val="0"/>
+          <w:numId w:val="3"/>
+        </w:numPr>
         <w:tabs>
           <w:tab w:val="left" w:pos="3658"/>
         </w:tabs>
         <w:spacing w:line="16" w:lineRule="atLeast"/>
-        <w:ind w:left="567"/>
         <w:jc w:val="center"/>
         <w:rPr>
           <w:b/>
@@ -2199,13 +3111,7 @@
         <w:rPr>
           <w:b/>
         </w:rPr>
-        <w:t>6</w:t>
-      </w:r>
-      <w:r>
-        <w:rPr>
-          <w:b/>
-        </w:rPr>
-        <w:t>. Адреса и реквизиты сторон</w:t>
+        <w:t>Адреса и реквизиты сторон</w:t>
       </w:r>
     </w:p>
     <w:p>
@@ -2225,6 +3131,24 @@
           <w:b/>
         </w:rPr>
         <w:t xml:space="preserve">Исполнитель                                             </w:t>
+      </w:r>
+      <w:r>
+        <w:rPr>
+          <w:b/>
+        </w:rPr>
+        <w:t xml:space="preserve">            </w:t>
+      </w:r>
+      <w:r>
+        <w:rPr>
+          <w:b/>
+        </w:rPr>
+        <w:t xml:space="preserve"> </w:t>
+      </w:r>
+      <w:r>
+        <w:rPr>
+          <w:b/>
+        </w:rPr>
+        <w:t xml:space="preserve">              </w:t>
       </w:r>
       <w:r>
         <w:rPr>
@@ -2240,13 +3164,13 @@
     </w:p>
     <w:tbl>
       <w:tblPr>
-        <w:tblW w:w="10598" w:type="dxa"/>
+        <w:tblW w:w="10456" w:type="dxa"/>
         <w:tblLayout w:type="fixed"/>
-        <w:tblLook w:val="01E0"/>
+        <w:tblLook w:val="01E0" w:firstRow="1" w:lastRow="1" w:firstColumn="1" w:lastColumn="1" w:noHBand="0" w:noVBand="0"/>
       </w:tblPr>
       <w:tblGrid>
-        <w:gridCol w:w="5495"/>
-        <w:gridCol w:w="5103"/>
+        <w:gridCol w:w="5778"/>
+        <w:gridCol w:w="4678"/>
       </w:tblGrid>
       <w:tr>
         <w:trPr>
@@ -2254,7 +3178,7 @@
         </w:trPr>
         <w:tc>
           <w:tcPr>
-            <w:tcW w:w="5495" w:type="dxa"/>
+            <w:tcW w:w="5778" w:type="dxa"/>
           </w:tcPr>
           <w:p>
             <w:pPr>
@@ -2285,13 +3209,37 @@
               <w:jc w:val="both"/>
             </w:pPr>
             <w:r>
-              <w:t>Адрес: 367010, РД, г.Махачкала, ул.М.Ярагского, д.6</w:t>
+              <w:t xml:space="preserve">Адрес: 367010, РД, </w:t>
             </w:r>
+            <w:proofErr w:type="spellStart"/>
+            <w:r>
+              <w:t>г.Махачкала</w:t>
+            </w:r>
+            <w:proofErr w:type="spellEnd"/>
+            <w:r>
+              <w:t xml:space="preserve">, </w:t>
+            </w:r>
+            <w:proofErr w:type="spellStart"/>
+            <w:r>
+              <w:t>ул.М.Ярагского</w:t>
+            </w:r>
+            <w:proofErr w:type="spellEnd"/>
+            <w:r>
+              <w:t>, д.</w:t>
+            </w:r>
+            <w:r>
+              <w:t>6</w:t>
+            </w:r>
+            <w:bookmarkStart w:id="0" w:name="_GoBack"/>
+            <w:bookmarkEnd w:id="0"/>
           </w:p>
           <w:p>
             <w:pPr>
               <w:jc w:val="both"/>
             </w:pPr>
+            <w:r>
+              <w:t xml:space="preserve">    </w:t>
+            </w:r>
           </w:p>
           <w:p>
             <w:pPr>
@@ -2314,7 +3262,21 @@
               <w:rPr>
                 <w:bCs/>
               </w:rPr>
-              <w:t>Арбуханов М.А.</w:t>
+              <w:t xml:space="preserve">  </w:t>
+            </w:r>
+            <w:proofErr w:type="spellStart"/>
+            <w:r>
+              <w:rPr>
+                <w:bCs/>
+              </w:rPr>
+              <w:t>Арбуханов</w:t>
+            </w:r>
+            <w:proofErr w:type="spellEnd"/>
+            <w:r>
+              <w:rPr>
+                <w:bCs/>
+              </w:rPr>
+              <w:t xml:space="preserve"> М.А.</w:t>
             </w:r>
           </w:p>
           <w:p>
@@ -2322,13 +3284,16 @@
               <w:jc w:val="both"/>
             </w:pPr>
             <w:r>
+              <w:t xml:space="preserve">                                            </w:t>
+            </w:r>
+            <w:r>
               <w:t xml:space="preserve">М.П. </w:t>
             </w:r>
           </w:p>
         </w:tc>
         <w:tc>
           <w:tcPr>
-            <w:tcW w:w="5103" w:type="dxa"/>
+            <w:tcW w:w="4678" w:type="dxa"/>
           </w:tcPr>
           <w:p>
             <w:pPr>
@@ -2342,7 +3307,7 @@
               <w:rPr>
                 <w:bCs/>
               </w:rPr>
-              <w:t>Ф.И.О</w:t>
+              <w:t xml:space="preserve">Потребитель</w:t>
             </w:r>
             <w:r>
               <w:rPr>
@@ -2356,9 +3321,22 @@
               </w:rPr>
               <w:t xml:space="preserve"> </w:t>
             </w:r>
-            <w:r>
-              <w:t>{{ patient_name }}</w:t>
-            </w:r>
+            <w:sdt>
+              <w:sdtPr>
+                <w:alias w:val="ФИО"/>
+                <w:tag w:val="ФИО"/>
+                <w:id w:val="1412050061"/>
+                <w:placeholder>
+                  <w:docPart w:val="38CCBE4EB57A4F7CABCEBC9F64663B43"/>
+                </w:placeholder>
+              </w:sdtPr>
+              <w:sdtEndPr/>
+              <w:sdtContent>
+                <w:r>
+                  <w:t xml:space="preserve">{{ patient_name }}</w:t>
+                </w:r>
+              </w:sdtContent>
+            </w:sdt>
           </w:p>
           <w:p>
             <w:pPr>
@@ -2372,35 +3350,111 @@
               <w:rPr>
                 <w:bCs/>
               </w:rPr>
-              <w:t>Паспортные данные :</w:t>
+              <w:t xml:space="preserve">Паспортные данные либо данные свидетельства о рождении</w:t>
             </w:r>
-          </w:p>
-          <w:p>
-            <w:pPr>
-              <w:jc w:val="both"/>
+            <w:proofErr w:type="gramStart"/>
+            <w:r>
               <w:rPr>
                 <w:bCs/>
               </w:rPr>
+              <w:t xml:space="preserve"> :</w:t>
+            </w:r>
+            <w:proofErr w:type="gramEnd"/>
+            <w:r>
+              <w:rPr>
+                <w:bCs/>
+              </w:rPr>
+              <w:t xml:space="preserve"> </w:t>
+            </w:r>
+          </w:p>
+          <w:sdt>
+            <w:sdtPr>
+              <w:rPr>
+                <w:bCs/>
+              </w:rPr>
+              <w:alias w:val="паспортные данные"/>
+              <w:tag w:val="паспортные данные"/>
+              <w:id w:val="-1213645051"/>
+              <w:placeholder>
+                <w:docPart w:val="DefaultPlaceholder_1082065158"/>
+              </w:placeholder>
+            </w:sdtPr>
+            <w:sdtEndPr/>
+            <w:sdtContent>
+              <w:p>
+                <w:pPr>
+                  <w:ind w:left="340" w:hanging="340"/>
+                  <w:jc w:val="both"/>
+                  <w:rPr>
+                    <w:bCs/>
+                  </w:rPr>
+                </w:pPr>
+                <w:r>
+                  <w:rPr>
+                    <w:bCs/>
+                  </w:rPr>
+                  <w:t xml:space="preserve">{{ patient_passport_full }}</w:t>
+                </w:r>
+              </w:p>
+            </w:sdtContent>
+          </w:sdt>
+          <w:p>
+            <w:pPr>
+              <w:ind w:left="340" w:hanging="340"/>
+              <w:jc w:val="both"/>
             </w:pPr>
             <w:r>
-              <w:t>{{ patient_passport_full }}</w:t>
+              <w:t xml:space="preserve">Адрес места регистрации</w:t>
             </w:r>
+            <w:r>
+              <w:t>:</w:t>
+            </w:r>
+            <w:r>
+              <w:t xml:space="preserve"> </w:t>
+            </w:r>
+            <w:sdt>
+              <w:sdtPr>
+                <w:alias w:val="адрес пациента"/>
+                <w:tag w:val="адрес пациента"/>
+                <w:id w:val="1432548501"/>
+                <w:placeholder>
+                  <w:docPart w:val="6D308016ADA441BE80954227017427D3"/>
+                </w:placeholder>
+              </w:sdtPr>
+              <w:sdtEndPr/>
+              <w:sdtContent>
+                <w:r>
+                  <w:t xml:space="preserve">{{ patient_reg_address }}</w:t>
+                </w:r>
+              </w:sdtContent>
+            </w:sdt>
           </w:p>
           <w:p>
             <w:pPr>
               <w:jc w:val="both"/>
             </w:pPr>
             <w:r>
-              <w:t>Адрес: {{ patient_reg_address }}</w:t>
+              <w:t xml:space="preserve">тел.:</w:t>
             </w:r>
-          </w:p>
-          <w:p>
-            <w:pPr>
-              <w:jc w:val="both"/>
-            </w:pPr>
             <w:r>
-              <w:t>Телефон: {{ patient_phone }}</w:t>
+              <w:t xml:space="preserve"> </w:t>
             </w:r>
+            <w:sdt>
+              <w:sdtPr>
+                <w:alias w:val="телефон пациента"/>
+                <w:tag w:val="телефон пациента"/>
+                <w:id w:val="76571271"/>
+                <w:placeholder>
+                  <w:docPart w:val="DefaultPlaceholder_1082065158"/>
+                </w:placeholder>
+              </w:sdtPr>
+              <w:sdtEndPr/>
+              <w:sdtContent>
+                <w:r>
+                  <w:t xml:space="preserve">{{ patient_phone }}</w:t>
+                </w:r>
+              </w:sdtContent>
+            </w:sdt>
           </w:p>
           <w:p>
             <w:pPr>
@@ -2436,7 +3490,7 @@
       </w:pPr>
     </w:p>
     <w:sectPr>
-      <w:footerReference w:type="default" r:id="rId9"/>
+      <w:footerReference w:type="default" r:id="rId10"/>
       <w:pgSz w:w="11906" w:h="16838"/>
       <w:pgMar w:top="567" w:right="849" w:bottom="284" w:left="993" w:header="708" w:footer="967" w:gutter="0"/>
       <w:cols w:space="708"/>
@@ -2447,15 +3501,15 @@
 </file>
 
 <file path=word/endnotes.xml><?xml version="1.0" encoding="utf-8"?>
-<w:endnotes xmlns:ve="http://schemas.openxmlformats.org/markup-compatibility/2006" xmlns:o="urn:schemas-microsoft-com:office:office" xmlns:r="http://schemas.openxmlformats.org/officeDocument/2006/relationships" xmlns:m="http://schemas.openxmlformats.org/officeDocument/2006/math" xmlns:v="urn:schemas-microsoft-com:vml" xmlns:wp="http://schemas.openxmlformats.org/drawingml/2006/wordprocessingDrawing" xmlns:w10="urn:schemas-microsoft-com:office:word" xmlns:w="http://schemas.openxmlformats.org/wordprocessingml/2006/main" xmlns:wne="http://schemas.microsoft.com/office/word/2006/wordml">
-  <w:endnote w:type="separator" w:id="0">
+<w:endnotes xmlns:wpc="http://schemas.microsoft.com/office/word/2010/wordprocessingCanvas" xmlns:mc="http://schemas.openxmlformats.org/markup-compatibility/2006" xmlns:o="urn:schemas-microsoft-com:office:office" xmlns:r="http://schemas.openxmlformats.org/officeDocument/2006/relationships" xmlns:m="http://schemas.openxmlformats.org/officeDocument/2006/math" xmlns:v="urn:schemas-microsoft-com:vml" xmlns:wp14="http://schemas.microsoft.com/office/word/2010/wordprocessingDrawing" xmlns:wp="http://schemas.openxmlformats.org/drawingml/2006/wordprocessingDrawing" xmlns:w10="urn:schemas-microsoft-com:office:word" xmlns:w="http://schemas.openxmlformats.org/wordprocessingml/2006/main" xmlns:w14="http://schemas.microsoft.com/office/word/2010/wordml" xmlns:wpg="http://schemas.microsoft.com/office/word/2010/wordprocessingGroup" xmlns:wpi="http://schemas.microsoft.com/office/word/2010/wordprocessingInk" xmlns:wne="http://schemas.microsoft.com/office/word/2006/wordml" xmlns:wps="http://schemas.microsoft.com/office/word/2010/wordprocessingShape" mc:Ignorable="w14 wp14">
+  <w:endnote w:type="separator" w:id="-1">
     <w:p>
       <w:r>
         <w:separator/>
       </w:r>
     </w:p>
   </w:endnote>
-  <w:endnote w:type="continuationSeparator" w:id="1">
+  <w:endnote w:type="continuationSeparator" w:id="0">
     <w:p>
       <w:r>
         <w:continuationSeparator/>
@@ -2466,7 +3520,7 @@
 </file>
 
 <file path=word/footer1.xml><?xml version="1.0" encoding="utf-8"?>
-<w:ftr xmlns:ve="http://schemas.openxmlformats.org/markup-compatibility/2006" xmlns:o="urn:schemas-microsoft-com:office:office" xmlns:r="http://schemas.openxmlformats.org/officeDocument/2006/relationships" xmlns:m="http://schemas.openxmlformats.org/officeDocument/2006/math" xmlns:v="urn:schemas-microsoft-com:vml" xmlns:wp="http://schemas.openxmlformats.org/drawingml/2006/wordprocessingDrawing" xmlns:w10="urn:schemas-microsoft-com:office:word" xmlns:w="http://schemas.openxmlformats.org/wordprocessingml/2006/main" xmlns:wne="http://schemas.microsoft.com/office/word/2006/wordml">
+<w:ftr xmlns:wpc="http://schemas.microsoft.com/office/word/2010/wordprocessingCanvas" xmlns:mc="http://schemas.openxmlformats.org/markup-compatibility/2006" xmlns:o="urn:schemas-microsoft-com:office:office" xmlns:r="http://schemas.openxmlformats.org/officeDocument/2006/relationships" xmlns:m="http://schemas.openxmlformats.org/officeDocument/2006/math" xmlns:v="urn:schemas-microsoft-com:vml" xmlns:wp14="http://schemas.microsoft.com/office/word/2010/wordprocessingDrawing" xmlns:wp="http://schemas.openxmlformats.org/drawingml/2006/wordprocessingDrawing" xmlns:w10="urn:schemas-microsoft-com:office:word" xmlns:w="http://schemas.openxmlformats.org/wordprocessingml/2006/main" xmlns:w14="http://schemas.microsoft.com/office/word/2010/wordml" xmlns:wpg="http://schemas.microsoft.com/office/word/2010/wordprocessingGroup" xmlns:wpi="http://schemas.microsoft.com/office/word/2010/wordprocessingInk" xmlns:wne="http://schemas.microsoft.com/office/word/2006/wordml" xmlns:wps="http://schemas.microsoft.com/office/word/2010/wordprocessingShape" mc:Ignorable="w14 wp14">
   <w:p>
     <w:pPr>
       <w:pStyle w:val="a9"/>
@@ -2488,15 +3542,15 @@
 </file>
 
 <file path=word/footnotes.xml><?xml version="1.0" encoding="utf-8"?>
-<w:footnotes xmlns:ve="http://schemas.openxmlformats.org/markup-compatibility/2006" xmlns:o="urn:schemas-microsoft-com:office:office" xmlns:r="http://schemas.openxmlformats.org/officeDocument/2006/relationships" xmlns:m="http://schemas.openxmlformats.org/officeDocument/2006/math" xmlns:v="urn:schemas-microsoft-com:vml" xmlns:wp="http://schemas.openxmlformats.org/drawingml/2006/wordprocessingDrawing" xmlns:w10="urn:schemas-microsoft-com:office:word" xmlns:w="http://schemas.openxmlformats.org/wordprocessingml/2006/main" xmlns:wne="http://schemas.microsoft.com/office/word/2006/wordml">
-  <w:footnote w:type="separator" w:id="0">
+<w:footnotes xmlns:wpc="http://schemas.microsoft.com/office/word/2010/wordprocessingCanvas" xmlns:mc="http://schemas.openxmlformats.org/markup-compatibility/2006" xmlns:o="urn:schemas-microsoft-com:office:office" xmlns:r="http://schemas.openxmlformats.org/officeDocument/2006/relationships" xmlns:m="http://schemas.openxmlformats.org/officeDocument/2006/math" xmlns:v="urn:schemas-microsoft-com:vml" xmlns:wp14="http://schemas.microsoft.com/office/word/2010/wordprocessingDrawing" xmlns:wp="http://schemas.openxmlformats.org/drawingml/2006/wordprocessingDrawing" xmlns:w10="urn:schemas-microsoft-com:office:word" xmlns:w="http://schemas.openxmlformats.org/wordprocessingml/2006/main" xmlns:w14="http://schemas.microsoft.com/office/word/2010/wordml" xmlns:wpg="http://schemas.microsoft.com/office/word/2010/wordprocessingGroup" xmlns:wpi="http://schemas.microsoft.com/office/word/2010/wordprocessingInk" xmlns:wne="http://schemas.microsoft.com/office/word/2006/wordml" xmlns:wps="http://schemas.microsoft.com/office/word/2010/wordprocessingShape" mc:Ignorable="w14 wp14">
+  <w:footnote w:type="separator" w:id="-1">
     <w:p>
       <w:r>
         <w:separator/>
       </w:r>
     </w:p>
   </w:footnote>
-  <w:footnote w:type="continuationSeparator" w:id="1">
+  <w:footnote w:type="continuationSeparator" w:id="0">
     <w:p>
       <w:r>
         <w:continuationSeparator/>
@@ -2507,7 +3561,7 @@
 </file>
 
 <file path=word/numbering.xml><?xml version="1.0" encoding="utf-8"?>
-<w:numbering xmlns:ve="http://schemas.openxmlformats.org/markup-compatibility/2006" xmlns:o="urn:schemas-microsoft-com:office:office" xmlns:r="http://schemas.openxmlformats.org/officeDocument/2006/relationships" xmlns:m="http://schemas.openxmlformats.org/officeDocument/2006/math" xmlns:v="urn:schemas-microsoft-com:vml" xmlns:wp="http://schemas.openxmlformats.org/drawingml/2006/wordprocessingDrawing" xmlns:w10="urn:schemas-microsoft-com:office:word" xmlns:w="http://schemas.openxmlformats.org/wordprocessingml/2006/main" xmlns:wne="http://schemas.microsoft.com/office/word/2006/wordml">
+<w:numbering xmlns:wpc="http://schemas.microsoft.com/office/word/2010/wordprocessingCanvas" xmlns:mc="http://schemas.openxmlformats.org/markup-compatibility/2006" xmlns:o="urn:schemas-microsoft-com:office:office" xmlns:r="http://schemas.openxmlformats.org/officeDocument/2006/relationships" xmlns:m="http://schemas.openxmlformats.org/officeDocument/2006/math" xmlns:v="urn:schemas-microsoft-com:vml" xmlns:wp14="http://schemas.microsoft.com/office/word/2010/wordprocessingDrawing" xmlns:wp="http://schemas.openxmlformats.org/drawingml/2006/wordprocessingDrawing" xmlns:w10="urn:schemas-microsoft-com:office:word" xmlns:w="http://schemas.openxmlformats.org/wordprocessingml/2006/main" xmlns:w14="http://schemas.microsoft.com/office/word/2010/wordml" xmlns:wpg="http://schemas.microsoft.com/office/word/2010/wordprocessingGroup" xmlns:wpi="http://schemas.microsoft.com/office/word/2010/wordprocessingInk" xmlns:wne="http://schemas.microsoft.com/office/word/2006/wordml" xmlns:wps="http://schemas.microsoft.com/office/word/2010/wordprocessingShape" mc:Ignorable="w14 wp14">
   <w:abstractNum w:abstractNumId="0">
     <w:nsid w:val="294B543A"/>
     <w:multiLevelType w:val="hybridMultilevel"/>
@@ -2597,331 +3651,198 @@
       </w:pPr>
     </w:lvl>
   </w:abstractNum>
+  <w:abstractNum w:abstractNumId="1">
+    <w:nsid w:val="3E691187"/>
+    <w:multiLevelType w:val="hybridMultilevel"/>
+    <w:tmpl w:val="C5501530"/>
+    <w:lvl w:ilvl="0" w:tplc="B4665A5A">
+      <w:start w:val="7"/>
+      <w:numFmt w:val="decimal"/>
+      <w:lvlText w:val="%1"/>
+      <w:lvlJc w:val="left"/>
+      <w:pPr>
+        <w:ind w:left="862" w:hanging="360"/>
+      </w:pPr>
+      <w:rPr>
+        <w:rFonts w:hint="default"/>
+      </w:rPr>
+    </w:lvl>
+    <w:lvl w:ilvl="1" w:tplc="04190019" w:tentative="1">
+      <w:start w:val="1"/>
+      <w:numFmt w:val="lowerLetter"/>
+      <w:lvlText w:val="%2."/>
+      <w:lvlJc w:val="left"/>
+      <w:pPr>
+        <w:ind w:left="1582" w:hanging="360"/>
+      </w:pPr>
+    </w:lvl>
+    <w:lvl w:ilvl="2" w:tplc="0419001B" w:tentative="1">
+      <w:start w:val="1"/>
+      <w:numFmt w:val="lowerRoman"/>
+      <w:lvlText w:val="%3."/>
+      <w:lvlJc w:val="right"/>
+      <w:pPr>
+        <w:ind w:left="2302" w:hanging="180"/>
+      </w:pPr>
+    </w:lvl>
+    <w:lvl w:ilvl="3" w:tplc="0419000F" w:tentative="1">
+      <w:start w:val="1"/>
+      <w:numFmt w:val="decimal"/>
+      <w:lvlText w:val="%4."/>
+      <w:lvlJc w:val="left"/>
+      <w:pPr>
+        <w:ind w:left="3022" w:hanging="360"/>
+      </w:pPr>
+    </w:lvl>
+    <w:lvl w:ilvl="4" w:tplc="04190019" w:tentative="1">
+      <w:start w:val="1"/>
+      <w:numFmt w:val="lowerLetter"/>
+      <w:lvlText w:val="%5."/>
+      <w:lvlJc w:val="left"/>
+      <w:pPr>
+        <w:ind w:left="3742" w:hanging="360"/>
+      </w:pPr>
+    </w:lvl>
+    <w:lvl w:ilvl="5" w:tplc="0419001B" w:tentative="1">
+      <w:start w:val="1"/>
+      <w:numFmt w:val="lowerRoman"/>
+      <w:lvlText w:val="%6."/>
+      <w:lvlJc w:val="right"/>
+      <w:pPr>
+        <w:ind w:left="4462" w:hanging="180"/>
+      </w:pPr>
+    </w:lvl>
+    <w:lvl w:ilvl="6" w:tplc="0419000F" w:tentative="1">
+      <w:start w:val="1"/>
+      <w:numFmt w:val="decimal"/>
+      <w:lvlText w:val="%7."/>
+      <w:lvlJc w:val="left"/>
+      <w:pPr>
+        <w:ind w:left="5182" w:hanging="360"/>
+      </w:pPr>
+    </w:lvl>
+    <w:lvl w:ilvl="7" w:tplc="04190019" w:tentative="1">
+      <w:start w:val="1"/>
+      <w:numFmt w:val="lowerLetter"/>
+      <w:lvlText w:val="%8."/>
+      <w:lvlJc w:val="left"/>
+      <w:pPr>
+        <w:ind w:left="5902" w:hanging="360"/>
+      </w:pPr>
+    </w:lvl>
+    <w:lvl w:ilvl="8" w:tplc="0419001B" w:tentative="1">
+      <w:start w:val="1"/>
+      <w:numFmt w:val="lowerRoman"/>
+      <w:lvlText w:val="%9."/>
+      <w:lvlJc w:val="right"/>
+      <w:pPr>
+        <w:ind w:left="6622" w:hanging="180"/>
+      </w:pPr>
+    </w:lvl>
+  </w:abstractNum>
+  <w:abstractNum w:abstractNumId="2">
+    <w:nsid w:val="62C5742F"/>
+    <w:multiLevelType w:val="hybridMultilevel"/>
+    <w:tmpl w:val="82F20BD8"/>
+    <w:lvl w:ilvl="0" w:tplc="925A22A6">
+      <w:start w:val="7"/>
+      <w:numFmt w:val="decimal"/>
+      <w:lvlText w:val="%1."/>
+      <w:lvlJc w:val="left"/>
+      <w:pPr>
+        <w:ind w:left="862" w:hanging="360"/>
+      </w:pPr>
+      <w:rPr>
+        <w:rFonts w:hint="default"/>
+      </w:rPr>
+    </w:lvl>
+    <w:lvl w:ilvl="1" w:tplc="04190019" w:tentative="1">
+      <w:start w:val="1"/>
+      <w:numFmt w:val="lowerLetter"/>
+      <w:lvlText w:val="%2."/>
+      <w:lvlJc w:val="left"/>
+      <w:pPr>
+        <w:ind w:left="1582" w:hanging="360"/>
+      </w:pPr>
+    </w:lvl>
+    <w:lvl w:ilvl="2" w:tplc="0419001B" w:tentative="1">
+      <w:start w:val="1"/>
+      <w:numFmt w:val="lowerRoman"/>
+      <w:lvlText w:val="%3."/>
+      <w:lvlJc w:val="right"/>
+      <w:pPr>
+        <w:ind w:left="2302" w:hanging="180"/>
+      </w:pPr>
+    </w:lvl>
+    <w:lvl w:ilvl="3" w:tplc="0419000F" w:tentative="1">
+      <w:start w:val="1"/>
+      <w:numFmt w:val="decimal"/>
+      <w:lvlText w:val="%4."/>
+      <w:lvlJc w:val="left"/>
+      <w:pPr>
+        <w:ind w:left="3022" w:hanging="360"/>
+      </w:pPr>
+    </w:lvl>
+    <w:lvl w:ilvl="4" w:tplc="04190019" w:tentative="1">
+      <w:start w:val="1"/>
+      <w:numFmt w:val="lowerLetter"/>
+      <w:lvlText w:val="%5."/>
+      <w:lvlJc w:val="left"/>
+      <w:pPr>
+        <w:ind w:left="3742" w:hanging="360"/>
+      </w:pPr>
+    </w:lvl>
+    <w:lvl w:ilvl="5" w:tplc="0419001B" w:tentative="1">
+      <w:start w:val="1"/>
+      <w:numFmt w:val="lowerRoman"/>
+      <w:lvlText w:val="%6."/>
+      <w:lvlJc w:val="right"/>
+      <w:pPr>
+        <w:ind w:left="4462" w:hanging="180"/>
+      </w:pPr>
+    </w:lvl>
+    <w:lvl w:ilvl="6" w:tplc="0419000F" w:tentative="1">
+      <w:start w:val="1"/>
+      <w:numFmt w:val="decimal"/>
+      <w:lvlText w:val="%7."/>
+      <w:lvlJc w:val="left"/>
+      <w:pPr>
+        <w:ind w:left="5182" w:hanging="360"/>
+      </w:pPr>
+    </w:lvl>
+    <w:lvl w:ilvl="7" w:tplc="04190019" w:tentative="1">
+      <w:start w:val="1"/>
+      <w:numFmt w:val="lowerLetter"/>
+      <w:lvlText w:val="%8."/>
+      <w:lvlJc w:val="left"/>
+      <w:pPr>
+        <w:ind w:left="5902" w:hanging="360"/>
+      </w:pPr>
+    </w:lvl>
+    <w:lvl w:ilvl="8" w:tplc="0419001B" w:tentative="1">
+      <w:start w:val="1"/>
+      <w:numFmt w:val="lowerRoman"/>
+      <w:lvlText w:val="%9."/>
+      <w:lvlJc w:val="right"/>
+      <w:pPr>
+        <w:ind w:left="6622" w:hanging="180"/>
+      </w:pPr>
+    </w:lvl>
+  </w:abstractNum>
   <w:num w:numId="1">
     <w:abstractNumId w:val="0"/>
+  </w:num>
+  <w:num w:numId="2">
+    <w:abstractNumId w:val="1"/>
+  </w:num>
+  <w:num w:numId="3">
+    <w:abstractNumId w:val="2"/>
   </w:num>
 </w:numbering>
 </file>
 
 <file path=word/styles.xml><?xml version="1.0" encoding="utf-8"?>
-<w:styles xmlns:r="http://schemas.openxmlformats.org/officeDocument/2006/relationships" xmlns:w="http://schemas.openxmlformats.org/wordprocessingml/2006/main">
-  <w:docDefaults>
-    <w:rPrDefault>
-      <w:rPr>
-        <w:rFonts w:ascii="Times New Roman" w:eastAsiaTheme="minorHAnsi" w:hAnsi="Times New Roman" w:cstheme="minorBidi"/>
-        <w:sz w:val="24"/>
-        <w:szCs w:val="22"/>
-        <w:lang w:val="ru-RU" w:eastAsia="en-US" w:bidi="ar-SA"/>
-      </w:rPr>
-    </w:rPrDefault>
-    <w:pPrDefault>
-      <w:pPr>
-        <w:spacing w:after="200" w:line="276" w:lineRule="auto"/>
-      </w:pPr>
-    </w:pPrDefault>
-  </w:docDefaults>
-  <w:latentStyles w:defLockedState="0" w:defUIPriority="99" w:defSemiHidden="1" w:defUnhideWhenUsed="1" w:defQFormat="0" w:count="267">
-    <w:lsdException w:name="Normal" w:semiHidden="0" w:uiPriority="0" w:unhideWhenUsed="0" w:qFormat="1"/>
-    <w:lsdException w:name="heading 1" w:semiHidden="0" w:uiPriority="9" w:unhideWhenUsed="0" w:qFormat="1"/>
-    <w:lsdException w:name="heading 2" w:uiPriority="9" w:qFormat="1"/>
-    <w:lsdException w:name="heading 3" w:uiPriority="9" w:qFormat="1"/>
-    <w:lsdException w:name="heading 4" w:uiPriority="9" w:qFormat="1"/>
-    <w:lsdException w:name="heading 5" w:uiPriority="9" w:qFormat="1"/>
-    <w:lsdException w:name="heading 6" w:uiPriority="9" w:qFormat="1"/>
-    <w:lsdException w:name="heading 7" w:uiPriority="9" w:qFormat="1"/>
-    <w:lsdException w:name="heading 8" w:uiPriority="9" w:qFormat="1"/>
-    <w:lsdException w:name="heading 9" w:uiPriority="9" w:qFormat="1"/>
-    <w:lsdException w:name="toc 1" w:uiPriority="39"/>
-    <w:lsdException w:name="toc 2" w:uiPriority="39"/>
-    <w:lsdException w:name="toc 3" w:uiPriority="39"/>
-    <w:lsdException w:name="toc 4" w:uiPriority="39"/>
-    <w:lsdException w:name="toc 5" w:uiPriority="39"/>
-    <w:lsdException w:name="toc 6" w:uiPriority="39"/>
-    <w:lsdException w:name="toc 7" w:uiPriority="39"/>
-    <w:lsdException w:name="toc 8" w:uiPriority="39"/>
-    <w:lsdException w:name="toc 9" w:uiPriority="39"/>
-    <w:lsdException w:name="caption" w:uiPriority="35" w:qFormat="1"/>
-    <w:lsdException w:name="Title" w:semiHidden="0" w:uiPriority="10" w:unhideWhenUsed="0" w:qFormat="1"/>
-    <w:lsdException w:name="Default Paragraph Font" w:uiPriority="1"/>
-    <w:lsdException w:name="Subtitle" w:semiHidden="0" w:uiPriority="11" w:unhideWhenUsed="0" w:qFormat="1"/>
-    <w:lsdException w:name="Strong" w:semiHidden="0" w:uiPriority="22" w:unhideWhenUsed="0" w:qFormat="1"/>
-    <w:lsdException w:name="Emphasis" w:semiHidden="0" w:uiPriority="20" w:unhideWhenUsed="0" w:qFormat="1"/>
-    <w:lsdException w:name="Table Grid" w:uiPriority="59"/>
-    <w:lsdException w:name="Placeholder Text" w:unhideWhenUsed="0"/>
-    <w:lsdException w:name="No Spacing" w:semiHidden="0" w:uiPriority="1" w:unhideWhenUsed="0" w:qFormat="1"/>
-    <w:lsdException w:name="Light Shading" w:semiHidden="0" w:uiPriority="60" w:unhideWhenUsed="0"/>
-    <w:lsdException w:name="Light List" w:semiHidden="0" w:uiPriority="61" w:unhideWhenUsed="0"/>
-    <w:lsdException w:name="Light Grid" w:semiHidden="0" w:uiPriority="62" w:unhideWhenUsed="0"/>
-    <w:lsdException w:name="Medium Shading 1" w:semiHidden="0" w:uiPriority="63" w:unhideWhenUsed="0"/>
-    <w:lsdException w:name="Medium Shading 2" w:semiHidden="0" w:uiPriority="64" w:unhideWhenUsed="0"/>
-    <w:lsdException w:name="Medium List 1" w:semiHidden="0" w:uiPriority="65" w:unhideWhenUsed="0"/>
-    <w:lsdException w:name="Medium List 2" w:semiHidden="0" w:uiPriority="66" w:unhideWhenUsed="0"/>
-    <w:lsdException w:name="Medium Grid 1" w:semiHidden="0" w:uiPriority="67" w:unhideWhenUsed="0"/>
-    <w:lsdException w:name="Medium Grid 2" w:semiHidden="0" w:uiPriority="68" w:unhideWhenUsed="0"/>
-    <w:lsdException w:name="Medium Grid 3" w:semiHidden="0" w:uiPriority="69" w:unhideWhenUsed="0"/>
-    <w:lsdException w:name="Dark List" w:semiHidden="0" w:uiPriority="70" w:unhideWhenUsed="0"/>
-    <w:lsdException w:name="Colorful Shading" w:semiHidden="0" w:uiPriority="71" w:unhideWhenUsed="0"/>
-    <w:lsdException w:name="Colorful List" w:semiHidden="0" w:uiPriority="72" w:unhideWhenUsed="0"/>
-    <w:lsdException w:name="Colorful Grid" w:semiHidden="0" w:uiPriority="73" w:unhideWhenUsed="0"/>
-    <w:lsdException w:name="Light Shading Accent 1" w:semiHidden="0" w:uiPriority="60" w:unhideWhenUsed="0"/>
-    <w:lsdException w:name="Light List Accent 1" w:semiHidden="0" w:uiPriority="61" w:unhideWhenUsed="0"/>
-    <w:lsdException w:name="Light Grid Accent 1" w:semiHidden="0" w:uiPriority="62" w:unhideWhenUsed="0"/>
-    <w:lsdException w:name="Medium Shading 1 Accent 1" w:semiHidden="0" w:uiPriority="63" w:unhideWhenUsed="0"/>
-    <w:lsdException w:name="Medium Shading 2 Accent 1" w:semiHidden="0" w:uiPriority="64" w:unhideWhenUsed="0"/>
-    <w:lsdException w:name="Medium List 1 Accent 1" w:semiHidden="0" w:uiPriority="65" w:unhideWhenUsed="0"/>
-    <w:lsdException w:name="Revision" w:unhideWhenUsed="0"/>
-    <w:lsdException w:name="List Paragraph" w:semiHidden="0" w:uiPriority="34" w:unhideWhenUsed="0" w:qFormat="1"/>
-    <w:lsdException w:name="Quote" w:semiHidden="0" w:uiPriority="29" w:unhideWhenUsed="0" w:qFormat="1"/>
-    <w:lsdException w:name="Intense Quote" w:semiHidden="0" w:uiPriority="30" w:unhideWhenUsed="0" w:qFormat="1"/>
-    <w:lsdException w:name="Medium List 2 Accent 1" w:semiHidden="0" w:uiPriority="66" w:unhideWhenUsed="0"/>
-    <w:lsdException w:name="Medium Grid 1 Accent 1" w:semiHidden="0" w:uiPriority="67" w:unhideWhenUsed="0"/>
-    <w:lsdException w:name="Medium Grid 2 Accent 1" w:semiHidden="0" w:uiPriority="68" w:unhideWhenUsed="0"/>
-    <w:lsdException w:name="Medium Grid 3 Accent 1" w:semiHidden="0" w:uiPriority="69" w:unhideWhenUsed="0"/>
-    <w:lsdException w:name="Dark List Accent 1" w:semiHidden="0" w:uiPriority="70" w:unhideWhenUsed="0"/>
-    <w:lsdException w:name="Colorful Shading Accent 1" w:semiHidden="0" w:uiPriority="71" w:unhideWhenUsed="0"/>
-    <w:lsdException w:name="Colorful List Accent 1" w:semiHidden="0" w:uiPriority="72" w:unhideWhenUsed="0"/>
-    <w:lsdException w:name="Colorful Grid Accent 1" w:semiHidden="0" w:uiPriority="73" w:unhideWhenUsed="0"/>
-    <w:lsdException w:name="Light Shading Accent 2" w:semiHidden="0" w:uiPriority="60" w:unhideWhenUsed="0"/>
-    <w:lsdException w:name="Light List Accent 2" w:semiHidden="0" w:uiPriority="61" w:unhideWhenUsed="0"/>
-    <w:lsdException w:name="Light Grid Accent 2" w:semiHidden="0" w:uiPriority="62" w:unhideWhenUsed="0"/>
-    <w:lsdException w:name="Medium Shading 1 Accent 2" w:semiHidden="0" w:uiPriority="63" w:unhideWhenUsed="0"/>
-    <w:lsdException w:name="Medium Shading 2 Accent 2" w:semiHidden="0" w:uiPriority="64" w:unhideWhenUsed="0"/>
-    <w:lsdException w:name="Medium List 1 Accent 2" w:semiHidden="0" w:uiPriority="65" w:unhideWhenUsed="0"/>
-    <w:lsdException w:name="Medium List 2 Accent 2" w:semiHidden="0" w:uiPriority="66" w:unhideWhenUsed="0"/>
-    <w:lsdException w:name="Medium Grid 1 Accent 2" w:semiHidden="0" w:uiPriority="67" w:unhideWhenUsed="0"/>
-    <w:lsdException w:name="Medium Grid 2 Accent 2" w:semiHidden="0" w:uiPriority="68" w:unhideWhenUsed="0"/>
-    <w:lsdException w:name="Medium Grid 3 Accent 2" w:semiHidden="0" w:uiPriority="69" w:unhideWhenUsed="0"/>
-    <w:lsdException w:name="Dark List Accent 2" w:semiHidden="0" w:uiPriority="70" w:unhideWhenUsed="0"/>
-    <w:lsdException w:name="Colorful Shading Accent 2" w:semiHidden="0" w:uiPriority="71" w:unhideWhenUsed="0"/>
-    <w:lsdException w:name="Colorful List Accent 2" w:semiHidden="0" w:uiPriority="72" w:unhideWhenUsed="0"/>
-    <w:lsdException w:name="Colorful Grid Accent 2" w:semiHidden="0" w:uiPriority="73" w:unhideWhenUsed="0"/>
-    <w:lsdException w:name="Light Shading Accent 3" w:semiHidden="0" w:uiPriority="60" w:unhideWhenUsed="0"/>
-    <w:lsdException w:name="Light List Accent 3" w:semiHidden="0" w:uiPriority="61" w:unhideWhenUsed="0"/>
-    <w:lsdException w:name="Light Grid Accent 3" w:semiHidden="0" w:uiPriority="62" w:unhideWhenUsed="0"/>
-    <w:lsdException w:name="Medium Shading 1 Accent 3" w:semiHidden="0" w:uiPriority="63" w:unhideWhenUsed="0"/>
-    <w:lsdException w:name="Medium Shading 2 Accent 3" w:semiHidden="0" w:uiPriority="64" w:unhideWhenUsed="0"/>
-    <w:lsdException w:name="Medium List 1 Accent 3" w:semiHidden="0" w:uiPriority="65" w:unhideWhenUsed="0"/>
-    <w:lsdException w:name="Medium List 2 Accent 3" w:semiHidden="0" w:uiPriority="66" w:unhideWhenUsed="0"/>
-    <w:lsdException w:name="Medium Grid 1 Accent 3" w:semiHidden="0" w:uiPriority="67" w:unhideWhenUsed="0"/>
-    <w:lsdException w:name="Medium Grid 2 Accent 3" w:semiHidden="0" w:uiPriority="68" w:unhideWhenUsed="0"/>
-    <w:lsdException w:name="Medium Grid 3 Accent 3" w:semiHidden="0" w:uiPriority="69" w:unhideWhenUsed="0"/>
-    <w:lsdException w:name="Dark List Accent 3" w:semiHidden="0" w:uiPriority="70" w:unhideWhenUsed="0"/>
-    <w:lsdException w:name="Colorful Shading Accent 3" w:semiHidden="0" w:uiPriority="71" w:unhideWhenUsed="0"/>
-    <w:lsdException w:name="Colorful List Accent 3" w:semiHidden="0" w:uiPriority="72" w:unhideWhenUsed="0"/>
-    <w:lsdException w:name="Colorful Grid Accent 3" w:semiHidden="0" w:uiPriority="73" w:unhideWhenUsed="0"/>
-    <w:lsdException w:name="Light Shading Accent 4" w:semiHidden="0" w:uiPriority="60" w:unhideWhenUsed="0"/>
-    <w:lsdException w:name="Light List Accent 4" w:semiHidden="0" w:uiPriority="61" w:unhideWhenUsed="0"/>
-    <w:lsdException w:name="Light Grid Accent 4" w:semiHidden="0" w:uiPriority="62" w:unhideWhenUsed="0"/>
-    <w:lsdException w:name="Medium Shading 1 Accent 4" w:semiHidden="0" w:uiPriority="63" w:unhideWhenUsed="0"/>
-    <w:lsdException w:name="Medium Shading 2 Accent 4" w:semiHidden="0" w:uiPriority="64" w:unhideWhenUsed="0"/>
-    <w:lsdException w:name="Medium List 1 Accent 4" w:semiHidden="0" w:uiPriority="65" w:unhideWhenUsed="0"/>
-    <w:lsdException w:name="Medium List 2 Accent 4" w:semiHidden="0" w:uiPriority="66" w:unhideWhenUsed="0"/>
-    <w:lsdException w:name="Medium Grid 1 Accent 4" w:semiHidden="0" w:uiPriority="67" w:unhideWhenUsed="0"/>
-    <w:lsdException w:name="Medium Grid 2 Accent 4" w:semiHidden="0" w:uiPriority="68" w:unhideWhenUsed="0"/>
-    <w:lsdException w:name="Medium Grid 3 Accent 4" w:semiHidden="0" w:uiPriority="69" w:unhideWhenUsed="0"/>
-    <w:lsdException w:name="Dark List Accent 4" w:semiHidden="0" w:uiPriority="70" w:unhideWhenUsed="0"/>
-    <w:lsdException w:name="Colorful Shading Accent 4" w:semiHidden="0" w:uiPriority="71" w:unhideWhenUsed="0"/>
-    <w:lsdException w:name="Colorful List Accent 4" w:semiHidden="0" w:uiPriority="72" w:unhideWhenUsed="0"/>
-    <w:lsdException w:name="Colorful Grid Accent 4" w:semiHidden="0" w:uiPriority="73" w:unhideWhenUsed="0"/>
-    <w:lsdException w:name="Light Shading Accent 5" w:semiHidden="0" w:uiPriority="60" w:unhideWhenUsed="0"/>
-    <w:lsdException w:name="Light List Accent 5" w:semiHidden="0" w:uiPriority="61" w:unhideWhenUsed="0"/>
-    <w:lsdException w:name="Light Grid Accent 5" w:semiHidden="0" w:uiPriority="62" w:unhideWhenUsed="0"/>
-    <w:lsdException w:name="Medium Shading 1 Accent 5" w:semiHidden="0" w:uiPriority="63" w:unhideWhenUsed="0"/>
-    <w:lsdException w:name="Medium Shading 2 Accent 5" w:semiHidden="0" w:uiPriority="64" w:unhideWhenUsed="0"/>
-    <w:lsdException w:name="Medium List 1 Accent 5" w:semiHidden="0" w:uiPriority="65" w:unhideWhenUsed="0"/>
-    <w:lsdException w:name="Medium List 2 Accent 5" w:semiHidden="0" w:uiPriority="66" w:unhideWhenUsed="0"/>
-    <w:lsdException w:name="Medium Grid 1 Accent 5" w:semiHidden="0" w:uiPriority="67" w:unhideWhenUsed="0"/>
-    <w:lsdException w:name="Medium Grid 2 Accent 5" w:semiHidden="0" w:uiPriority="68" w:unhideWhenUsed="0"/>
-    <w:lsdException w:name="Medium Grid 3 Accent 5" w:semiHidden="0" w:uiPriority="69" w:unhideWhenUsed="0"/>
-    <w:lsdException w:name="Dark List Accent 5" w:semiHidden="0" w:uiPriority="70" w:unhideWhenUsed="0"/>
-    <w:lsdException w:name="Colorful Shading Accent 5" w:semiHidden="0" w:uiPriority="71" w:unhideWhenUsed="0"/>
-    <w:lsdException w:name="Colorful List Accent 5" w:semiHidden="0" w:uiPriority="72" w:unhideWhenUsed="0"/>
-    <w:lsdException w:name="Colorful Grid Accent 5" w:semiHidden="0" w:uiPriority="73" w:unhideWhenUsed="0"/>
-    <w:lsdException w:name="Light Shading Accent 6" w:semiHidden="0" w:uiPriority="60" w:unhideWhenUsed="0"/>
-    <w:lsdException w:name="Light List Accent 6" w:semiHidden="0" w:uiPriority="61" w:unhideWhenUsed="0"/>
-    <w:lsdException w:name="Light Grid Accent 6" w:semiHidden="0" w:uiPriority="62" w:unhideWhenUsed="0"/>
-    <w:lsdException w:name="Medium Shading 1 Accent 6" w:semiHidden="0" w:uiPriority="63" w:unhideWhenUsed="0"/>
-    <w:lsdException w:name="Medium Shading 2 Accent 6" w:semiHidden="0" w:uiPriority="64" w:unhideWhenUsed="0"/>
-    <w:lsdException w:name="Medium List 1 Accent 6" w:semiHidden="0" w:uiPriority="65" w:unhideWhenUsed="0"/>
-    <w:lsdException w:name="Medium List 2 Accent 6" w:semiHidden="0" w:uiPriority="66" w:unhideWhenUsed="0"/>
-    <w:lsdException w:name="Medium Grid 1 Accent 6" w:semiHidden="0" w:uiPriority="67" w:unhideWhenUsed="0"/>
-    <w:lsdException w:name="Medium Grid 2 Accent 6" w:semiHidden="0" w:uiPriority="68" w:unhideWhenUsed="0"/>
-    <w:lsdException w:name="Medium Grid 3 Accent 6" w:semiHidden="0" w:uiPriority="69" w:unhideWhenUsed="0"/>
-    <w:lsdException w:name="Dark List Accent 6" w:semiHidden="0" w:uiPriority="70" w:unhideWhenUsed="0"/>
-    <w:lsdException w:name="Colorful Shading Accent 6" w:semiHidden="0" w:uiPriority="71" w:unhideWhenUsed="0"/>
-    <w:lsdException w:name="Colorful List Accent 6" w:semiHidden="0" w:uiPriority="72" w:unhideWhenUsed="0"/>
-    <w:lsdException w:name="Colorful Grid Accent 6" w:semiHidden="0" w:uiPriority="73" w:unhideWhenUsed="0"/>
-    <w:lsdException w:name="Subtle Emphasis" w:semiHidden="0" w:uiPriority="19" w:unhideWhenUsed="0" w:qFormat="1"/>
-    <w:lsdException w:name="Intense Emphasis" w:semiHidden="0" w:uiPriority="21" w:unhideWhenUsed="0" w:qFormat="1"/>
-    <w:lsdException w:name="Subtle Reference" w:semiHidden="0" w:uiPriority="31" w:unhideWhenUsed="0" w:qFormat="1"/>
-    <w:lsdException w:name="Intense Reference" w:semiHidden="0" w:uiPriority="32" w:unhideWhenUsed="0" w:qFormat="1"/>
-    <w:lsdException w:name="Book Title" w:semiHidden="0" w:uiPriority="33" w:unhideWhenUsed="0" w:qFormat="1"/>
-    <w:lsdException w:name="Bibliography" w:uiPriority="37"/>
-    <w:lsdException w:name="TOC Heading" w:uiPriority="39" w:qFormat="1"/>
-  </w:latentStyles>
-  <w:style w:type="paragraph" w:default="1" w:styleId="a">
-    <w:name w:val="Normal"/>
-    <w:qFormat/>
-    <w:rsid w:val="008E6CCB"/>
-    <w:pPr>
-      <w:spacing w:after="0" w:line="240" w:lineRule="auto"/>
-    </w:pPr>
-    <w:rPr>
-      <w:rFonts w:eastAsia="Times New Roman" w:cs="Times New Roman"/>
-      <w:szCs w:val="24"/>
-      <w:lang w:eastAsia="ru-RU"/>
-    </w:rPr>
-  </w:style>
-  <w:style w:type="character" w:default="1" w:styleId="a0">
-    <w:name w:val="Default Paragraph Font"/>
-    <w:uiPriority w:val="1"/>
-    <w:semiHidden/>
-    <w:unhideWhenUsed/>
-  </w:style>
-  <w:style w:type="table" w:default="1" w:styleId="a1">
-    <w:name w:val="Normal Table"/>
-    <w:uiPriority w:val="99"/>
-    <w:semiHidden/>
-    <w:unhideWhenUsed/>
-    <w:qFormat/>
-    <w:tblPr>
-      <w:tblInd w:w="0" w:type="dxa"/>
-      <w:tblCellMar>
-        <w:top w:w="0" w:type="dxa"/>
-        <w:left w:w="108" w:type="dxa"/>
-        <w:bottom w:w="0" w:type="dxa"/>
-        <w:right w:w="108" w:type="dxa"/>
-      </w:tblCellMar>
-    </w:tblPr>
-  </w:style>
-  <w:style w:type="numbering" w:default="1" w:styleId="a2">
-    <w:name w:val="No List"/>
-    <w:uiPriority w:val="99"/>
-    <w:semiHidden/>
-    <w:unhideWhenUsed/>
-  </w:style>
-  <w:style w:type="paragraph" w:styleId="a3">
-    <w:name w:val="List Paragraph"/>
-    <w:basedOn w:val="a"/>
-    <w:uiPriority w:val="34"/>
-    <w:qFormat/>
-    <w:rsid w:val="008E6CCB"/>
-    <w:pPr>
-      <w:ind w:left="720"/>
-      <w:contextualSpacing/>
-    </w:pPr>
-  </w:style>
-  <w:style w:type="paragraph" w:styleId="a4">
-    <w:name w:val="Balloon Text"/>
-    <w:basedOn w:val="a"/>
-    <w:link w:val="a5"/>
-    <w:uiPriority w:val="99"/>
-    <w:semiHidden/>
-    <w:unhideWhenUsed/>
-    <w:rsid w:val="008865E1"/>
-    <w:rPr>
-      <w:rFonts w:ascii="Tahoma" w:hAnsi="Tahoma" w:cs="Tahoma"/>
-      <w:sz w:val="16"/>
-      <w:szCs w:val="16"/>
-    </w:rPr>
-  </w:style>
-  <w:style w:type="character" w:customStyle="1" w:styleId="a5">
-    <w:name w:val="Текст выноски Знак"/>
-    <w:basedOn w:val="a0"/>
-    <w:link w:val="a4"/>
-    <w:uiPriority w:val="99"/>
-    <w:semiHidden/>
-    <w:rsid w:val="008865E1"/>
-    <w:rPr>
-      <w:rFonts w:ascii="Tahoma" w:eastAsia="Times New Roman" w:hAnsi="Tahoma" w:cs="Tahoma"/>
-      <w:sz w:val="16"/>
-      <w:szCs w:val="16"/>
-      <w:lang w:eastAsia="ru-RU"/>
-    </w:rPr>
-  </w:style>
-  <w:style w:type="table" w:styleId="a6">
-    <w:name w:val="Table Grid"/>
-    <w:basedOn w:val="a1"/>
-    <w:uiPriority w:val="59"/>
-    <w:rsid w:val="009F4A33"/>
-    <w:pPr>
-      <w:spacing w:after="0" w:line="240" w:lineRule="auto"/>
-    </w:pPr>
-    <w:tblPr>
-      <w:tblInd w:w="0" w:type="dxa"/>
-      <w:tblBorders>
-        <w:top w:val="single" w:sz="4" w:space="0" w:color="000000" w:themeColor="text1"/>
-        <w:left w:val="single" w:sz="4" w:space="0" w:color="000000" w:themeColor="text1"/>
-        <w:bottom w:val="single" w:sz="4" w:space="0" w:color="000000" w:themeColor="text1"/>
-        <w:right w:val="single" w:sz="4" w:space="0" w:color="000000" w:themeColor="text1"/>
-        <w:insideH w:val="single" w:sz="4" w:space="0" w:color="000000" w:themeColor="text1"/>
-        <w:insideV w:val="single" w:sz="4" w:space="0" w:color="000000" w:themeColor="text1"/>
-      </w:tblBorders>
-      <w:tblCellMar>
-        <w:top w:w="0" w:type="dxa"/>
-        <w:left w:w="108" w:type="dxa"/>
-        <w:bottom w:w="0" w:type="dxa"/>
-        <w:right w:w="108" w:type="dxa"/>
-      </w:tblCellMar>
-    </w:tblPr>
-  </w:style>
-  <w:style w:type="paragraph" w:styleId="a7">
-    <w:name w:val="header"/>
-    <w:basedOn w:val="a"/>
-    <w:link w:val="a8"/>
-    <w:uiPriority w:val="99"/>
-    <w:unhideWhenUsed/>
-    <w:rsid w:val="002442E2"/>
-    <w:pPr>
-      <w:tabs>
-        <w:tab w:val="center" w:pos="4677"/>
-        <w:tab w:val="right" w:pos="9355"/>
-      </w:tabs>
-    </w:pPr>
-  </w:style>
-  <w:style w:type="character" w:customStyle="1" w:styleId="a8">
-    <w:name w:val="Верхний колонтитул Знак"/>
-    <w:basedOn w:val="a0"/>
-    <w:link w:val="a7"/>
-    <w:uiPriority w:val="99"/>
-    <w:rsid w:val="002442E2"/>
-    <w:rPr>
-      <w:rFonts w:eastAsia="Times New Roman" w:cs="Times New Roman"/>
-      <w:szCs w:val="24"/>
-      <w:lang w:eastAsia="ru-RU"/>
-    </w:rPr>
-  </w:style>
-  <w:style w:type="paragraph" w:styleId="a9">
-    <w:name w:val="footer"/>
-    <w:basedOn w:val="a"/>
-    <w:link w:val="aa"/>
-    <w:uiPriority w:val="99"/>
-    <w:unhideWhenUsed/>
-    <w:rsid w:val="002442E2"/>
-    <w:pPr>
-      <w:tabs>
-        <w:tab w:val="center" w:pos="4677"/>
-        <w:tab w:val="right" w:pos="9355"/>
-      </w:tabs>
-    </w:pPr>
-  </w:style>
-  <w:style w:type="character" w:customStyle="1" w:styleId="aa">
-    <w:name w:val="Нижний колонтитул Знак"/>
-    <w:basedOn w:val="a0"/>
-    <w:link w:val="a9"/>
-    <w:uiPriority w:val="99"/>
-    <w:rsid w:val="002442E2"/>
-    <w:rPr>
-      <w:rFonts w:eastAsia="Times New Roman" w:cs="Times New Roman"/>
-      <w:szCs w:val="24"/>
-      <w:lang w:eastAsia="ru-RU"/>
-    </w:rPr>
-  </w:style>
-</w:styles>
-</file>
-
-<file path=word/stylesWithEffects.xml><?xml version="1.0" encoding="utf-8"?>
-<w:styles xmlns:wpc="http://schemas.microsoft.com/office/word/2010/wordprocessingCanvas" xmlns:mc="http://schemas.openxmlformats.org/markup-compatibility/2006" xmlns:o="urn:schemas-microsoft-com:office:office" xmlns:r="http://schemas.openxmlformats.org/officeDocument/2006/relationships" xmlns:m="http://schemas.openxmlformats.org/officeDocument/2006/math" xmlns:v="urn:schemas-microsoft-com:vml" xmlns:wp14="http://schemas.microsoft.com/office/word/2010/wordprocessingDrawing" xmlns:wp="http://schemas.openxmlformats.org/drawingml/2006/wordprocessingDrawing" xmlns:w10="urn:schemas-microsoft-com:office:word" xmlns:w="http://schemas.openxmlformats.org/wordprocessingml/2006/main" xmlns:w14="http://schemas.microsoft.com/office/word/2010/wordml" xmlns:wpg="http://schemas.microsoft.com/office/word/2010/wordprocessingGroup" xmlns:wpi="http://schemas.microsoft.com/office/word/2010/wordprocessingInk" xmlns:wne="http://schemas.microsoft.com/office/word/2006/wordml" xmlns:wps="http://schemas.microsoft.com/office/word/2010/wordprocessingShape" mc:Ignorable="w14 wp14">
+<w:styles xmlns:mc="http://schemas.openxmlformats.org/markup-compatibility/2006" xmlns:r="http://schemas.openxmlformats.org/officeDocument/2006/relationships" xmlns:w="http://schemas.openxmlformats.org/wordprocessingml/2006/main" xmlns:w14="http://schemas.microsoft.com/office/word/2010/wordml" mc:Ignorable="w14">
   <w:docDefaults>
     <w:rPrDefault>
       <w:rPr>
@@ -3164,7 +4085,6 @@
       <w:spacing w:after="0" w:line="240" w:lineRule="auto"/>
     </w:pPr>
     <w:tblPr>
-      <w:tblInd w:w="0" w:type="dxa"/>
       <w:tblBorders>
         <w:top w:val="single" w:sz="4" w:space="0" w:color="000000" w:themeColor="text1"/>
         <w:left w:val="single" w:sz="4" w:space="0" w:color="000000" w:themeColor="text1"/>
@@ -3173,12 +4093,6 @@
         <w:insideH w:val="single" w:sz="4" w:space="0" w:color="000000" w:themeColor="text1"/>
         <w:insideV w:val="single" w:sz="4" w:space="0" w:color="000000" w:themeColor="text1"/>
       </w:tblBorders>
-      <w:tblCellMar>
-        <w:top w:w="0" w:type="dxa"/>
-        <w:left w:w="108" w:type="dxa"/>
-        <w:bottom w:w="0" w:type="dxa"/>
-        <w:right w:w="108" w:type="dxa"/>
-      </w:tblCellMar>
     </w:tblPr>
   </w:style>
   <w:style w:type="paragraph" w:styleId="a7">
@@ -3233,7 +4147,1034 @@
       <w:lang w:eastAsia="ru-RU"/>
     </w:rPr>
   </w:style>
+  <w:style w:type="character" w:styleId="ab">
+    <w:name w:val="Placeholder Text"/>
+    <w:basedOn w:val="a0"/>
+    <w:uiPriority w:val="99"/>
+    <w:semiHidden/>
+    <w:rsid w:val="00D64E43"/>
+    <w:rPr>
+      <w:color w:val="808080"/>
+    </w:rPr>
+  </w:style>
 </w:styles>
+</file>
+
+<file path=word/stylesWithEffects.xml><?xml version="1.0" encoding="utf-8"?>
+<w:styles xmlns:wpc="http://schemas.microsoft.com/office/word/2010/wordprocessingCanvas" xmlns:mc="http://schemas.openxmlformats.org/markup-compatibility/2006" xmlns:o="urn:schemas-microsoft-com:office:office" xmlns:r="http://schemas.openxmlformats.org/officeDocument/2006/relationships" xmlns:m="http://schemas.openxmlformats.org/officeDocument/2006/math" xmlns:v="urn:schemas-microsoft-com:vml" xmlns:wp14="http://schemas.microsoft.com/office/word/2010/wordprocessingDrawing" xmlns:wp="http://schemas.openxmlformats.org/drawingml/2006/wordprocessingDrawing" xmlns:w10="urn:schemas-microsoft-com:office:word" xmlns:w="http://schemas.openxmlformats.org/wordprocessingml/2006/main" xmlns:w14="http://schemas.microsoft.com/office/word/2010/wordml" xmlns:wpg="http://schemas.microsoft.com/office/word/2010/wordprocessingGroup" xmlns:wpi="http://schemas.microsoft.com/office/word/2010/wordprocessingInk" xmlns:wne="http://schemas.microsoft.com/office/word/2006/wordml" xmlns:wps="http://schemas.microsoft.com/office/word/2010/wordprocessingShape" mc:Ignorable="w14 wp14">
+  <w:docDefaults>
+    <w:rPrDefault>
+      <w:rPr>
+        <w:rFonts w:ascii="Times New Roman" w:eastAsiaTheme="minorHAnsi" w:hAnsi="Times New Roman" w:cstheme="minorBidi"/>
+        <w:sz w:val="24"/>
+        <w:szCs w:val="22"/>
+        <w:lang w:val="ru-RU" w:eastAsia="en-US" w:bidi="ar-SA"/>
+      </w:rPr>
+    </w:rPrDefault>
+    <w:pPrDefault>
+      <w:pPr>
+        <w:spacing w:after="200" w:line="276" w:lineRule="auto"/>
+      </w:pPr>
+    </w:pPrDefault>
+  </w:docDefaults>
+  <w:latentStyles w:defLockedState="0" w:defUIPriority="99" w:defSemiHidden="1" w:defUnhideWhenUsed="1" w:defQFormat="0" w:count="267">
+    <w:lsdException w:name="Normal" w:semiHidden="0" w:uiPriority="0" w:unhideWhenUsed="0" w:qFormat="1"/>
+    <w:lsdException w:name="heading 1" w:semiHidden="0" w:uiPriority="9" w:unhideWhenUsed="0" w:qFormat="1"/>
+    <w:lsdException w:name="heading 2" w:uiPriority="9" w:qFormat="1"/>
+    <w:lsdException w:name="heading 3" w:uiPriority="9" w:qFormat="1"/>
+    <w:lsdException w:name="heading 4" w:uiPriority="9" w:qFormat="1"/>
+    <w:lsdException w:name="heading 5" w:uiPriority="9" w:qFormat="1"/>
+    <w:lsdException w:name="heading 6" w:uiPriority="9" w:qFormat="1"/>
+    <w:lsdException w:name="heading 7" w:uiPriority="9" w:qFormat="1"/>
+    <w:lsdException w:name="heading 8" w:uiPriority="9" w:qFormat="1"/>
+    <w:lsdException w:name="heading 9" w:uiPriority="9" w:qFormat="1"/>
+    <w:lsdException w:name="toc 1" w:uiPriority="39"/>
+    <w:lsdException w:name="toc 2" w:uiPriority="39"/>
+    <w:lsdException w:name="toc 3" w:uiPriority="39"/>
+    <w:lsdException w:name="toc 4" w:uiPriority="39"/>
+    <w:lsdException w:name="toc 5" w:uiPriority="39"/>
+    <w:lsdException w:name="toc 6" w:uiPriority="39"/>
+    <w:lsdException w:name="toc 7" w:uiPriority="39"/>
+    <w:lsdException w:name="toc 8" w:uiPriority="39"/>
+    <w:lsdException w:name="toc 9" w:uiPriority="39"/>
+    <w:lsdException w:name="caption" w:uiPriority="35" w:qFormat="1"/>
+    <w:lsdException w:name="Title" w:semiHidden="0" w:uiPriority="10" w:unhideWhenUsed="0" w:qFormat="1"/>
+    <w:lsdException w:name="Default Paragraph Font" w:uiPriority="1"/>
+    <w:lsdException w:name="Subtitle" w:semiHidden="0" w:uiPriority="11" w:unhideWhenUsed="0" w:qFormat="1"/>
+    <w:lsdException w:name="Strong" w:semiHidden="0" w:uiPriority="22" w:unhideWhenUsed="0" w:qFormat="1"/>
+    <w:lsdException w:name="Emphasis" w:semiHidden="0" w:uiPriority="20" w:unhideWhenUsed="0" w:qFormat="1"/>
+    <w:lsdException w:name="Table Grid" w:uiPriority="59"/>
+    <w:lsdException w:name="Placeholder Text" w:unhideWhenUsed="0"/>
+    <w:lsdException w:name="No Spacing" w:semiHidden="0" w:uiPriority="1" w:unhideWhenUsed="0" w:qFormat="1"/>
+    <w:lsdException w:name="Light Shading" w:semiHidden="0" w:uiPriority="60" w:unhideWhenUsed="0"/>
+    <w:lsdException w:name="Light List" w:semiHidden="0" w:uiPriority="61" w:unhideWhenUsed="0"/>
+    <w:lsdException w:name="Light Grid" w:semiHidden="0" w:uiPriority="62" w:unhideWhenUsed="0"/>
+    <w:lsdException w:name="Medium Shading 1" w:semiHidden="0" w:uiPriority="63" w:unhideWhenUsed="0"/>
+    <w:lsdException w:name="Medium Shading 2" w:semiHidden="0" w:uiPriority="64" w:unhideWhenUsed="0"/>
+    <w:lsdException w:name="Medium List 1" w:semiHidden="0" w:uiPriority="65" w:unhideWhenUsed="0"/>
+    <w:lsdException w:name="Medium List 2" w:semiHidden="0" w:uiPriority="66" w:unhideWhenUsed="0"/>
+    <w:lsdException w:name="Medium Grid 1" w:semiHidden="0" w:uiPriority="67" w:unhideWhenUsed="0"/>
+    <w:lsdException w:name="Medium Grid 2" w:semiHidden="0" w:uiPriority="68" w:unhideWhenUsed="0"/>
+    <w:lsdException w:name="Medium Grid 3" w:semiHidden="0" w:uiPriority="69" w:unhideWhenUsed="0"/>
+    <w:lsdException w:name="Dark List" w:semiHidden="0" w:uiPriority="70" w:unhideWhenUsed="0"/>
+    <w:lsdException w:name="Colorful Shading" w:semiHidden="0" w:uiPriority="71" w:unhideWhenUsed="0"/>
+    <w:lsdException w:name="Colorful List" w:semiHidden="0" w:uiPriority="72" w:unhideWhenUsed="0"/>
+    <w:lsdException w:name="Colorful Grid" w:semiHidden="0" w:uiPriority="73" w:unhideWhenUsed="0"/>
+    <w:lsdException w:name="Light Shading Accent 1" w:semiHidden="0" w:uiPriority="60" w:unhideWhenUsed="0"/>
+    <w:lsdException w:name="Light List Accent 1" w:semiHidden="0" w:uiPriority="61" w:unhideWhenUsed="0"/>
+    <w:lsdException w:name="Light Grid Accent 1" w:semiHidden="0" w:uiPriority="62" w:unhideWhenUsed="0"/>
+    <w:lsdException w:name="Medium Shading 1 Accent 1" w:semiHidden="0" w:uiPriority="63" w:unhideWhenUsed="0"/>
+    <w:lsdException w:name="Medium Shading 2 Accent 1" w:semiHidden="0" w:uiPriority="64" w:unhideWhenUsed="0"/>
+    <w:lsdException w:name="Medium List 1 Accent 1" w:semiHidden="0" w:uiPriority="65" w:unhideWhenUsed="0"/>
+    <w:lsdException w:name="Revision" w:unhideWhenUsed="0"/>
+    <w:lsdException w:name="List Paragraph" w:semiHidden="0" w:uiPriority="34" w:unhideWhenUsed="0" w:qFormat="1"/>
+    <w:lsdException w:name="Quote" w:semiHidden="0" w:uiPriority="29" w:unhideWhenUsed="0" w:qFormat="1"/>
+    <w:lsdException w:name="Intense Quote" w:semiHidden="0" w:uiPriority="30" w:unhideWhenUsed="0" w:qFormat="1"/>
+    <w:lsdException w:name="Medium List 2 Accent 1" w:semiHidden="0" w:uiPriority="66" w:unhideWhenUsed="0"/>
+    <w:lsdException w:name="Medium Grid 1 Accent 1" w:semiHidden="0" w:uiPriority="67" w:unhideWhenUsed="0"/>
+    <w:lsdException w:name="Medium Grid 2 Accent 1" w:semiHidden="0" w:uiPriority="68" w:unhideWhenUsed="0"/>
+    <w:lsdException w:name="Medium Grid 3 Accent 1" w:semiHidden="0" w:uiPriority="69" w:unhideWhenUsed="0"/>
+    <w:lsdException w:name="Dark List Accent 1" w:semiHidden="0" w:uiPriority="70" w:unhideWhenUsed="0"/>
+    <w:lsdException w:name="Colorful Shading Accent 1" w:semiHidden="0" w:uiPriority="71" w:unhideWhenUsed="0"/>
+    <w:lsdException w:name="Colorful List Accent 1" w:semiHidden="0" w:uiPriority="72" w:unhideWhenUsed="0"/>
+    <w:lsdException w:name="Colorful Grid Accent 1" w:semiHidden="0" w:uiPriority="73" w:unhideWhenUsed="0"/>
+    <w:lsdException w:name="Light Shading Accent 2" w:semiHidden="0" w:uiPriority="60" w:unhideWhenUsed="0"/>
+    <w:lsdException w:name="Light List Accent 2" w:semiHidden="0" w:uiPriority="61" w:unhideWhenUsed="0"/>
+    <w:lsdException w:name="Light Grid Accent 2" w:semiHidden="0" w:uiPriority="62" w:unhideWhenUsed="0"/>
+    <w:lsdException w:name="Medium Shading 1 Accent 2" w:semiHidden="0" w:uiPriority="63" w:unhideWhenUsed="0"/>
+    <w:lsdException w:name="Medium Shading 2 Accent 2" w:semiHidden="0" w:uiPriority="64" w:unhideWhenUsed="0"/>
+    <w:lsdException w:name="Medium List 1 Accent 2" w:semiHidden="0" w:uiPriority="65" w:unhideWhenUsed="0"/>
+    <w:lsdException w:name="Medium List 2 Accent 2" w:semiHidden="0" w:uiPriority="66" w:unhideWhenUsed="0"/>
+    <w:lsdException w:name="Medium Grid 1 Accent 2" w:semiHidden="0" w:uiPriority="67" w:unhideWhenUsed="0"/>
+    <w:lsdException w:name="Medium Grid 2 Accent 2" w:semiHidden="0" w:uiPriority="68" w:unhideWhenUsed="0"/>
+    <w:lsdException w:name="Medium Grid 3 Accent 2" w:semiHidden="0" w:uiPriority="69" w:unhideWhenUsed="0"/>
+    <w:lsdException w:name="Dark List Accent 2" w:semiHidden="0" w:uiPriority="70" w:unhideWhenUsed="0"/>
+    <w:lsdException w:name="Colorful Shading Accent 2" w:semiHidden="0" w:uiPriority="71" w:unhideWhenUsed="0"/>
+    <w:lsdException w:name="Colorful List Accent 2" w:semiHidden="0" w:uiPriority="72" w:unhideWhenUsed="0"/>
+    <w:lsdException w:name="Colorful Grid Accent 2" w:semiHidden="0" w:uiPriority="73" w:unhideWhenUsed="0"/>
+    <w:lsdException w:name="Light Shading Accent 3" w:semiHidden="0" w:uiPriority="60" w:unhideWhenUsed="0"/>
+    <w:lsdException w:name="Light List Accent 3" w:semiHidden="0" w:uiPriority="61" w:unhideWhenUsed="0"/>
+    <w:lsdException w:name="Light Grid Accent 3" w:semiHidden="0" w:uiPriority="62" w:unhideWhenUsed="0"/>
+    <w:lsdException w:name="Medium Shading 1 Accent 3" w:semiHidden="0" w:uiPriority="63" w:unhideWhenUsed="0"/>
+    <w:lsdException w:name="Medium Shading 2 Accent 3" w:semiHidden="0" w:uiPriority="64" w:unhideWhenUsed="0"/>
+    <w:lsdException w:name="Medium List 1 Accent 3" w:semiHidden="0" w:uiPriority="65" w:unhideWhenUsed="0"/>
+    <w:lsdException w:name="Medium List 2 Accent 3" w:semiHidden="0" w:uiPriority="66" w:unhideWhenUsed="0"/>
+    <w:lsdException w:name="Medium Grid 1 Accent 3" w:semiHidden="0" w:uiPriority="67" w:unhideWhenUsed="0"/>
+    <w:lsdException w:name="Medium Grid 2 Accent 3" w:semiHidden="0" w:uiPriority="68" w:unhideWhenUsed="0"/>
+    <w:lsdException w:name="Medium Grid 3 Accent 3" w:semiHidden="0" w:uiPriority="69" w:unhideWhenUsed="0"/>
+    <w:lsdException w:name="Dark List Accent 3" w:semiHidden="0" w:uiPriority="70" w:unhideWhenUsed="0"/>
+    <w:lsdException w:name="Colorful Shading Accent 3" w:semiHidden="0" w:uiPriority="71" w:unhideWhenUsed="0"/>
+    <w:lsdException w:name="Colorful List Accent 3" w:semiHidden="0" w:uiPriority="72" w:unhideWhenUsed="0"/>
+    <w:lsdException w:name="Colorful Grid Accent 3" w:semiHidden="0" w:uiPriority="73" w:unhideWhenUsed="0"/>
+    <w:lsdException w:name="Light Shading Accent 4" w:semiHidden="0" w:uiPriority="60" w:unhideWhenUsed="0"/>
+    <w:lsdException w:name="Light List Accent 4" w:semiHidden="0" w:uiPriority="61" w:unhideWhenUsed="0"/>
+    <w:lsdException w:name="Light Grid Accent 4" w:semiHidden="0" w:uiPriority="62" w:unhideWhenUsed="0"/>
+    <w:lsdException w:name="Medium Shading 1 Accent 4" w:semiHidden="0" w:uiPriority="63" w:unhideWhenUsed="0"/>
+    <w:lsdException w:name="Medium Shading 2 Accent 4" w:semiHidden="0" w:uiPriority="64" w:unhideWhenUsed="0"/>
+    <w:lsdException w:name="Medium List 1 Accent 4" w:semiHidden="0" w:uiPriority="65" w:unhideWhenUsed="0"/>
+    <w:lsdException w:name="Medium List 2 Accent 4" w:semiHidden="0" w:uiPriority="66" w:unhideWhenUsed="0"/>
+    <w:lsdException w:name="Medium Grid 1 Accent 4" w:semiHidden="0" w:uiPriority="67" w:unhideWhenUsed="0"/>
+    <w:lsdException w:name="Medium Grid 2 Accent 4" w:semiHidden="0" w:uiPriority="68" w:unhideWhenUsed="0"/>
+    <w:lsdException w:name="Medium Grid 3 Accent 4" w:semiHidden="0" w:uiPriority="69" w:unhideWhenUsed="0"/>
+    <w:lsdException w:name="Dark List Accent 4" w:semiHidden="0" w:uiPriority="70" w:unhideWhenUsed="0"/>
+    <w:lsdException w:name="Colorful Shading Accent 4" w:semiHidden="0" w:uiPriority="71" w:unhideWhenUsed="0"/>
+    <w:lsdException w:name="Colorful List Accent 4" w:semiHidden="0" w:uiPriority="72" w:unhideWhenUsed="0"/>
+    <w:lsdException w:name="Colorful Grid Accent 4" w:semiHidden="0" w:uiPriority="73" w:unhideWhenUsed="0"/>
+    <w:lsdException w:name="Light Shading Accent 5" w:semiHidden="0" w:uiPriority="60" w:unhideWhenUsed="0"/>
+    <w:lsdException w:name="Light List Accent 5" w:semiHidden="0" w:uiPriority="61" w:unhideWhenUsed="0"/>
+    <w:lsdException w:name="Light Grid Accent 5" w:semiHidden="0" w:uiPriority="62" w:unhideWhenUsed="0"/>
+    <w:lsdException w:name="Medium Shading 1 Accent 5" w:semiHidden="0" w:uiPriority="63" w:unhideWhenUsed="0"/>
+    <w:lsdException w:name="Medium Shading 2 Accent 5" w:semiHidden="0" w:uiPriority="64" w:unhideWhenUsed="0"/>
+    <w:lsdException w:name="Medium List 1 Accent 5" w:semiHidden="0" w:uiPriority="65" w:unhideWhenUsed="0"/>
+    <w:lsdException w:name="Medium List 2 Accent 5" w:semiHidden="0" w:uiPriority="66" w:unhideWhenUsed="0"/>
+    <w:lsdException w:name="Medium Grid 1 Accent 5" w:semiHidden="0" w:uiPriority="67" w:unhideWhenUsed="0"/>
+    <w:lsdException w:name="Medium Grid 2 Accent 5" w:semiHidden="0" w:uiPriority="68" w:unhideWhenUsed="0"/>
+    <w:lsdException w:name="Medium Grid 3 Accent 5" w:semiHidden="0" w:uiPriority="69" w:unhideWhenUsed="0"/>
+    <w:lsdException w:name="Dark List Accent 5" w:semiHidden="0" w:uiPriority="70" w:unhideWhenUsed="0"/>
+    <w:lsdException w:name="Colorful Shading Accent 5" w:semiHidden="0" w:uiPriority="71" w:unhideWhenUsed="0"/>
+    <w:lsdException w:name="Colorful List Accent 5" w:semiHidden="0" w:uiPriority="72" w:unhideWhenUsed="0"/>
+    <w:lsdException w:name="Colorful Grid Accent 5" w:semiHidden="0" w:uiPriority="73" w:unhideWhenUsed="0"/>
+    <w:lsdException w:name="Light Shading Accent 6" w:semiHidden="0" w:uiPriority="60" w:unhideWhenUsed="0"/>
+    <w:lsdException w:name="Light List Accent 6" w:semiHidden="0" w:uiPriority="61" w:unhideWhenUsed="0"/>
+    <w:lsdException w:name="Light Grid Accent 6" w:semiHidden="0" w:uiPriority="62" w:unhideWhenUsed="0"/>
+    <w:lsdException w:name="Medium Shading 1 Accent 6" w:semiHidden="0" w:uiPriority="63" w:unhideWhenUsed="0"/>
+    <w:lsdException w:name="Medium Shading 2 Accent 6" w:semiHidden="0" w:uiPriority="64" w:unhideWhenUsed="0"/>
+    <w:lsdException w:name="Medium List 1 Accent 6" w:semiHidden="0" w:uiPriority="65" w:unhideWhenUsed="0"/>
+    <w:lsdException w:name="Medium List 2 Accent 6" w:semiHidden="0" w:uiPriority="66" w:unhideWhenUsed="0"/>
+    <w:lsdException w:name="Medium Grid 1 Accent 6" w:semiHidden="0" w:uiPriority="67" w:unhideWhenUsed="0"/>
+    <w:lsdException w:name="Medium Grid 2 Accent 6" w:semiHidden="0" w:uiPriority="68" w:unhideWhenUsed="0"/>
+    <w:lsdException w:name="Medium Grid 3 Accent 6" w:semiHidden="0" w:uiPriority="69" w:unhideWhenUsed="0"/>
+    <w:lsdException w:name="Dark List Accent 6" w:semiHidden="0" w:uiPriority="70" w:unhideWhenUsed="0"/>
+    <w:lsdException w:name="Colorful Shading Accent 6" w:semiHidden="0" w:uiPriority="71" w:unhideWhenUsed="0"/>
+    <w:lsdException w:name="Colorful List Accent 6" w:semiHidden="0" w:uiPriority="72" w:unhideWhenUsed="0"/>
+    <w:lsdException w:name="Colorful Grid Accent 6" w:semiHidden="0" w:uiPriority="73" w:unhideWhenUsed="0"/>
+    <w:lsdException w:name="Subtle Emphasis" w:semiHidden="0" w:uiPriority="19" w:unhideWhenUsed="0" w:qFormat="1"/>
+    <w:lsdException w:name="Intense Emphasis" w:semiHidden="0" w:uiPriority="21" w:unhideWhenUsed="0" w:qFormat="1"/>
+    <w:lsdException w:name="Subtle Reference" w:semiHidden="0" w:uiPriority="31" w:unhideWhenUsed="0" w:qFormat="1"/>
+    <w:lsdException w:name="Intense Reference" w:semiHidden="0" w:uiPriority="32" w:unhideWhenUsed="0" w:qFormat="1"/>
+    <w:lsdException w:name="Book Title" w:semiHidden="0" w:uiPriority="33" w:unhideWhenUsed="0" w:qFormat="1"/>
+    <w:lsdException w:name="Bibliography" w:uiPriority="37"/>
+    <w:lsdException w:name="TOC Heading" w:uiPriority="39" w:qFormat="1"/>
+  </w:latentStyles>
+  <w:style w:type="paragraph" w:default="1" w:styleId="a">
+    <w:name w:val="Normal"/>
+    <w:qFormat/>
+    <w:rsid w:val="008E6CCB"/>
+    <w:pPr>
+      <w:spacing w:after="0" w:line="240" w:lineRule="auto"/>
+    </w:pPr>
+    <w:rPr>
+      <w:rFonts w:eastAsia="Times New Roman" w:cs="Times New Roman"/>
+      <w:szCs w:val="24"/>
+      <w:lang w:eastAsia="ru-RU"/>
+    </w:rPr>
+  </w:style>
+  <w:style w:type="character" w:default="1" w:styleId="a0">
+    <w:name w:val="Default Paragraph Font"/>
+    <w:uiPriority w:val="1"/>
+    <w:semiHidden/>
+    <w:unhideWhenUsed/>
+  </w:style>
+  <w:style w:type="table" w:default="1" w:styleId="a1">
+    <w:name w:val="Normal Table"/>
+    <w:uiPriority w:val="99"/>
+    <w:semiHidden/>
+    <w:unhideWhenUsed/>
+    <w:tblPr>
+      <w:tblInd w:w="0" w:type="dxa"/>
+      <w:tblCellMar>
+        <w:top w:w="0" w:type="dxa"/>
+        <w:left w:w="108" w:type="dxa"/>
+        <w:bottom w:w="0" w:type="dxa"/>
+        <w:right w:w="108" w:type="dxa"/>
+      </w:tblCellMar>
+    </w:tblPr>
+  </w:style>
+  <w:style w:type="numbering" w:default="1" w:styleId="a2">
+    <w:name w:val="No List"/>
+    <w:uiPriority w:val="99"/>
+    <w:semiHidden/>
+    <w:unhideWhenUsed/>
+  </w:style>
+  <w:style w:type="paragraph" w:styleId="a3">
+    <w:name w:val="List Paragraph"/>
+    <w:basedOn w:val="a"/>
+    <w:uiPriority w:val="34"/>
+    <w:qFormat/>
+    <w:rsid w:val="008E6CCB"/>
+    <w:pPr>
+      <w:ind w:left="720"/>
+      <w:contextualSpacing/>
+    </w:pPr>
+  </w:style>
+  <w:style w:type="paragraph" w:styleId="a4">
+    <w:name w:val="Balloon Text"/>
+    <w:basedOn w:val="a"/>
+    <w:link w:val="a5"/>
+    <w:uiPriority w:val="99"/>
+    <w:semiHidden/>
+    <w:unhideWhenUsed/>
+    <w:rsid w:val="008865E1"/>
+    <w:rPr>
+      <w:rFonts w:ascii="Tahoma" w:hAnsi="Tahoma" w:cs="Tahoma"/>
+      <w:sz w:val="16"/>
+      <w:szCs w:val="16"/>
+    </w:rPr>
+  </w:style>
+  <w:style w:type="character" w:customStyle="1" w:styleId="a5">
+    <w:name w:val="Текст выноски Знак"/>
+    <w:basedOn w:val="a0"/>
+    <w:link w:val="a4"/>
+    <w:uiPriority w:val="99"/>
+    <w:semiHidden/>
+    <w:rsid w:val="008865E1"/>
+    <w:rPr>
+      <w:rFonts w:ascii="Tahoma" w:eastAsia="Times New Roman" w:hAnsi="Tahoma" w:cs="Tahoma"/>
+      <w:sz w:val="16"/>
+      <w:szCs w:val="16"/>
+      <w:lang w:eastAsia="ru-RU"/>
+    </w:rPr>
+  </w:style>
+  <w:style w:type="table" w:styleId="a6">
+    <w:name w:val="Table Grid"/>
+    <w:basedOn w:val="a1"/>
+    <w:uiPriority w:val="59"/>
+    <w:rsid w:val="009F4A33"/>
+    <w:pPr>
+      <w:spacing w:after="0" w:line="240" w:lineRule="auto"/>
+    </w:pPr>
+    <w:tblPr>
+      <w:tblBorders>
+        <w:top w:val="single" w:sz="4" w:space="0" w:color="000000" w:themeColor="text1"/>
+        <w:left w:val="single" w:sz="4" w:space="0" w:color="000000" w:themeColor="text1"/>
+        <w:bottom w:val="single" w:sz="4" w:space="0" w:color="000000" w:themeColor="text1"/>
+        <w:right w:val="single" w:sz="4" w:space="0" w:color="000000" w:themeColor="text1"/>
+        <w:insideH w:val="single" w:sz="4" w:space="0" w:color="000000" w:themeColor="text1"/>
+        <w:insideV w:val="single" w:sz="4" w:space="0" w:color="000000" w:themeColor="text1"/>
+      </w:tblBorders>
+    </w:tblPr>
+  </w:style>
+  <w:style w:type="paragraph" w:styleId="a7">
+    <w:name w:val="header"/>
+    <w:basedOn w:val="a"/>
+    <w:link w:val="a8"/>
+    <w:uiPriority w:val="99"/>
+    <w:unhideWhenUsed/>
+    <w:rsid w:val="002442E2"/>
+    <w:pPr>
+      <w:tabs>
+        <w:tab w:val="center" w:pos="4677"/>
+        <w:tab w:val="right" w:pos="9355"/>
+      </w:tabs>
+    </w:pPr>
+  </w:style>
+  <w:style w:type="character" w:customStyle="1" w:styleId="a8">
+    <w:name w:val="Верхний колонтитул Знак"/>
+    <w:basedOn w:val="a0"/>
+    <w:link w:val="a7"/>
+    <w:uiPriority w:val="99"/>
+    <w:rsid w:val="002442E2"/>
+    <w:rPr>
+      <w:rFonts w:eastAsia="Times New Roman" w:cs="Times New Roman"/>
+      <w:szCs w:val="24"/>
+      <w:lang w:eastAsia="ru-RU"/>
+    </w:rPr>
+  </w:style>
+  <w:style w:type="paragraph" w:styleId="a9">
+    <w:name w:val="footer"/>
+    <w:basedOn w:val="a"/>
+    <w:link w:val="aa"/>
+    <w:uiPriority w:val="99"/>
+    <w:unhideWhenUsed/>
+    <w:rsid w:val="002442E2"/>
+    <w:pPr>
+      <w:tabs>
+        <w:tab w:val="center" w:pos="4677"/>
+        <w:tab w:val="right" w:pos="9355"/>
+      </w:tabs>
+    </w:pPr>
+  </w:style>
+  <w:style w:type="character" w:customStyle="1" w:styleId="aa">
+    <w:name w:val="Нижний колонтитул Знак"/>
+    <w:basedOn w:val="a0"/>
+    <w:link w:val="a9"/>
+    <w:uiPriority w:val="99"/>
+    <w:rsid w:val="002442E2"/>
+    <w:rPr>
+      <w:rFonts w:eastAsia="Times New Roman" w:cs="Times New Roman"/>
+      <w:szCs w:val="24"/>
+      <w:lang w:eastAsia="ru-RU"/>
+    </w:rPr>
+  </w:style>
+  <w:style w:type="character" w:styleId="ab">
+    <w:name w:val="Placeholder Text"/>
+    <w:basedOn w:val="a0"/>
+    <w:uiPriority w:val="99"/>
+    <w:semiHidden/>
+    <w:rsid w:val="00D64E43"/>
+    <w:rPr>
+      <w:color w:val="808080"/>
+    </w:rPr>
+  </w:style>
+</w:styles>
+</file>
+
+<file path=word/glossary/document.xml><?xml version="1.0" encoding="utf-8"?>
+<w:glossaryDocument xmlns:wpc="http://schemas.microsoft.com/office/word/2010/wordprocessingCanvas" xmlns:mc="http://schemas.openxmlformats.org/markup-compatibility/2006" xmlns:o="urn:schemas-microsoft-com:office:office" xmlns:r="http://schemas.openxmlformats.org/officeDocument/2006/relationships" xmlns:m="http://schemas.openxmlformats.org/officeDocument/2006/math" xmlns:v="urn:schemas-microsoft-com:vml" xmlns:wp14="http://schemas.microsoft.com/office/word/2010/wordprocessingDrawing" xmlns:wp="http://schemas.openxmlformats.org/drawingml/2006/wordprocessingDrawing" xmlns:w10="urn:schemas-microsoft-com:office:word" xmlns:w="http://schemas.openxmlformats.org/wordprocessingml/2006/main" xmlns:w14="http://schemas.microsoft.com/office/word/2010/wordml" xmlns:wpg="http://schemas.microsoft.com/office/word/2010/wordprocessingGroup" xmlns:wpi="http://schemas.microsoft.com/office/word/2010/wordprocessingInk" xmlns:wne="http://schemas.microsoft.com/office/word/2006/wordml" xmlns:wps="http://schemas.microsoft.com/office/word/2010/wordprocessingShape" mc:Ignorable="w14 wp14">
+  <w:docParts>
+    <w:docPart>
+      <w:docPartPr>
+        <w:name w:val="DefaultPlaceholder_1082065158"/>
+        <w:category>
+          <w:name w:val="Общие"/>
+          <w:gallery w:val="placeholder"/>
+        </w:category>
+        <w:types>
+          <w:type w:val="bbPlcHdr"/>
+        </w:types>
+        <w:behaviors>
+          <w:behavior w:val="content"/>
+        </w:behaviors>
+        <w:guid w:val="{331093AD-DCA8-410E-9969-3C3D863327A4}"/>
+      </w:docPartPr>
+      <w:docPartBody>
+        <w:p>
+          <w:r>
+            <w:rPr>
+              <w:rStyle w:val="a3"/>
+            </w:rPr>
+            <w:t>Место для ввода текста.</w:t>
+          </w:r>
+        </w:p>
+      </w:docPartBody>
+    </w:docPart>
+    <w:docPart>
+      <w:docPartPr>
+        <w:name w:val="38CCBE4EB57A4F7CABCEBC9F64663B43"/>
+        <w:category>
+          <w:name w:val="Общие"/>
+          <w:gallery w:val="placeholder"/>
+        </w:category>
+        <w:types>
+          <w:type w:val="bbPlcHdr"/>
+        </w:types>
+        <w:behaviors>
+          <w:behavior w:val="content"/>
+        </w:behaviors>
+        <w:guid w:val="{EF3337E0-C44F-492D-8C0A-D0262246A1CE}"/>
+      </w:docPartPr>
+      <w:docPartBody>
+        <w:p>
+          <w:pPr>
+            <w:pStyle w:val="38CCBE4EB57A4F7CABCEBC9F64663B43"/>
+          </w:pPr>
+          <w:r>
+            <w:rPr>
+              <w:rStyle w:val="a3"/>
+            </w:rPr>
+            <w:t>Место для ввода текста.</w:t>
+          </w:r>
+        </w:p>
+      </w:docPartBody>
+    </w:docPart>
+    <w:docPart>
+      <w:docPartPr>
+        <w:name w:val="6D308016ADA441BE80954227017427D3"/>
+        <w:category>
+          <w:name w:val="Общие"/>
+          <w:gallery w:val="placeholder"/>
+        </w:category>
+        <w:types>
+          <w:type w:val="bbPlcHdr"/>
+        </w:types>
+        <w:behaviors>
+          <w:behavior w:val="content"/>
+        </w:behaviors>
+        <w:guid w:val="{C9CAA765-4645-4D88-935F-FF486BB2A90C}"/>
+      </w:docPartPr>
+      <w:docPartBody>
+        <w:p>
+          <w:pPr>
+            <w:pStyle w:val="6D308016ADA441BE80954227017427D3"/>
+          </w:pPr>
+          <w:r>
+            <w:rPr>
+              <w:rStyle w:val="a3"/>
+            </w:rPr>
+            <w:t>Место для ввода текста.</w:t>
+          </w:r>
+        </w:p>
+      </w:docPartBody>
+    </w:docPart>
+    <w:docPart>
+      <w:docPartPr>
+        <w:name w:val="DB56ACF0EC81407E8A464E13CCEA3791"/>
+        <w:category>
+          <w:name w:val="Общие"/>
+          <w:gallery w:val="placeholder"/>
+        </w:category>
+        <w:types>
+          <w:type w:val="bbPlcHdr"/>
+        </w:types>
+        <w:behaviors>
+          <w:behavior w:val="content"/>
+        </w:behaviors>
+        <w:guid w:val="{9ADB78F7-6DE4-4623-B993-273A88E06D8F}"/>
+      </w:docPartPr>
+      <w:docPartBody>
+        <w:p>
+          <w:pPr>
+            <w:pStyle w:val="DB56ACF0EC81407E8A464E13CCEA3791"/>
+          </w:pPr>
+          <w:r>
+            <w:rPr>
+              <w:rStyle w:val="a3"/>
+            </w:rPr>
+            <w:t>Место для ввода текста.</w:t>
+          </w:r>
+        </w:p>
+      </w:docPartBody>
+    </w:docPart>
+    <w:docPart>
+      <w:docPartPr>
+        <w:name w:val="6FA6628EDDC240529E5D105D481887A2"/>
+        <w:category>
+          <w:name w:val="Общие"/>
+          <w:gallery w:val="placeholder"/>
+        </w:category>
+        <w:types>
+          <w:type w:val="bbPlcHdr"/>
+        </w:types>
+        <w:behaviors>
+          <w:behavior w:val="content"/>
+        </w:behaviors>
+        <w:guid w:val="{0919B7C5-8560-4E85-AA30-DF2F0797A457}"/>
+      </w:docPartPr>
+      <w:docPartBody>
+        <w:p>
+          <w:pPr>
+            <w:pStyle w:val="6FA6628EDDC240529E5D105D481887A2"/>
+          </w:pPr>
+          <w:r>
+            <w:rPr>
+              <w:rStyle w:val="a3"/>
+            </w:rPr>
+            <w:t>Место для ввода текста.</w:t>
+          </w:r>
+        </w:p>
+      </w:docPartBody>
+    </w:docPart>
+  </w:docParts>
+</w:glossaryDocument>
+</file>
+
+<file path=word/glossary/fontTable.xml><?xml version="1.0" encoding="utf-8"?>
+<w:fonts xmlns:mc="http://schemas.openxmlformats.org/markup-compatibility/2006" xmlns:r="http://schemas.openxmlformats.org/officeDocument/2006/relationships" xmlns:w="http://schemas.openxmlformats.org/wordprocessingml/2006/main" xmlns:w14="http://schemas.microsoft.com/office/word/2010/wordml" mc:Ignorable="w14">
+  <w:font w:name="Times New Roman">
+    <w:panose1 w:val="02020603050405020304"/>
+    <w:charset w:val="CC"/>
+    <w:family w:val="roman"/>
+    <w:pitch w:val="variable"/>
+    <w:sig w:usb0="E0002EFF" w:usb1="C000785B" w:usb2="00000009" w:usb3="00000000" w:csb0="000001FF" w:csb1="00000000"/>
+  </w:font>
+  <w:font w:name="Tahoma">
+    <w:panose1 w:val="020B0604030504040204"/>
+    <w:charset w:val="00"/>
+    <w:family w:val="swiss"/>
+    <w:notTrueType/>
+    <w:pitch w:val="variable"/>
+    <w:sig w:usb0="00000003" w:usb1="00000000" w:usb2="00000000" w:usb3="00000000" w:csb0="00000001" w:csb1="00000000"/>
+  </w:font>
+  <w:font w:name="Verdana">
+    <w:panose1 w:val="020B0604030504040204"/>
+    <w:charset w:val="CC"/>
+    <w:family w:val="swiss"/>
+    <w:pitch w:val="variable"/>
+    <w:sig w:usb0="A00006FF" w:usb1="4000205B" w:usb2="00000010" w:usb3="00000000" w:csb0="0000019F" w:csb1="00000000"/>
+  </w:font>
+  <w:font w:name="Calibri">
+    <w:panose1 w:val="020F0502020204030204"/>
+    <w:charset w:val="CC"/>
+    <w:family w:val="swiss"/>
+    <w:pitch w:val="variable"/>
+    <w:sig w:usb0="E4002EFF" w:usb1="C000247B" w:usb2="00000009" w:usb3="00000000" w:csb0="000001FF" w:csb1="00000000"/>
+  </w:font>
+  <w:font w:name="Cambria">
+    <w:panose1 w:val="02040503050406030204"/>
+    <w:charset w:val="CC"/>
+    <w:family w:val="roman"/>
+    <w:pitch w:val="variable"/>
+    <w:sig w:usb0="E00006FF" w:usb1="420024FF" w:usb2="02000000" w:usb3="00000000" w:csb0="0000019F" w:csb1="00000000"/>
+  </w:font>
+</w:fonts>
+</file>
+
+<file path=word/glossary/settings.xml><?xml version="1.0" encoding="utf-8"?>
+<w:settings xmlns:mc="http://schemas.openxmlformats.org/markup-compatibility/2006" xmlns:o="urn:schemas-microsoft-com:office:office" xmlns:r="http://schemas.openxmlformats.org/officeDocument/2006/relationships" xmlns:m="http://schemas.openxmlformats.org/officeDocument/2006/math" xmlns:v="urn:schemas-microsoft-com:vml" xmlns:w10="urn:schemas-microsoft-com:office:word" xmlns:w="http://schemas.openxmlformats.org/wordprocessingml/2006/main" xmlns:w14="http://schemas.microsoft.com/office/word/2010/wordml" xmlns:sl="http://schemas.openxmlformats.org/schemaLibrary/2006/main" mc:Ignorable="w14">
+  <w:view w:val="normal"/>
+  <w:defaultTabStop w:val="708"/>
+  <w:characterSpacingControl w:val="doNotCompress"/>
+  <w:compat>
+    <w:useFELayout/>
+    <w:compatSetting w:name="compatibilityMode" w:uri="http://schemas.microsoft.com/office/word" w:val="14"/>
+    <w:compatSetting w:name="overrideTableStyleFontSizeAndJustification" w:uri="http://schemas.microsoft.com/office/word" w:val="1"/>
+    <w:compatSetting w:name="enableOpenTypeFeatures" w:uri="http://schemas.microsoft.com/office/word" w:val="1"/>
+    <w:compatSetting w:name="doNotFlipMirrorIndents" w:uri="http://schemas.microsoft.com/office/word" w:val="1"/>
+  </w:compat>
+  <w:rsids>
+    <w:rsidRoot w:val="0006657F"/>
+    <w:rsid w:val="0006657F"/>
+    <w:rsid w:val="000A7076"/>
+    <w:rsid w:val="0015205C"/>
+    <w:rsid w:val="002216EC"/>
+    <w:rsid w:val="002238AA"/>
+    <w:rsid w:val="00310C98"/>
+    <w:rsid w:val="00341CD6"/>
+    <w:rsid w:val="005843F6"/>
+    <w:rsid w:val="00834B2F"/>
+    <w:rsid w:val="00944EC5"/>
+    <w:rsid w:val="00990E32"/>
+    <w:rsid w:val="00A572CC"/>
+    <w:rsid w:val="00AF4E74"/>
+    <w:rsid w:val="00CE3812"/>
+    <w:rsid w:val="00D7681D"/>
+    <w:rsid w:val="00DC6B94"/>
+    <w:rsid w:val="00F249A1"/>
+    <w:rsid w:val="00FB5A15"/>
+  </w:rsids>
+  <m:mathPr>
+    <m:mathFont m:val="Cambria Math"/>
+    <m:brkBin m:val="before"/>
+    <m:brkBinSub m:val="--"/>
+    <m:smallFrac m:val="0"/>
+    <m:dispDef/>
+    <m:lMargin m:val="0"/>
+    <m:rMargin m:val="0"/>
+    <m:defJc m:val="centerGroup"/>
+    <m:wrapIndent m:val="1440"/>
+    <m:intLim m:val="subSup"/>
+    <m:naryLim m:val="undOvr"/>
+  </m:mathPr>
+  <w:themeFontLang w:val="ru-RU"/>
+  <w:clrSchemeMapping w:bg1="light1" w:t1="dark1" w:bg2="light2" w:t2="dark2" w:accent1="accent1" w:accent2="accent2" w:accent3="accent3" w:accent4="accent4" w:accent5="accent5" w:accent6="accent6" w:hyperlink="hyperlink" w:followedHyperlink="followedHyperlink"/>
+  <w:decimalSymbol w:val=","/>
+  <w:listSeparator w:val=";"/>
+</w:settings>
+</file>
+
+<file path=word/glossary/styles.xml><?xml version="1.0" encoding="utf-8"?>
+<w:styles xmlns:mc="http://schemas.openxmlformats.org/markup-compatibility/2006" xmlns:r="http://schemas.openxmlformats.org/officeDocument/2006/relationships" xmlns:w="http://schemas.openxmlformats.org/wordprocessingml/2006/main" xmlns:w14="http://schemas.microsoft.com/office/word/2010/wordml" mc:Ignorable="w14">
+  <w:docDefaults>
+    <w:rPrDefault>
+      <w:rPr>
+        <w:rFonts w:asciiTheme="minorHAnsi" w:eastAsiaTheme="minorEastAsia" w:hAnsiTheme="minorHAnsi" w:cstheme="minorBidi"/>
+        <w:sz w:val="22"/>
+        <w:szCs w:val="22"/>
+        <w:lang w:val="ru-RU" w:eastAsia="ru-RU" w:bidi="ar-SA"/>
+      </w:rPr>
+    </w:rPrDefault>
+    <w:pPrDefault>
+      <w:pPr>
+        <w:spacing w:after="200" w:line="276" w:lineRule="auto"/>
+      </w:pPr>
+    </w:pPrDefault>
+  </w:docDefaults>
+  <w:latentStyles w:defLockedState="0" w:defUIPriority="99" w:defSemiHidden="1" w:defUnhideWhenUsed="1" w:defQFormat="0" w:count="267">
+    <w:lsdException w:name="Normal" w:semiHidden="0" w:uiPriority="0" w:unhideWhenUsed="0" w:qFormat="1"/>
+    <w:lsdException w:name="heading 1" w:semiHidden="0" w:uiPriority="9" w:unhideWhenUsed="0" w:qFormat="1"/>
+    <w:lsdException w:name="heading 2" w:uiPriority="9" w:qFormat="1"/>
+    <w:lsdException w:name="heading 3" w:uiPriority="9" w:qFormat="1"/>
+    <w:lsdException w:name="heading 4" w:uiPriority="9" w:qFormat="1"/>
+    <w:lsdException w:name="heading 5" w:uiPriority="9" w:qFormat="1"/>
+    <w:lsdException w:name="heading 6" w:uiPriority="9" w:qFormat="1"/>
+    <w:lsdException w:name="heading 7" w:uiPriority="9" w:qFormat="1"/>
+    <w:lsdException w:name="heading 8" w:uiPriority="9" w:qFormat="1"/>
+    <w:lsdException w:name="heading 9" w:uiPriority="9" w:qFormat="1"/>
+    <w:lsdException w:name="toc 1" w:uiPriority="39"/>
+    <w:lsdException w:name="toc 2" w:uiPriority="39"/>
+    <w:lsdException w:name="toc 3" w:uiPriority="39"/>
+    <w:lsdException w:name="toc 4" w:uiPriority="39"/>
+    <w:lsdException w:name="toc 5" w:uiPriority="39"/>
+    <w:lsdException w:name="toc 6" w:uiPriority="39"/>
+    <w:lsdException w:name="toc 7" w:uiPriority="39"/>
+    <w:lsdException w:name="toc 8" w:uiPriority="39"/>
+    <w:lsdException w:name="toc 9" w:uiPriority="39"/>
+    <w:lsdException w:name="caption" w:uiPriority="35" w:qFormat="1"/>
+    <w:lsdException w:name="Title" w:semiHidden="0" w:uiPriority="10" w:unhideWhenUsed="0" w:qFormat="1"/>
+    <w:lsdException w:name="Default Paragraph Font" w:uiPriority="1"/>
+    <w:lsdException w:name="Subtitle" w:semiHidden="0" w:uiPriority="11" w:unhideWhenUsed="0" w:qFormat="1"/>
+    <w:lsdException w:name="Strong" w:semiHidden="0" w:uiPriority="22" w:unhideWhenUsed="0" w:qFormat="1"/>
+    <w:lsdException w:name="Emphasis" w:semiHidden="0" w:uiPriority="20" w:unhideWhenUsed="0" w:qFormat="1"/>
+    <w:lsdException w:name="Table Grid" w:semiHidden="0" w:uiPriority="59" w:unhideWhenUsed="0"/>
+    <w:lsdException w:name="Placeholder Text" w:unhideWhenUsed="0"/>
+    <w:lsdException w:name="No Spacing" w:semiHidden="0" w:uiPriority="1" w:unhideWhenUsed="0" w:qFormat="1"/>
+    <w:lsdException w:name="Light Shading" w:semiHidden="0" w:uiPriority="60" w:unhideWhenUsed="0"/>
+    <w:lsdException w:name="Light List" w:semiHidden="0" w:uiPriority="61" w:unhideWhenUsed="0"/>
+    <w:lsdException w:name="Light Grid" w:semiHidden="0" w:uiPriority="62" w:unhideWhenUsed="0"/>
+    <w:lsdException w:name="Medium Shading 1" w:semiHidden="0" w:uiPriority="63" w:unhideWhenUsed="0"/>
+    <w:lsdException w:name="Medium Shading 2" w:semiHidden="0" w:uiPriority="64" w:unhideWhenUsed="0"/>
+    <w:lsdException w:name="Medium List 1" w:semiHidden="0" w:uiPriority="65" w:unhideWhenUsed="0"/>
+    <w:lsdException w:name="Medium List 2" w:semiHidden="0" w:uiPriority="66" w:unhideWhenUsed="0"/>
+    <w:lsdException w:name="Medium Grid 1" w:semiHidden="0" w:uiPriority="67" w:unhideWhenUsed="0"/>
+    <w:lsdException w:name="Medium Grid 2" w:semiHidden="0" w:uiPriority="68" w:unhideWhenUsed="0"/>
+    <w:lsdException w:name="Medium Grid 3" w:semiHidden="0" w:uiPriority="69" w:unhideWhenUsed="0"/>
+    <w:lsdException w:name="Dark List" w:semiHidden="0" w:uiPriority="70" w:unhideWhenUsed="0"/>
+    <w:lsdException w:name="Colorful Shading" w:semiHidden="0" w:uiPriority="71" w:unhideWhenUsed="0"/>
+    <w:lsdException w:name="Colorful List" w:semiHidden="0" w:uiPriority="72" w:unhideWhenUsed="0"/>
+    <w:lsdException w:name="Colorful Grid" w:semiHidden="0" w:uiPriority="73" w:unhideWhenUsed="0"/>
+    <w:lsdException w:name="Light Shading Accent 1" w:semiHidden="0" w:uiPriority="60" w:unhideWhenUsed="0"/>
+    <w:lsdException w:name="Light List Accent 1" w:semiHidden="0" w:uiPriority="61" w:unhideWhenUsed="0"/>
+    <w:lsdException w:name="Light Grid Accent 1" w:semiHidden="0" w:uiPriority="62" w:unhideWhenUsed="0"/>
+    <w:lsdException w:name="Medium Shading 1 Accent 1" w:semiHidden="0" w:uiPriority="63" w:unhideWhenUsed="0"/>
+    <w:lsdException w:name="Medium Shading 2 Accent 1" w:semiHidden="0" w:uiPriority="64" w:unhideWhenUsed="0"/>
+    <w:lsdException w:name="Medium List 1 Accent 1" w:semiHidden="0" w:uiPriority="65" w:unhideWhenUsed="0"/>
+    <w:lsdException w:name="Revision" w:unhideWhenUsed="0"/>
+    <w:lsdException w:name="List Paragraph" w:semiHidden="0" w:uiPriority="34" w:unhideWhenUsed="0" w:qFormat="1"/>
+    <w:lsdException w:name="Quote" w:semiHidden="0" w:uiPriority="29" w:unhideWhenUsed="0" w:qFormat="1"/>
+    <w:lsdException w:name="Intense Quote" w:semiHidden="0" w:uiPriority="30" w:unhideWhenUsed="0" w:qFormat="1"/>
+    <w:lsdException w:name="Medium List 2 Accent 1" w:semiHidden="0" w:uiPriority="66" w:unhideWhenUsed="0"/>
+    <w:lsdException w:name="Medium Grid 1 Accent 1" w:semiHidden="0" w:uiPriority="67" w:unhideWhenUsed="0"/>
+    <w:lsdException w:name="Medium Grid 2 Accent 1" w:semiHidden="0" w:uiPriority="68" w:unhideWhenUsed="0"/>
+    <w:lsdException w:name="Medium Grid 3 Accent 1" w:semiHidden="0" w:uiPriority="69" w:unhideWhenUsed="0"/>
+    <w:lsdException w:name="Dark List Accent 1" w:semiHidden="0" w:uiPriority="70" w:unhideWhenUsed="0"/>
+    <w:lsdException w:name="Colorful Shading Accent 1" w:semiHidden="0" w:uiPriority="71" w:unhideWhenUsed="0"/>
+    <w:lsdException w:name="Colorful List Accent 1" w:semiHidden="0" w:uiPriority="72" w:unhideWhenUsed="0"/>
+    <w:lsdException w:name="Colorful Grid Accent 1" w:semiHidden="0" w:uiPriority="73" w:unhideWhenUsed="0"/>
+    <w:lsdException w:name="Light Shading Accent 2" w:semiHidden="0" w:uiPriority="60" w:unhideWhenUsed="0"/>
+    <w:lsdException w:name="Light List Accent 2" w:semiHidden="0" w:uiPriority="61" w:unhideWhenUsed="0"/>
+    <w:lsdException w:name="Light Grid Accent 2" w:semiHidden="0" w:uiPriority="62" w:unhideWhenUsed="0"/>
+    <w:lsdException w:name="Medium Shading 1 Accent 2" w:semiHidden="0" w:uiPriority="63" w:unhideWhenUsed="0"/>
+    <w:lsdException w:name="Medium Shading 2 Accent 2" w:semiHidden="0" w:uiPriority="64" w:unhideWhenUsed="0"/>
+    <w:lsdException w:name="Medium List 1 Accent 2" w:semiHidden="0" w:uiPriority="65" w:unhideWhenUsed="0"/>
+    <w:lsdException w:name="Medium List 2 Accent 2" w:semiHidden="0" w:uiPriority="66" w:unhideWhenUsed="0"/>
+    <w:lsdException w:name="Medium Grid 1 Accent 2" w:semiHidden="0" w:uiPriority="67" w:unhideWhenUsed="0"/>
+    <w:lsdException w:name="Medium Grid 2 Accent 2" w:semiHidden="0" w:uiPriority="68" w:unhideWhenUsed="0"/>
+    <w:lsdException w:name="Medium Grid 3 Accent 2" w:semiHidden="0" w:uiPriority="69" w:unhideWhenUsed="0"/>
+    <w:lsdException w:name="Dark List Accent 2" w:semiHidden="0" w:uiPriority="70" w:unhideWhenUsed="0"/>
+    <w:lsdException w:name="Colorful Shading Accent 2" w:semiHidden="0" w:uiPriority="71" w:unhideWhenUsed="0"/>
+    <w:lsdException w:name="Colorful List Accent 2" w:semiHidden="0" w:uiPriority="72" w:unhideWhenUsed="0"/>
+    <w:lsdException w:name="Colorful Grid Accent 2" w:semiHidden="0" w:uiPriority="73" w:unhideWhenUsed="0"/>
+    <w:lsdException w:name="Light Shading Accent 3" w:semiHidden="0" w:uiPriority="60" w:unhideWhenUsed="0"/>
+    <w:lsdException w:name="Light List Accent 3" w:semiHidden="0" w:uiPriority="61" w:unhideWhenUsed="0"/>
+    <w:lsdException w:name="Light Grid Accent 3" w:semiHidden="0" w:uiPriority="62" w:unhideWhenUsed="0"/>
+    <w:lsdException w:name="Medium Shading 1 Accent 3" w:semiHidden="0" w:uiPriority="63" w:unhideWhenUsed="0"/>
+    <w:lsdException w:name="Medium Shading 2 Accent 3" w:semiHidden="0" w:uiPriority="64" w:unhideWhenUsed="0"/>
+    <w:lsdException w:name="Medium List 1 Accent 3" w:semiHidden="0" w:uiPriority="65" w:unhideWhenUsed="0"/>
+    <w:lsdException w:name="Medium List 2 Accent 3" w:semiHidden="0" w:uiPriority="66" w:unhideWhenUsed="0"/>
+    <w:lsdException w:name="Medium Grid 1 Accent 3" w:semiHidden="0" w:uiPriority="67" w:unhideWhenUsed="0"/>
+    <w:lsdException w:name="Medium Grid 2 Accent 3" w:semiHidden="0" w:uiPriority="68" w:unhideWhenUsed="0"/>
+    <w:lsdException w:name="Medium Grid 3 Accent 3" w:semiHidden="0" w:uiPriority="69" w:unhideWhenUsed="0"/>
+    <w:lsdException w:name="Dark List Accent 3" w:semiHidden="0" w:uiPriority="70" w:unhideWhenUsed="0"/>
+    <w:lsdException w:name="Colorful Shading Accent 3" w:semiHidden="0" w:uiPriority="71" w:unhideWhenUsed="0"/>
+    <w:lsdException w:name="Colorful List Accent 3" w:semiHidden="0" w:uiPriority="72" w:unhideWhenUsed="0"/>
+    <w:lsdException w:name="Colorful Grid Accent 3" w:semiHidden="0" w:uiPriority="73" w:unhideWhenUsed="0"/>
+    <w:lsdException w:name="Light Shading Accent 4" w:semiHidden="0" w:uiPriority="60" w:unhideWhenUsed="0"/>
+    <w:lsdException w:name="Light List Accent 4" w:semiHidden="0" w:uiPriority="61" w:unhideWhenUsed="0"/>
+    <w:lsdException w:name="Light Grid Accent 4" w:semiHidden="0" w:uiPriority="62" w:unhideWhenUsed="0"/>
+    <w:lsdException w:name="Medium Shading 1 Accent 4" w:semiHidden="0" w:uiPriority="63" w:unhideWhenUsed="0"/>
+    <w:lsdException w:name="Medium Shading 2 Accent 4" w:semiHidden="0" w:uiPriority="64" w:unhideWhenUsed="0"/>
+    <w:lsdException w:name="Medium List 1 Accent 4" w:semiHidden="0" w:uiPriority="65" w:unhideWhenUsed="0"/>
+    <w:lsdException w:name="Medium List 2 Accent 4" w:semiHidden="0" w:uiPriority="66" w:unhideWhenUsed="0"/>
+    <w:lsdException w:name="Medium Grid 1 Accent 4" w:semiHidden="0" w:uiPriority="67" w:unhideWhenUsed="0"/>
+    <w:lsdException w:name="Medium Grid 2 Accent 4" w:semiHidden="0" w:uiPriority="68" w:unhideWhenUsed="0"/>
+    <w:lsdException w:name="Medium Grid 3 Accent 4" w:semiHidden="0" w:uiPriority="69" w:unhideWhenUsed="0"/>
+    <w:lsdException w:name="Dark List Accent 4" w:semiHidden="0" w:uiPriority="70" w:unhideWhenUsed="0"/>
+    <w:lsdException w:name="Colorful Shading Accent 4" w:semiHidden="0" w:uiPriority="71" w:unhideWhenUsed="0"/>
+    <w:lsdException w:name="Colorful List Accent 4" w:semiHidden="0" w:uiPriority="72" w:unhideWhenUsed="0"/>
+    <w:lsdException w:name="Colorful Grid Accent 4" w:semiHidden="0" w:uiPriority="73" w:unhideWhenUsed="0"/>
+    <w:lsdException w:name="Light Shading Accent 5" w:semiHidden="0" w:uiPriority="60" w:unhideWhenUsed="0"/>
+    <w:lsdException w:name="Light List Accent 5" w:semiHidden="0" w:uiPriority="61" w:unhideWhenUsed="0"/>
+    <w:lsdException w:name="Light Grid Accent 5" w:semiHidden="0" w:uiPriority="62" w:unhideWhenUsed="0"/>
+    <w:lsdException w:name="Medium Shading 1 Accent 5" w:semiHidden="0" w:uiPriority="63" w:unhideWhenUsed="0"/>
+    <w:lsdException w:name="Medium Shading 2 Accent 5" w:semiHidden="0" w:uiPriority="64" w:unhideWhenUsed="0"/>
+    <w:lsdException w:name="Medium List 1 Accent 5" w:semiHidden="0" w:uiPriority="65" w:unhideWhenUsed="0"/>
+    <w:lsdException w:name="Medium List 2 Accent 5" w:semiHidden="0" w:uiPriority="66" w:unhideWhenUsed="0"/>
+    <w:lsdException w:name="Medium Grid 1 Accent 5" w:semiHidden="0" w:uiPriority="67" w:unhideWhenUsed="0"/>
+    <w:lsdException w:name="Medium Grid 2 Accent 5" w:semiHidden="0" w:uiPriority="68" w:unhideWhenUsed="0"/>
+    <w:lsdException w:name="Medium Grid 3 Accent 5" w:semiHidden="0" w:uiPriority="69" w:unhideWhenUsed="0"/>
+    <w:lsdException w:name="Dark List Accent 5" w:semiHidden="0" w:uiPriority="70" w:unhideWhenUsed="0"/>
+    <w:lsdException w:name="Colorful Shading Accent 5" w:semiHidden="0" w:uiPriority="71" w:unhideWhenUsed="0"/>
+    <w:lsdException w:name="Colorful List Accent 5" w:semiHidden="0" w:uiPriority="72" w:unhideWhenUsed="0"/>
+    <w:lsdException w:name="Colorful Grid Accent 5" w:semiHidden="0" w:uiPriority="73" w:unhideWhenUsed="0"/>
+    <w:lsdException w:name="Light Shading Accent 6" w:semiHidden="0" w:uiPriority="60" w:unhideWhenUsed="0"/>
+    <w:lsdException w:name="Light List Accent 6" w:semiHidden="0" w:uiPriority="61" w:unhideWhenUsed="0"/>
+    <w:lsdException w:name="Light Grid Accent 6" w:semiHidden="0" w:uiPriority="62" w:unhideWhenUsed="0"/>
+    <w:lsdException w:name="Medium Shading 1 Accent 6" w:semiHidden="0" w:uiPriority="63" w:unhideWhenUsed="0"/>
+    <w:lsdException w:name="Medium Shading 2 Accent 6" w:semiHidden="0" w:uiPriority="64" w:unhideWhenUsed="0"/>
+    <w:lsdException w:name="Medium List 1 Accent 6" w:semiHidden="0" w:uiPriority="65" w:unhideWhenUsed="0"/>
+    <w:lsdException w:name="Medium List 2 Accent 6" w:semiHidden="0" w:uiPriority="66" w:unhideWhenUsed="0"/>
+    <w:lsdException w:name="Medium Grid 1 Accent 6" w:semiHidden="0" w:uiPriority="67" w:unhideWhenUsed="0"/>
+    <w:lsdException w:name="Medium Grid 2 Accent 6" w:semiHidden="0" w:uiPriority="68" w:unhideWhenUsed="0"/>
+    <w:lsdException w:name="Medium Grid 3 Accent 6" w:semiHidden="0" w:uiPriority="69" w:unhideWhenUsed="0"/>
+    <w:lsdException w:name="Dark List Accent 6" w:semiHidden="0" w:uiPriority="70" w:unhideWhenUsed="0"/>
+    <w:lsdException w:name="Colorful Shading Accent 6" w:semiHidden="0" w:uiPriority="71" w:unhideWhenUsed="0"/>
+    <w:lsdException w:name="Colorful List Accent 6" w:semiHidden="0" w:uiPriority="72" w:unhideWhenUsed="0"/>
+    <w:lsdException w:name="Colorful Grid Accent 6" w:semiHidden="0" w:uiPriority="73" w:unhideWhenUsed="0"/>
+    <w:lsdException w:name="Subtle Emphasis" w:semiHidden="0" w:uiPriority="19" w:unhideWhenUsed="0" w:qFormat="1"/>
+    <w:lsdException w:name="Intense Emphasis" w:semiHidden="0" w:uiPriority="21" w:unhideWhenUsed="0" w:qFormat="1"/>
+    <w:lsdException w:name="Subtle Reference" w:semiHidden="0" w:uiPriority="31" w:unhideWhenUsed="0" w:qFormat="1"/>
+    <w:lsdException w:name="Intense Reference" w:semiHidden="0" w:uiPriority="32" w:unhideWhenUsed="0" w:qFormat="1"/>
+    <w:lsdException w:name="Book Title" w:semiHidden="0" w:uiPriority="33" w:unhideWhenUsed="0" w:qFormat="1"/>
+    <w:lsdException w:name="Bibliography" w:uiPriority="37"/>
+    <w:lsdException w:name="TOC Heading" w:uiPriority="39" w:qFormat="1"/>
+  </w:latentStyles>
+  <w:style w:type="paragraph" w:default="1" w:styleId="a">
+    <w:name w:val="Normal"/>
+    <w:qFormat/>
+  </w:style>
+  <w:style w:type="character" w:default="1" w:styleId="a0">
+    <w:name w:val="Default Paragraph Font"/>
+    <w:uiPriority w:val="1"/>
+    <w:semiHidden/>
+    <w:unhideWhenUsed/>
+  </w:style>
+  <w:style w:type="table" w:default="1" w:styleId="a1">
+    <w:name w:val="Normal Table"/>
+    <w:uiPriority w:val="99"/>
+    <w:semiHidden/>
+    <w:unhideWhenUsed/>
+    <w:tblPr>
+      <w:tblInd w:w="0" w:type="dxa"/>
+      <w:tblCellMar>
+        <w:top w:w="0" w:type="dxa"/>
+        <w:left w:w="108" w:type="dxa"/>
+        <w:bottom w:w="0" w:type="dxa"/>
+        <w:right w:w="108" w:type="dxa"/>
+      </w:tblCellMar>
+    </w:tblPr>
+  </w:style>
+  <w:style w:type="numbering" w:default="1" w:styleId="a2">
+    <w:name w:val="No List"/>
+    <w:uiPriority w:val="99"/>
+    <w:semiHidden/>
+    <w:unhideWhenUsed/>
+  </w:style>
+  <w:style w:type="character" w:styleId="a3">
+    <w:name w:val="Placeholder Text"/>
+    <w:basedOn w:val="a0"/>
+    <w:uiPriority w:val="99"/>
+    <w:semiHidden/>
+    <w:rsid w:val="00990E32"/>
+    <w:rPr>
+      <w:color w:val="808080"/>
+    </w:rPr>
+  </w:style>
+  <w:style w:type="paragraph" w:customStyle="1" w:styleId="38CCBE4EB57A4F7CABCEBC9F64663B43">
+    <w:name w:val="38CCBE4EB57A4F7CABCEBC9F64663B43"/>
+    <w:rsid w:val="002238AA"/>
+  </w:style>
+  <w:style w:type="paragraph" w:customStyle="1" w:styleId="6D308016ADA441BE80954227017427D3">
+    <w:name w:val="6D308016ADA441BE80954227017427D3"/>
+    <w:rsid w:val="002238AA"/>
+  </w:style>
+  <w:style w:type="paragraph" w:customStyle="1" w:styleId="DB56ACF0EC81407E8A464E13CCEA3791">
+    <w:name w:val="DB56ACF0EC81407E8A464E13CCEA3791"/>
+    <w:rsid w:val="00990E32"/>
+  </w:style>
+  <w:style w:type="paragraph" w:customStyle="1" w:styleId="0B46C0FD919D4ABB94D717BAC11E7A52">
+    <w:name w:val="0B46C0FD919D4ABB94D717BAC11E7A52"/>
+    <w:rsid w:val="00990E32"/>
+  </w:style>
+  <w:style w:type="paragraph" w:customStyle="1" w:styleId="4441A241A38840D3B72018CD38928D74">
+    <w:name w:val="4441A241A38840D3B72018CD38928D74"/>
+    <w:rsid w:val="00990E32"/>
+  </w:style>
+  <w:style w:type="paragraph" w:customStyle="1" w:styleId="6FA6628EDDC240529E5D105D481887A2">
+    <w:name w:val="6FA6628EDDC240529E5D105D481887A2"/>
+    <w:rsid w:val="00990E32"/>
+  </w:style>
+</w:styles>
+</file>
+
+<file path=word/glossary/stylesWithEffects.xml><?xml version="1.0" encoding="utf-8"?>
+<w:styles xmlns:wpc="http://schemas.microsoft.com/office/word/2010/wordprocessingCanvas" xmlns:mc="http://schemas.openxmlformats.org/markup-compatibility/2006" xmlns:o="urn:schemas-microsoft-com:office:office" xmlns:r="http://schemas.openxmlformats.org/officeDocument/2006/relationships" xmlns:m="http://schemas.openxmlformats.org/officeDocument/2006/math" xmlns:v="urn:schemas-microsoft-com:vml" xmlns:wp14="http://schemas.microsoft.com/office/word/2010/wordprocessingDrawing" xmlns:wp="http://schemas.openxmlformats.org/drawingml/2006/wordprocessingDrawing" xmlns:w10="urn:schemas-microsoft-com:office:word" xmlns:w="http://schemas.openxmlformats.org/wordprocessingml/2006/main" xmlns:w14="http://schemas.microsoft.com/office/word/2010/wordml" xmlns:wpg="http://schemas.microsoft.com/office/word/2010/wordprocessingGroup" xmlns:wpi="http://schemas.microsoft.com/office/word/2010/wordprocessingInk" xmlns:wne="http://schemas.microsoft.com/office/word/2006/wordml" xmlns:wps="http://schemas.microsoft.com/office/word/2010/wordprocessingShape" mc:Ignorable="w14 wp14">
+  <w:docDefaults>
+    <w:rPrDefault>
+      <w:rPr>
+        <w:rFonts w:asciiTheme="minorHAnsi" w:eastAsiaTheme="minorEastAsia" w:hAnsiTheme="minorHAnsi" w:cstheme="minorBidi"/>
+        <w:sz w:val="22"/>
+        <w:szCs w:val="22"/>
+        <w:lang w:val="ru-RU" w:eastAsia="ru-RU" w:bidi="ar-SA"/>
+      </w:rPr>
+    </w:rPrDefault>
+    <w:pPrDefault>
+      <w:pPr>
+        <w:spacing w:after="200" w:line="276" w:lineRule="auto"/>
+      </w:pPr>
+    </w:pPrDefault>
+  </w:docDefaults>
+  <w:latentStyles w:defLockedState="0" w:defUIPriority="99" w:defSemiHidden="1" w:defUnhideWhenUsed="1" w:defQFormat="0" w:count="267">
+    <w:lsdException w:name="Normal" w:semiHidden="0" w:uiPriority="0" w:unhideWhenUsed="0" w:qFormat="1"/>
+    <w:lsdException w:name="heading 1" w:semiHidden="0" w:uiPriority="9" w:unhideWhenUsed="0" w:qFormat="1"/>
+    <w:lsdException w:name="heading 2" w:uiPriority="9" w:qFormat="1"/>
+    <w:lsdException w:name="heading 3" w:uiPriority="9" w:qFormat="1"/>
+    <w:lsdException w:name="heading 4" w:uiPriority="9" w:qFormat="1"/>
+    <w:lsdException w:name="heading 5" w:uiPriority="9" w:qFormat="1"/>
+    <w:lsdException w:name="heading 6" w:uiPriority="9" w:qFormat="1"/>
+    <w:lsdException w:name="heading 7" w:uiPriority="9" w:qFormat="1"/>
+    <w:lsdException w:name="heading 8" w:uiPriority="9" w:qFormat="1"/>
+    <w:lsdException w:name="heading 9" w:uiPriority="9" w:qFormat="1"/>
+    <w:lsdException w:name="toc 1" w:uiPriority="39"/>
+    <w:lsdException w:name="toc 2" w:uiPriority="39"/>
+    <w:lsdException w:name="toc 3" w:uiPriority="39"/>
+    <w:lsdException w:name="toc 4" w:uiPriority="39"/>
+    <w:lsdException w:name="toc 5" w:uiPriority="39"/>
+    <w:lsdException w:name="toc 6" w:uiPriority="39"/>
+    <w:lsdException w:name="toc 7" w:uiPriority="39"/>
+    <w:lsdException w:name="toc 8" w:uiPriority="39"/>
+    <w:lsdException w:name="toc 9" w:uiPriority="39"/>
+    <w:lsdException w:name="caption" w:uiPriority="35" w:qFormat="1"/>
+    <w:lsdException w:name="Title" w:semiHidden="0" w:uiPriority="10" w:unhideWhenUsed="0" w:qFormat="1"/>
+    <w:lsdException w:name="Default Paragraph Font" w:uiPriority="1"/>
+    <w:lsdException w:name="Subtitle" w:semiHidden="0" w:uiPriority="11" w:unhideWhenUsed="0" w:qFormat="1"/>
+    <w:lsdException w:name="Strong" w:semiHidden="0" w:uiPriority="22" w:unhideWhenUsed="0" w:qFormat="1"/>
+    <w:lsdException w:name="Emphasis" w:semiHidden="0" w:uiPriority="20" w:unhideWhenUsed="0" w:qFormat="1"/>
+    <w:lsdException w:name="Table Grid" w:semiHidden="0" w:uiPriority="59" w:unhideWhenUsed="0"/>
+    <w:lsdException w:name="Placeholder Text" w:unhideWhenUsed="0"/>
+    <w:lsdException w:name="No Spacing" w:semiHidden="0" w:uiPriority="1" w:unhideWhenUsed="0" w:qFormat="1"/>
+    <w:lsdException w:name="Light Shading" w:semiHidden="0" w:uiPriority="60" w:unhideWhenUsed="0"/>
+    <w:lsdException w:name="Light List" w:semiHidden="0" w:uiPriority="61" w:unhideWhenUsed="0"/>
+    <w:lsdException w:name="Light Grid" w:semiHidden="0" w:uiPriority="62" w:unhideWhenUsed="0"/>
+    <w:lsdException w:name="Medium Shading 1" w:semiHidden="0" w:uiPriority="63" w:unhideWhenUsed="0"/>
+    <w:lsdException w:name="Medium Shading 2" w:semiHidden="0" w:uiPriority="64" w:unhideWhenUsed="0"/>
+    <w:lsdException w:name="Medium List 1" w:semiHidden="0" w:uiPriority="65" w:unhideWhenUsed="0"/>
+    <w:lsdException w:name="Medium List 2" w:semiHidden="0" w:uiPriority="66" w:unhideWhenUsed="0"/>
+    <w:lsdException w:name="Medium Grid 1" w:semiHidden="0" w:uiPriority="67" w:unhideWhenUsed="0"/>
+    <w:lsdException w:name="Medium Grid 2" w:semiHidden="0" w:uiPriority="68" w:unhideWhenUsed="0"/>
+    <w:lsdException w:name="Medium Grid 3" w:semiHidden="0" w:uiPriority="69" w:unhideWhenUsed="0"/>
+    <w:lsdException w:name="Dark List" w:semiHidden="0" w:uiPriority="70" w:unhideWhenUsed="0"/>
+    <w:lsdException w:name="Colorful Shading" w:semiHidden="0" w:uiPriority="71" w:unhideWhenUsed="0"/>
+    <w:lsdException w:name="Colorful List" w:semiHidden="0" w:uiPriority="72" w:unhideWhenUsed="0"/>
+    <w:lsdException w:name="Colorful Grid" w:semiHidden="0" w:uiPriority="73" w:unhideWhenUsed="0"/>
+    <w:lsdException w:name="Light Shading Accent 1" w:semiHidden="0" w:uiPriority="60" w:unhideWhenUsed="0"/>
+    <w:lsdException w:name="Light List Accent 1" w:semiHidden="0" w:uiPriority="61" w:unhideWhenUsed="0"/>
+    <w:lsdException w:name="Light Grid Accent 1" w:semiHidden="0" w:uiPriority="62" w:unhideWhenUsed="0"/>
+    <w:lsdException w:name="Medium Shading 1 Accent 1" w:semiHidden="0" w:uiPriority="63" w:unhideWhenUsed="0"/>
+    <w:lsdException w:name="Medium Shading 2 Accent 1" w:semiHidden="0" w:uiPriority="64" w:unhideWhenUsed="0"/>
+    <w:lsdException w:name="Medium List 1 Accent 1" w:semiHidden="0" w:uiPriority="65" w:unhideWhenUsed="0"/>
+    <w:lsdException w:name="Revision" w:unhideWhenUsed="0"/>
+    <w:lsdException w:name="List Paragraph" w:semiHidden="0" w:uiPriority="34" w:unhideWhenUsed="0" w:qFormat="1"/>
+    <w:lsdException w:name="Quote" w:semiHidden="0" w:uiPriority="29" w:unhideWhenUsed="0" w:qFormat="1"/>
+    <w:lsdException w:name="Intense Quote" w:semiHidden="0" w:uiPriority="30" w:unhideWhenUsed="0" w:qFormat="1"/>
+    <w:lsdException w:name="Medium List 2 Accent 1" w:semiHidden="0" w:uiPriority="66" w:unhideWhenUsed="0"/>
+    <w:lsdException w:name="Medium Grid 1 Accent 1" w:semiHidden="0" w:uiPriority="67" w:unhideWhenUsed="0"/>
+    <w:lsdException w:name="Medium Grid 2 Accent 1" w:semiHidden="0" w:uiPriority="68" w:unhideWhenUsed="0"/>
+    <w:lsdException w:name="Medium Grid 3 Accent 1" w:semiHidden="0" w:uiPriority="69" w:unhideWhenUsed="0"/>
+    <w:lsdException w:name="Dark List Accent 1" w:semiHidden="0" w:uiPriority="70" w:unhideWhenUsed="0"/>
+    <w:lsdException w:name="Colorful Shading Accent 1" w:semiHidden="0" w:uiPriority="71" w:unhideWhenUsed="0"/>
+    <w:lsdException w:name="Colorful List Accent 1" w:semiHidden="0" w:uiPriority="72" w:unhideWhenUsed="0"/>
+    <w:lsdException w:name="Colorful Grid Accent 1" w:semiHidden="0" w:uiPriority="73" w:unhideWhenUsed="0"/>
+    <w:lsdException w:name="Light Shading Accent 2" w:semiHidden="0" w:uiPriority="60" w:unhideWhenUsed="0"/>
+    <w:lsdException w:name="Light List Accent 2" w:semiHidden="0" w:uiPriority="61" w:unhideWhenUsed="0"/>
+    <w:lsdException w:name="Light Grid Accent 2" w:semiHidden="0" w:uiPriority="62" w:unhideWhenUsed="0"/>
+    <w:lsdException w:name="Medium Shading 1 Accent 2" w:semiHidden="0" w:uiPriority="63" w:unhideWhenUsed="0"/>
+    <w:lsdException w:name="Medium Shading 2 Accent 2" w:semiHidden="0" w:uiPriority="64" w:unhideWhenUsed="0"/>
+    <w:lsdException w:name="Medium List 1 Accent 2" w:semiHidden="0" w:uiPriority="65" w:unhideWhenUsed="0"/>
+    <w:lsdException w:name="Medium List 2 Accent 2" w:semiHidden="0" w:uiPriority="66" w:unhideWhenUsed="0"/>
+    <w:lsdException w:name="Medium Grid 1 Accent 2" w:semiHidden="0" w:uiPriority="67" w:unhideWhenUsed="0"/>
+    <w:lsdException w:name="Medium Grid 2 Accent 2" w:semiHidden="0" w:uiPriority="68" w:unhideWhenUsed="0"/>
+    <w:lsdException w:name="Medium Grid 3 Accent 2" w:semiHidden="0" w:uiPriority="69" w:unhideWhenUsed="0"/>
+    <w:lsdException w:name="Dark List Accent 2" w:semiHidden="0" w:uiPriority="70" w:unhideWhenUsed="0"/>
+    <w:lsdException w:name="Colorful Shading Accent 2" w:semiHidden="0" w:uiPriority="71" w:unhideWhenUsed="0"/>
+    <w:lsdException w:name="Colorful List Accent 2" w:semiHidden="0" w:uiPriority="72" w:unhideWhenUsed="0"/>
+    <w:lsdException w:name="Colorful Grid Accent 2" w:semiHidden="0" w:uiPriority="73" w:unhideWhenUsed="0"/>
+    <w:lsdException w:name="Light Shading Accent 3" w:semiHidden="0" w:uiPriority="60" w:unhideWhenUsed="0"/>
+    <w:lsdException w:name="Light List Accent 3" w:semiHidden="0" w:uiPriority="61" w:unhideWhenUsed="0"/>
+    <w:lsdException w:name="Light Grid Accent 3" w:semiHidden="0" w:uiPriority="62" w:unhideWhenUsed="0"/>
+    <w:lsdException w:name="Medium Shading 1 Accent 3" w:semiHidden="0" w:uiPriority="63" w:unhideWhenUsed="0"/>
+    <w:lsdException w:name="Medium Shading 2 Accent 3" w:semiHidden="0" w:uiPriority="64" w:unhideWhenUsed="0"/>
+    <w:lsdException w:name="Medium List 1 Accent 3" w:semiHidden="0" w:uiPriority="65" w:unhideWhenUsed="0"/>
+    <w:lsdException w:name="Medium List 2 Accent 3" w:semiHidden="0" w:uiPriority="66" w:unhideWhenUsed="0"/>
+    <w:lsdException w:name="Medium Grid 1 Accent 3" w:semiHidden="0" w:uiPriority="67" w:unhideWhenUsed="0"/>
+    <w:lsdException w:name="Medium Grid 2 Accent 3" w:semiHidden="0" w:uiPriority="68" w:unhideWhenUsed="0"/>
+    <w:lsdException w:name="Medium Grid 3 Accent 3" w:semiHidden="0" w:uiPriority="69" w:unhideWhenUsed="0"/>
+    <w:lsdException w:name="Dark List Accent 3" w:semiHidden="0" w:uiPriority="70" w:unhideWhenUsed="0"/>
+    <w:lsdException w:name="Colorful Shading Accent 3" w:semiHidden="0" w:uiPriority="71" w:unhideWhenUsed="0"/>
+    <w:lsdException w:name="Colorful List Accent 3" w:semiHidden="0" w:uiPriority="72" w:unhideWhenUsed="0"/>
+    <w:lsdException w:name="Colorful Grid Accent 3" w:semiHidden="0" w:uiPriority="73" w:unhideWhenUsed="0"/>
+    <w:lsdException w:name="Light Shading Accent 4" w:semiHidden="0" w:uiPriority="60" w:unhideWhenUsed="0"/>
+    <w:lsdException w:name="Light List Accent 4" w:semiHidden="0" w:uiPriority="61" w:unhideWhenUsed="0"/>
+    <w:lsdException w:name="Light Grid Accent 4" w:semiHidden="0" w:uiPriority="62" w:unhideWhenUsed="0"/>
+    <w:lsdException w:name="Medium Shading 1 Accent 4" w:semiHidden="0" w:uiPriority="63" w:unhideWhenUsed="0"/>
+    <w:lsdException w:name="Medium Shading 2 Accent 4" w:semiHidden="0" w:uiPriority="64" w:unhideWhenUsed="0"/>
+    <w:lsdException w:name="Medium List 1 Accent 4" w:semiHidden="0" w:uiPriority="65" w:unhideWhenUsed="0"/>
+    <w:lsdException w:name="Medium List 2 Accent 4" w:semiHidden="0" w:uiPriority="66" w:unhideWhenUsed="0"/>
+    <w:lsdException w:name="Medium Grid 1 Accent 4" w:semiHidden="0" w:uiPriority="67" w:unhideWhenUsed="0"/>
+    <w:lsdException w:name="Medium Grid 2 Accent 4" w:semiHidden="0" w:uiPriority="68" w:unhideWhenUsed="0"/>
+    <w:lsdException w:name="Medium Grid 3 Accent 4" w:semiHidden="0" w:uiPriority="69" w:unhideWhenUsed="0"/>
+    <w:lsdException w:name="Dark List Accent 4" w:semiHidden="0" w:uiPriority="70" w:unhideWhenUsed="0"/>
+    <w:lsdException w:name="Colorful Shading Accent 4" w:semiHidden="0" w:uiPriority="71" w:unhideWhenUsed="0"/>
+    <w:lsdException w:name="Colorful List Accent 4" w:semiHidden="0" w:uiPriority="72" w:unhideWhenUsed="0"/>
+    <w:lsdException w:name="Colorful Grid Accent 4" w:semiHidden="0" w:uiPriority="73" w:unhideWhenUsed="0"/>
+    <w:lsdException w:name="Light Shading Accent 5" w:semiHidden="0" w:uiPriority="60" w:unhideWhenUsed="0"/>
+    <w:lsdException w:name="Light List Accent 5" w:semiHidden="0" w:uiPriority="61" w:unhideWhenUsed="0"/>
+    <w:lsdException w:name="Light Grid Accent 5" w:semiHidden="0" w:uiPriority="62" w:unhideWhenUsed="0"/>
+    <w:lsdException w:name="Medium Shading 1 Accent 5" w:semiHidden="0" w:uiPriority="63" w:unhideWhenUsed="0"/>
+    <w:lsdException w:name="Medium Shading 2 Accent 5" w:semiHidden="0" w:uiPriority="64" w:unhideWhenUsed="0"/>
+    <w:lsdException w:name="Medium List 1 Accent 5" w:semiHidden="0" w:uiPriority="65" w:unhideWhenUsed="0"/>
+    <w:lsdException w:name="Medium List 2 Accent 5" w:semiHidden="0" w:uiPriority="66" w:unhideWhenUsed="0"/>
+    <w:lsdException w:name="Medium Grid 1 Accent 5" w:semiHidden="0" w:uiPriority="67" w:unhideWhenUsed="0"/>
+    <w:lsdException w:name="Medium Grid 2 Accent 5" w:semiHidden="0" w:uiPriority="68" w:unhideWhenUsed="0"/>
+    <w:lsdException w:name="Medium Grid 3 Accent 5" w:semiHidden="0" w:uiPriority="69" w:unhideWhenUsed="0"/>
+    <w:lsdException w:name="Dark List Accent 5" w:semiHidden="0" w:uiPriority="70" w:unhideWhenUsed="0"/>
+    <w:lsdException w:name="Colorful Shading Accent 5" w:semiHidden="0" w:uiPriority="71" w:unhideWhenUsed="0"/>
+    <w:lsdException w:name="Colorful List Accent 5" w:semiHidden="0" w:uiPriority="72" w:unhideWhenUsed="0"/>
+    <w:lsdException w:name="Colorful Grid Accent 5" w:semiHidden="0" w:uiPriority="73" w:unhideWhenUsed="0"/>
+    <w:lsdException w:name="Light Shading Accent 6" w:semiHidden="0" w:uiPriority="60" w:unhideWhenUsed="0"/>
+    <w:lsdException w:name="Light List Accent 6" w:semiHidden="0" w:uiPriority="61" w:unhideWhenUsed="0"/>
+    <w:lsdException w:name="Light Grid Accent 6" w:semiHidden="0" w:uiPriority="62" w:unhideWhenUsed="0"/>
+    <w:lsdException w:name="Medium Shading 1 Accent 6" w:semiHidden="0" w:uiPriority="63" w:unhideWhenUsed="0"/>
+    <w:lsdException w:name="Medium Shading 2 Accent 6" w:semiHidden="0" w:uiPriority="64" w:unhideWhenUsed="0"/>
+    <w:lsdException w:name="Medium List 1 Accent 6" w:semiHidden="0" w:uiPriority="65" w:unhideWhenUsed="0"/>
+    <w:lsdException w:name="Medium List 2 Accent 6" w:semiHidden="0" w:uiPriority="66" w:unhideWhenUsed="0"/>
+    <w:lsdException w:name="Medium Grid 1 Accent 6" w:semiHidden="0" w:uiPriority="67" w:unhideWhenUsed="0"/>
+    <w:lsdException w:name="Medium Grid 2 Accent 6" w:semiHidden="0" w:uiPriority="68" w:unhideWhenUsed="0"/>
+    <w:lsdException w:name="Medium Grid 3 Accent 6" w:semiHidden="0" w:uiPriority="69" w:unhideWhenUsed="0"/>
+    <w:lsdException w:name="Dark List Accent 6" w:semiHidden="0" w:uiPriority="70" w:unhideWhenUsed="0"/>
+    <w:lsdException w:name="Colorful Shading Accent 6" w:semiHidden="0" w:uiPriority="71" w:unhideWhenUsed="0"/>
+    <w:lsdException w:name="Colorful List Accent 6" w:semiHidden="0" w:uiPriority="72" w:unhideWhenUsed="0"/>
+    <w:lsdException w:name="Colorful Grid Accent 6" w:semiHidden="0" w:uiPriority="73" w:unhideWhenUsed="0"/>
+    <w:lsdException w:name="Subtle Emphasis" w:semiHidden="0" w:uiPriority="19" w:unhideWhenUsed="0" w:qFormat="1"/>
+    <w:lsdException w:name="Intense Emphasis" w:semiHidden="0" w:uiPriority="21" w:unhideWhenUsed="0" w:qFormat="1"/>
+    <w:lsdException w:name="Subtle Reference" w:semiHidden="0" w:uiPriority="31" w:unhideWhenUsed="0" w:qFormat="1"/>
+    <w:lsdException w:name="Intense Reference" w:semiHidden="0" w:uiPriority="32" w:unhideWhenUsed="0" w:qFormat="1"/>
+    <w:lsdException w:name="Book Title" w:semiHidden="0" w:uiPriority="33" w:unhideWhenUsed="0" w:qFormat="1"/>
+    <w:lsdException w:name="Bibliography" w:uiPriority="37"/>
+    <w:lsdException w:name="TOC Heading" w:uiPriority="39" w:qFormat="1"/>
+  </w:latentStyles>
+  <w:style w:type="paragraph" w:default="1" w:styleId="a">
+    <w:name w:val="Normal"/>
+    <w:qFormat/>
+  </w:style>
+  <w:style w:type="character" w:default="1" w:styleId="a0">
+    <w:name w:val="Default Paragraph Font"/>
+    <w:uiPriority w:val="1"/>
+    <w:semiHidden/>
+    <w:unhideWhenUsed/>
+  </w:style>
+  <w:style w:type="table" w:default="1" w:styleId="a1">
+    <w:name w:val="Normal Table"/>
+    <w:uiPriority w:val="99"/>
+    <w:semiHidden/>
+    <w:unhideWhenUsed/>
+    <w:tblPr>
+      <w:tblInd w:w="0" w:type="dxa"/>
+      <w:tblCellMar>
+        <w:top w:w="0" w:type="dxa"/>
+        <w:left w:w="108" w:type="dxa"/>
+        <w:bottom w:w="0" w:type="dxa"/>
+        <w:right w:w="108" w:type="dxa"/>
+      </w:tblCellMar>
+    </w:tblPr>
+  </w:style>
+  <w:style w:type="numbering" w:default="1" w:styleId="a2">
+    <w:name w:val="No List"/>
+    <w:uiPriority w:val="99"/>
+    <w:semiHidden/>
+    <w:unhideWhenUsed/>
+  </w:style>
+  <w:style w:type="character" w:styleId="a3">
+    <w:name w:val="Placeholder Text"/>
+    <w:basedOn w:val="a0"/>
+    <w:uiPriority w:val="99"/>
+    <w:semiHidden/>
+    <w:rsid w:val="00990E32"/>
+    <w:rPr>
+      <w:color w:val="808080"/>
+    </w:rPr>
+  </w:style>
+  <w:style w:type="paragraph" w:customStyle="1" w:styleId="38CCBE4EB57A4F7CABCEBC9F64663B43">
+    <w:name w:val="38CCBE4EB57A4F7CABCEBC9F64663B43"/>
+    <w:rsid w:val="002238AA"/>
+  </w:style>
+  <w:style w:type="paragraph" w:customStyle="1" w:styleId="6D308016ADA441BE80954227017427D3">
+    <w:name w:val="6D308016ADA441BE80954227017427D3"/>
+    <w:rsid w:val="002238AA"/>
+  </w:style>
+  <w:style w:type="paragraph" w:customStyle="1" w:styleId="DB56ACF0EC81407E8A464E13CCEA3791">
+    <w:name w:val="DB56ACF0EC81407E8A464E13CCEA3791"/>
+    <w:rsid w:val="00990E32"/>
+  </w:style>
+  <w:style w:type="paragraph" w:customStyle="1" w:styleId="0B46C0FD919D4ABB94D717BAC11E7A52">
+    <w:name w:val="0B46C0FD919D4ABB94D717BAC11E7A52"/>
+    <w:rsid w:val="00990E32"/>
+  </w:style>
+  <w:style w:type="paragraph" w:customStyle="1" w:styleId="4441A241A38840D3B72018CD38928D74">
+    <w:name w:val="4441A241A38840D3B72018CD38928D74"/>
+    <w:rsid w:val="00990E32"/>
+  </w:style>
+  <w:style w:type="paragraph" w:customStyle="1" w:styleId="6FA6628EDDC240529E5D105D481887A2">
+    <w:name w:val="6FA6628EDDC240529E5D105D481887A2"/>
+    <w:rsid w:val="00990E32"/>
+  </w:style>
+</w:styles>
+</file>
+
+<file path=word/glossary/webSettings.xml><?xml version="1.0" encoding="utf-8"?>
+<w:webSettings xmlns:mc="http://schemas.openxmlformats.org/markup-compatibility/2006" xmlns:r="http://schemas.openxmlformats.org/officeDocument/2006/relationships" xmlns:w="http://schemas.openxmlformats.org/wordprocessingml/2006/main" xmlns:w14="http://schemas.microsoft.com/office/word/2010/wordml" mc:Ignorable="w14">
+  <w:optimizeForBrowser/>
+  <w:allowPNG/>
+</w:webSettings>
 </file>
 
 <file path=word/theme/theme1.xml><?xml version="1.0" encoding="utf-8"?>
@@ -3466,7 +5407,7 @@
 </file>
 
 <file path=customXml/itemProps1.xml><?xml version="1.0" encoding="utf-8"?>
-<ds:datastoreItem xmlns:ds="http://schemas.openxmlformats.org/officeDocument/2006/customXml" ds:itemID="{482DE518-00A7-418F-A0CF-A1289D6A91F7}">
+<ds:datastoreItem xmlns:ds="http://schemas.openxmlformats.org/officeDocument/2006/customXml" ds:itemID="{AD1BBCAD-6306-4B66-BC9F-1064DE1E393E}">
   <ds:schemaRefs>
     <ds:schemaRef ds:uri="http://schemas.openxmlformats.org/officeDocument/2006/bibliography"/>
   </ds:schemaRefs>

</xml_diff>